<commit_message>
added SD2 sequence diagram to word document
</commit_message>
<xml_diff>
--- a/docs/COS214_Prac3.docx
+++ b/docs/COS214_Prac3.docx
@@ -1,6 +1,6 @@
 
 <file path=word/document.xml><?xml version="1.0" encoding="utf-8"?>
-<w:document xmlns:wpc="http://schemas.microsoft.com/office/word/2010/wordprocessingCanvas" xmlns:cx="http://schemas.microsoft.com/office/drawing/2014/chartex" xmlns:cx1="http://schemas.microsoft.com/office/drawing/2015/9/8/chartex" xmlns:cx2="http://schemas.microsoft.com/office/drawing/2015/10/21/chartex" xmlns:cx3="http://schemas.microsoft.com/office/drawing/2016/5/9/chartex" xmlns:cx4="http://schemas.microsoft.com/office/drawing/2016/5/10/chartex" xmlns:cx5="http://schemas.microsoft.com/office/drawing/2016/5/11/chartex" xmlns:cx6="http://schemas.microsoft.com/office/drawing/2016/5/12/chartex" xmlns:cx7="http://schemas.microsoft.com/office/drawing/2016/5/13/chartex" xmlns:cx8="http://schemas.microsoft.com/office/drawing/2016/5/14/chartex" xmlns:mc="http://schemas.openxmlformats.org/markup-compatibility/2006" xmlns:aink="http://schemas.microsoft.com/office/drawing/2016/ink" xmlns:am3d="http://schemas.microsoft.com/office/drawing/2017/model3d" xmlns:o="urn:schemas-microsoft-com:office:office" xmlns:oel="http://schemas.microsoft.com/office/2019/extlst" xmlns:r="http://schemas.openxmlformats.org/officeDocument/2006/relationships" xmlns:m="http://schemas.openxmlformats.org/officeDocument/2006/math" xmlns:v="urn:schemas-microsoft-com:vml" xmlns:wp14="http://schemas.microsoft.com/office/word/2010/wordprocessingDrawing" xmlns:wp="http://schemas.openxmlformats.org/drawingml/2006/wordprocessingDrawing" xmlns:w10="urn:schemas-microsoft-com:office:word" xmlns:w="http://schemas.openxmlformats.org/wordprocessingml/2006/main" xmlns:w14="http://schemas.microsoft.com/office/word/2010/wordml" xmlns:w15="http://schemas.microsoft.com/office/word/2012/wordml" xmlns:w16cex="http://schemas.microsoft.com/office/word/2018/wordml/cex" xmlns:w16cid="http://schemas.microsoft.com/office/word/2016/wordml/cid" xmlns:w16="http://schemas.microsoft.com/office/word/2018/wordml" xmlns:w16du="http://schemas.microsoft.com/office/word/2023/wordml/word16du" xmlns:w16sdtdh="http://schemas.microsoft.com/office/word/2020/wordml/sdtdatahash" xmlns:w16sdtfl="http://schemas.microsoft.com/office/word/2024/wordml/sdtformatlock" xmlns:w16se="http://schemas.microsoft.com/office/word/2015/wordml/symex" xmlns:wpg="http://schemas.microsoft.com/office/word/2010/wordprocessingGroup" xmlns:wpi="http://schemas.microsoft.com/office/word/2010/wordprocessingInk" xmlns:wne="http://schemas.microsoft.com/office/word/2006/wordml" xmlns:wps="http://schemas.microsoft.com/office/word/2010/wordprocessingShape" mc:Ignorable="w14 w15 w16se w16cid w16 w16cex w16sdtdh w16sdtfl w16du wp14">
+<w:document xmlns:wpc="http://schemas.microsoft.com/office/word/2010/wordprocessingCanvas" xmlns:cx="http://schemas.microsoft.com/office/drawing/2014/chartex" xmlns:cx1="http://schemas.microsoft.com/office/drawing/2015/9/8/chartex" xmlns:cx2="http://schemas.microsoft.com/office/drawing/2015/10/21/chartex" xmlns:cx3="http://schemas.microsoft.com/office/drawing/2016/5/9/chartex" xmlns:cx4="http://schemas.microsoft.com/office/drawing/2016/5/10/chartex" xmlns:cx5="http://schemas.microsoft.com/office/drawing/2016/5/11/chartex" xmlns:cx6="http://schemas.microsoft.com/office/drawing/2016/5/12/chartex" xmlns:cx7="http://schemas.microsoft.com/office/drawing/2016/5/13/chartex" xmlns:cx8="http://schemas.microsoft.com/office/drawing/2016/5/14/chartex" xmlns:mc="http://schemas.openxmlformats.org/markup-compatibility/2006" xmlns:aink="http://schemas.microsoft.com/office/drawing/2016/ink" xmlns:am3d="http://schemas.microsoft.com/office/drawing/2017/model3d" xmlns:o="urn:schemas-microsoft-com:office:office" xmlns:oel="http://schemas.microsoft.com/office/2019/extlst" xmlns:r="http://schemas.openxmlformats.org/officeDocument/2006/relationships" xmlns:m="http://schemas.openxmlformats.org/officeDocument/2006/math" xmlns:v="urn:schemas-microsoft-com:vml" xmlns:wp14="http://schemas.microsoft.com/office/word/2010/wordprocessingDrawing" xmlns:wp="http://schemas.openxmlformats.org/drawingml/2006/wordprocessingDrawing" xmlns:w10="urn:schemas-microsoft-com:office:word" xmlns:w="http://schemas.openxmlformats.org/wordprocessingml/2006/main" xmlns:w14="http://schemas.microsoft.com/office/word/2010/wordml" xmlns:w15="http://schemas.microsoft.com/office/word/2012/wordml" xmlns:w16cei="http://schemas.microsoft.com/office/word/2026/wordml/cei" xmlns:w16cex="http://schemas.microsoft.com/office/word/2018/wordml/cex" xmlns:w16cid="http://schemas.microsoft.com/office/word/2016/wordml/cid" xmlns:w16="http://schemas.microsoft.com/office/word/2018/wordml" xmlns:w16du="http://schemas.microsoft.com/office/word/2023/wordml/word16du" xmlns:w16sdtdh="http://schemas.microsoft.com/office/word/2020/wordml/sdtdatahash" xmlns:w16sdtfl="http://schemas.microsoft.com/office/word/2024/wordml/sdtformatlock" xmlns:w16se="http://schemas.microsoft.com/office/word/2015/wordml/symex" xmlns:wpg="http://schemas.microsoft.com/office/word/2010/wordprocessingGroup" xmlns:wpi="http://schemas.microsoft.com/office/word/2010/wordprocessingInk" xmlns:wne="http://schemas.microsoft.com/office/word/2006/wordml" xmlns:wps="http://schemas.microsoft.com/office/word/2010/wordprocessingShape" mc:Ignorable="w14 w15 w16se w16cid w16 w16cex w16sdtdh w16sdtfl w16du wp14">
   <w:body>
     <w:p>
       <w:pPr>
@@ -610,7 +610,7 @@
           <w:noProof/>
         </w:rPr>
         <w:drawing>
-          <wp:anchor distT="0" distB="0" distL="114300" distR="114300" simplePos="0" relativeHeight="251658240" behindDoc="0" locked="0" layoutInCell="1" allowOverlap="1" wp14:anchorId="2C20E90C" wp14:editId="6DB54913">
+          <wp:anchor distT="0" distB="0" distL="114300" distR="114300" simplePos="0" relativeHeight="251658240" behindDoc="0" locked="0" layoutInCell="1" allowOverlap="1" wp14:anchorId="2C20E90C" wp14:editId="105FF847">
             <wp:simplePos x="0" y="0"/>
             <wp:positionH relativeFrom="margin">
               <wp:align>center</wp:align>
@@ -874,9 +874,295 @@
       </w:r>
     </w:p>
     <w:p/>
+    <w:p/>
+    <w:p/>
+    <w:p/>
+    <w:p/>
+    <w:p/>
+    <w:p/>
+    <w:p/>
+    <w:p/>
+    <w:p>
+      <w:pPr>
+        <w:rPr>
+          <w:b/>
+          <w:bCs/>
+          <w:sz w:val="22"/>
+          <w:szCs w:val="22"/>
+        </w:rPr>
+      </w:pPr>
+      <w:r>
+        <w:rPr>
+          <w:noProof/>
+        </w:rPr>
+        <w:lastRenderedPageBreak/>
+        <w:drawing>
+          <wp:anchor distT="0" distB="0" distL="114300" distR="114300" simplePos="0" relativeHeight="251660288" behindDoc="0" locked="0" layoutInCell="1" allowOverlap="1" wp14:anchorId="35156108" wp14:editId="1327A31C">
+            <wp:simplePos x="0" y="0"/>
+            <wp:positionH relativeFrom="column">
+              <wp:posOffset>-1653540</wp:posOffset>
+            </wp:positionH>
+            <wp:positionV relativeFrom="paragraph">
+              <wp:posOffset>2625725</wp:posOffset>
+            </wp:positionV>
+            <wp:extent cx="8592185" cy="3875405"/>
+            <wp:effectExtent l="0" t="3810" r="0" b="0"/>
+            <wp:wrapSquare wrapText="bothSides"/>
+            <wp:docPr id="677596944" name="Picture 4"/>
+            <wp:cNvGraphicFramePr>
+              <a:graphicFrameLocks xmlns:a="http://schemas.openxmlformats.org/drawingml/2006/main" noChangeAspect="1"/>
+            </wp:cNvGraphicFramePr>
+            <a:graphic xmlns:a="http://schemas.openxmlformats.org/drawingml/2006/main">
+              <a:graphicData uri="http://schemas.openxmlformats.org/drawingml/2006/picture">
+                <pic:pic xmlns:pic="http://schemas.openxmlformats.org/drawingml/2006/picture">
+                  <pic:nvPicPr>
+                    <pic:cNvPr id="677596944" name="Picture 677596944"/>
+                    <pic:cNvPicPr/>
+                  </pic:nvPicPr>
+                  <pic:blipFill>
+                    <a:blip r:embed="rId9">
+                      <a:extLst>
+                        <a:ext uri="{28A0092B-C50C-407E-A947-70E740481C1C}">
+                          <a14:useLocalDpi xmlns:a14="http://schemas.microsoft.com/office/drawing/2010/main" val="0"/>
+                        </a:ext>
+                      </a:extLst>
+                    </a:blip>
+                    <a:stretch>
+                      <a:fillRect/>
+                    </a:stretch>
+                  </pic:blipFill>
+                  <pic:spPr>
+                    <a:xfrm rot="5400000">
+                      <a:off x="0" y="0"/>
+                      <a:ext cx="8592185" cy="3875405"/>
+                    </a:xfrm>
+                    <a:prstGeom prst="rect">
+                      <a:avLst/>
+                    </a:prstGeom>
+                  </pic:spPr>
+                </pic:pic>
+              </a:graphicData>
+            </a:graphic>
+            <wp14:sizeRelH relativeFrom="margin">
+              <wp14:pctWidth>0</wp14:pctWidth>
+            </wp14:sizeRelH>
+            <wp14:sizeRelV relativeFrom="margin">
+              <wp14:pctHeight>0</wp14:pctHeight>
+            </wp14:sizeRelV>
+          </wp:anchor>
+        </w:drawing>
+      </w:r>
+      <w:r>
+        <w:rPr>
+          <w:b/>
+          <w:bCs/>
+          <w:sz w:val="22"/>
+          <w:szCs w:val="22"/>
+        </w:rPr>
+        <w:t xml:space="preserve">Question </w:t>
+      </w:r>
+      <w:r>
+        <w:rPr>
+          <w:b/>
+          <w:bCs/>
+          <w:sz w:val="22"/>
+          <w:szCs w:val="22"/>
+        </w:rPr>
+        <w:t>5</w:t>
+      </w:r>
+      <w:r>
+        <w:rPr>
+          <w:b/>
+          <w:bCs/>
+          <w:sz w:val="22"/>
+          <w:szCs w:val="22"/>
+        </w:rPr>
+        <w:t>.</w:t>
+      </w:r>
+      <w:r>
+        <w:rPr>
+          <w:b/>
+          <w:bCs/>
+          <w:sz w:val="22"/>
+          <w:szCs w:val="22"/>
+        </w:rPr>
+        <w:t>1</w:t>
+      </w:r>
+    </w:p>
+    <w:p/>
+    <w:p/>
+    <w:p/>
+    <w:p/>
+    <w:p/>
+    <w:p/>
+    <w:p/>
+    <w:p/>
+    <w:p/>
+    <w:p/>
+    <w:p/>
+    <w:p/>
+    <w:p/>
+    <w:p/>
+    <w:p/>
+    <w:p/>
+    <w:p/>
+    <w:p/>
+    <w:p/>
+    <w:p/>
+    <w:p/>
+    <w:p/>
+    <w:p/>
+    <w:p/>
+    <w:p/>
+    <w:p/>
+    <w:p/>
+    <w:p/>
+    <w:p/>
+    <w:p/>
+    <w:p/>
+    <w:p/>
+    <w:p/>
+    <w:p/>
+    <w:p/>
+    <w:p>
+      <w:r>
+        <w:rPr>
+          <w:b/>
+          <w:bCs/>
+          <w:sz w:val="22"/>
+          <w:szCs w:val="22"/>
+        </w:rPr>
+        <w:lastRenderedPageBreak/>
+        <w:t xml:space="preserve">Question </w:t>
+      </w:r>
+      <w:r>
+        <w:rPr>
+          <w:b/>
+          <w:bCs/>
+          <w:sz w:val="22"/>
+          <w:szCs w:val="22"/>
+        </w:rPr>
+        <w:t>5</w:t>
+      </w:r>
+      <w:r>
+        <w:rPr>
+          <w:b/>
+          <w:bCs/>
+          <w:sz w:val="22"/>
+          <w:szCs w:val="22"/>
+        </w:rPr>
+        <w:t>.</w:t>
+      </w:r>
+      <w:r>
+        <w:rPr>
+          <w:b/>
+          <w:bCs/>
+          <w:sz w:val="22"/>
+          <w:szCs w:val="22"/>
+        </w:rPr>
+        <w:t>2</w:t>
+      </w:r>
+    </w:p>
+    <w:p/>
+    <w:p/>
+    <w:p/>
+    <w:p/>
+    <w:p/>
+    <w:p/>
+    <w:p/>
+    <w:p/>
+    <w:p/>
+    <w:p/>
+    <w:p/>
+    <w:p>
+      <w:r>
+        <w:rPr>
+          <w:noProof/>
+        </w:rPr>
+        <w:drawing>
+          <wp:anchor distT="0" distB="0" distL="114300" distR="114300" simplePos="0" relativeHeight="251661312" behindDoc="0" locked="0" layoutInCell="1" allowOverlap="1" wp14:anchorId="31C21028" wp14:editId="719586C4">
+            <wp:simplePos x="0" y="0"/>
+            <wp:positionH relativeFrom="column">
+              <wp:posOffset>694055</wp:posOffset>
+            </wp:positionH>
+            <wp:positionV relativeFrom="paragraph">
+              <wp:posOffset>197485</wp:posOffset>
+            </wp:positionV>
+            <wp:extent cx="7843520" cy="2416810"/>
+            <wp:effectExtent l="8255" t="0" r="0" b="0"/>
+            <wp:wrapSquare wrapText="bothSides"/>
+            <wp:docPr id="1390734452" name="Picture 6"/>
+            <wp:cNvGraphicFramePr>
+              <a:graphicFrameLocks xmlns:a="http://schemas.openxmlformats.org/drawingml/2006/main" noChangeAspect="1"/>
+            </wp:cNvGraphicFramePr>
+            <a:graphic xmlns:a="http://schemas.openxmlformats.org/drawingml/2006/main">
+              <a:graphicData uri="http://schemas.openxmlformats.org/drawingml/2006/picture">
+                <pic:pic xmlns:pic="http://schemas.openxmlformats.org/drawingml/2006/picture">
+                  <pic:nvPicPr>
+                    <pic:cNvPr id="1390734452" name="Picture 1390734452"/>
+                    <pic:cNvPicPr/>
+                  </pic:nvPicPr>
+                  <pic:blipFill>
+                    <a:blip r:embed="rId10" cstate="print">
+                      <a:extLst>
+                        <a:ext uri="{28A0092B-C50C-407E-A947-70E740481C1C}">
+                          <a14:useLocalDpi xmlns:a14="http://schemas.microsoft.com/office/drawing/2010/main" val="0"/>
+                        </a:ext>
+                      </a:extLst>
+                    </a:blip>
+                    <a:stretch>
+                      <a:fillRect/>
+                    </a:stretch>
+                  </pic:blipFill>
+                  <pic:spPr>
+                    <a:xfrm rot="5400000">
+                      <a:off x="0" y="0"/>
+                      <a:ext cx="7843520" cy="2416810"/>
+                    </a:xfrm>
+                    <a:prstGeom prst="rect">
+                      <a:avLst/>
+                    </a:prstGeom>
+                  </pic:spPr>
+                </pic:pic>
+              </a:graphicData>
+            </a:graphic>
+            <wp14:sizeRelH relativeFrom="margin">
+              <wp14:pctWidth>0</wp14:pctWidth>
+            </wp14:sizeRelH>
+            <wp14:sizeRelV relativeFrom="margin">
+              <wp14:pctHeight>0</wp14:pctHeight>
+            </wp14:sizeRelV>
+          </wp:anchor>
+        </w:drawing>
+      </w:r>
+    </w:p>
+    <w:p/>
+    <w:p/>
+    <w:p/>
+    <w:p/>
+    <w:p/>
+    <w:p/>
+    <w:p/>
+    <w:p/>
+    <w:p/>
+    <w:p/>
+    <w:p/>
+    <w:p/>
+    <w:p/>
+    <w:p/>
+    <w:p/>
+    <w:p/>
+    <w:p/>
+    <w:p/>
+    <w:p/>
+    <w:p/>
+    <w:p/>
+    <w:p/>
+    <w:p/>
+    <w:p/>
     <w:sectPr>
-      <w:headerReference w:type="default" r:id="rId9"/>
-      <w:footerReference w:type="default" r:id="rId10"/>
+      <w:headerReference w:type="default" r:id="rId11"/>
+      <w:footerReference w:type="default" r:id="rId12"/>
       <w:pgSz w:w="11906" w:h="16838"/>
       <w:pgMar w:top="1440" w:right="1440" w:bottom="1440" w:left="1440" w:header="708" w:footer="708" w:gutter="0"/>
       <w:cols w:space="708"/>
@@ -887,7 +1173,7 @@
 </file>
 
 <file path=word/endnotes.xml><?xml version="1.0" encoding="utf-8"?>
-<w:endnotes xmlns:wpc="http://schemas.microsoft.com/office/word/2010/wordprocessingCanvas" xmlns:cx="http://schemas.microsoft.com/office/drawing/2014/chartex" xmlns:cx1="http://schemas.microsoft.com/office/drawing/2015/9/8/chartex" xmlns:cx2="http://schemas.microsoft.com/office/drawing/2015/10/21/chartex" xmlns:cx3="http://schemas.microsoft.com/office/drawing/2016/5/9/chartex" xmlns:cx4="http://schemas.microsoft.com/office/drawing/2016/5/10/chartex" xmlns:cx5="http://schemas.microsoft.com/office/drawing/2016/5/11/chartex" xmlns:cx6="http://schemas.microsoft.com/office/drawing/2016/5/12/chartex" xmlns:cx7="http://schemas.microsoft.com/office/drawing/2016/5/13/chartex" xmlns:cx8="http://schemas.microsoft.com/office/drawing/2016/5/14/chartex" xmlns:mc="http://schemas.openxmlformats.org/markup-compatibility/2006" xmlns:aink="http://schemas.microsoft.com/office/drawing/2016/ink" xmlns:am3d="http://schemas.microsoft.com/office/drawing/2017/model3d" xmlns:o="urn:schemas-microsoft-com:office:office" xmlns:oel="http://schemas.microsoft.com/office/2019/extlst" xmlns:r="http://schemas.openxmlformats.org/officeDocument/2006/relationships" xmlns:m="http://schemas.openxmlformats.org/officeDocument/2006/math" xmlns:v="urn:schemas-microsoft-com:vml" xmlns:wp14="http://schemas.microsoft.com/office/word/2010/wordprocessingDrawing" xmlns:wp="http://schemas.openxmlformats.org/drawingml/2006/wordprocessingDrawing" xmlns:w10="urn:schemas-microsoft-com:office:word" xmlns:w="http://schemas.openxmlformats.org/wordprocessingml/2006/main" xmlns:w14="http://schemas.microsoft.com/office/word/2010/wordml" xmlns:w15="http://schemas.microsoft.com/office/word/2012/wordml" xmlns:w16cex="http://schemas.microsoft.com/office/word/2018/wordml/cex" xmlns:w16cid="http://schemas.microsoft.com/office/word/2016/wordml/cid" xmlns:w16="http://schemas.microsoft.com/office/word/2018/wordml" xmlns:w16du="http://schemas.microsoft.com/office/word/2023/wordml/word16du" xmlns:w16sdtdh="http://schemas.microsoft.com/office/word/2020/wordml/sdtdatahash" xmlns:w16sdtfl="http://schemas.microsoft.com/office/word/2024/wordml/sdtformatlock" xmlns:w16se="http://schemas.microsoft.com/office/word/2015/wordml/symex" xmlns:wpg="http://schemas.microsoft.com/office/word/2010/wordprocessingGroup" xmlns:wpi="http://schemas.microsoft.com/office/word/2010/wordprocessingInk" xmlns:wne="http://schemas.microsoft.com/office/word/2006/wordml" xmlns:wps="http://schemas.microsoft.com/office/word/2010/wordprocessingShape" mc:Ignorable="w14 w15 w16se w16cid w16 w16cex w16sdtdh w16sdtfl w16du wp14">
+<w:endnotes xmlns:wpc="http://schemas.microsoft.com/office/word/2010/wordprocessingCanvas" xmlns:cx="http://schemas.microsoft.com/office/drawing/2014/chartex" xmlns:cx1="http://schemas.microsoft.com/office/drawing/2015/9/8/chartex" xmlns:cx2="http://schemas.microsoft.com/office/drawing/2015/10/21/chartex" xmlns:cx3="http://schemas.microsoft.com/office/drawing/2016/5/9/chartex" xmlns:cx4="http://schemas.microsoft.com/office/drawing/2016/5/10/chartex" xmlns:cx5="http://schemas.microsoft.com/office/drawing/2016/5/11/chartex" xmlns:cx6="http://schemas.microsoft.com/office/drawing/2016/5/12/chartex" xmlns:cx7="http://schemas.microsoft.com/office/drawing/2016/5/13/chartex" xmlns:cx8="http://schemas.microsoft.com/office/drawing/2016/5/14/chartex" xmlns:mc="http://schemas.openxmlformats.org/markup-compatibility/2006" xmlns:aink="http://schemas.microsoft.com/office/drawing/2016/ink" xmlns:am3d="http://schemas.microsoft.com/office/drawing/2017/model3d" xmlns:o="urn:schemas-microsoft-com:office:office" xmlns:oel="http://schemas.microsoft.com/office/2019/extlst" xmlns:r="http://schemas.openxmlformats.org/officeDocument/2006/relationships" xmlns:m="http://schemas.openxmlformats.org/officeDocument/2006/math" xmlns:v="urn:schemas-microsoft-com:vml" xmlns:wp14="http://schemas.microsoft.com/office/word/2010/wordprocessingDrawing" xmlns:wp="http://schemas.openxmlformats.org/drawingml/2006/wordprocessingDrawing" xmlns:w10="urn:schemas-microsoft-com:office:word" xmlns:w="http://schemas.openxmlformats.org/wordprocessingml/2006/main" xmlns:w14="http://schemas.microsoft.com/office/word/2010/wordml" xmlns:w15="http://schemas.microsoft.com/office/word/2012/wordml" xmlns:w16cei="http://schemas.microsoft.com/office/word/2026/wordml/cei" xmlns:w16cex="http://schemas.microsoft.com/office/word/2018/wordml/cex" xmlns:w16cid="http://schemas.microsoft.com/office/word/2016/wordml/cid" xmlns:w16="http://schemas.microsoft.com/office/word/2018/wordml" xmlns:w16du="http://schemas.microsoft.com/office/word/2023/wordml/word16du" xmlns:w16sdtdh="http://schemas.microsoft.com/office/word/2020/wordml/sdtdatahash" xmlns:w16sdtfl="http://schemas.microsoft.com/office/word/2024/wordml/sdtformatlock" xmlns:w16se="http://schemas.microsoft.com/office/word/2015/wordml/symex" xmlns:wpg="http://schemas.microsoft.com/office/word/2010/wordprocessingGroup" xmlns:wpi="http://schemas.microsoft.com/office/word/2010/wordprocessingInk" xmlns:wne="http://schemas.microsoft.com/office/word/2006/wordml" xmlns:wps="http://schemas.microsoft.com/office/word/2010/wordprocessingShape" mc:Ignorable="w14 w15 w16se w16cid w16 w16cex w16sdtdh w16sdtfl w16du wp14">
   <w:endnote w:type="separator" w:id="-1">
     <w:p>
       <w:pPr>
@@ -912,7 +1198,7 @@
 </file>
 
 <file path=word/footer1.xml><?xml version="1.0" encoding="utf-8"?>
-<w:ftr xmlns:wpc="http://schemas.microsoft.com/office/word/2010/wordprocessingCanvas" xmlns:cx="http://schemas.microsoft.com/office/drawing/2014/chartex" xmlns:cx1="http://schemas.microsoft.com/office/drawing/2015/9/8/chartex" xmlns:cx2="http://schemas.microsoft.com/office/drawing/2015/10/21/chartex" xmlns:cx3="http://schemas.microsoft.com/office/drawing/2016/5/9/chartex" xmlns:cx4="http://schemas.microsoft.com/office/drawing/2016/5/10/chartex" xmlns:cx5="http://schemas.microsoft.com/office/drawing/2016/5/11/chartex" xmlns:cx6="http://schemas.microsoft.com/office/drawing/2016/5/12/chartex" xmlns:cx7="http://schemas.microsoft.com/office/drawing/2016/5/13/chartex" xmlns:cx8="http://schemas.microsoft.com/office/drawing/2016/5/14/chartex" xmlns:mc="http://schemas.openxmlformats.org/markup-compatibility/2006" xmlns:aink="http://schemas.microsoft.com/office/drawing/2016/ink" xmlns:am3d="http://schemas.microsoft.com/office/drawing/2017/model3d" xmlns:o="urn:schemas-microsoft-com:office:office" xmlns:oel="http://schemas.microsoft.com/office/2019/extlst" xmlns:r="http://schemas.openxmlformats.org/officeDocument/2006/relationships" xmlns:m="http://schemas.openxmlformats.org/officeDocument/2006/math" xmlns:v="urn:schemas-microsoft-com:vml" xmlns:wp14="http://schemas.microsoft.com/office/word/2010/wordprocessingDrawing" xmlns:wp="http://schemas.openxmlformats.org/drawingml/2006/wordprocessingDrawing" xmlns:w10="urn:schemas-microsoft-com:office:word" xmlns:w="http://schemas.openxmlformats.org/wordprocessingml/2006/main" xmlns:w14="http://schemas.microsoft.com/office/word/2010/wordml" xmlns:w15="http://schemas.microsoft.com/office/word/2012/wordml" xmlns:w16cex="http://schemas.microsoft.com/office/word/2018/wordml/cex" xmlns:w16cid="http://schemas.microsoft.com/office/word/2016/wordml/cid" xmlns:w16="http://schemas.microsoft.com/office/word/2018/wordml" xmlns:w16du="http://schemas.microsoft.com/office/word/2023/wordml/word16du" xmlns:w16sdtdh="http://schemas.microsoft.com/office/word/2020/wordml/sdtdatahash" xmlns:w16sdtfl="http://schemas.microsoft.com/office/word/2024/wordml/sdtformatlock" xmlns:w16se="http://schemas.microsoft.com/office/word/2015/wordml/symex" xmlns:wpg="http://schemas.microsoft.com/office/word/2010/wordprocessingGroup" xmlns:wpi="http://schemas.microsoft.com/office/word/2010/wordprocessingInk" xmlns:wne="http://schemas.microsoft.com/office/word/2006/wordml" xmlns:wps="http://schemas.microsoft.com/office/word/2010/wordprocessingShape" mc:Ignorable="w14 w15 w16se w16cid w16 w16cex w16sdtdh w16sdtfl w16du wp14">
+<w:ftr xmlns:wpc="http://schemas.microsoft.com/office/word/2010/wordprocessingCanvas" xmlns:cx="http://schemas.microsoft.com/office/drawing/2014/chartex" xmlns:cx1="http://schemas.microsoft.com/office/drawing/2015/9/8/chartex" xmlns:cx2="http://schemas.microsoft.com/office/drawing/2015/10/21/chartex" xmlns:cx3="http://schemas.microsoft.com/office/drawing/2016/5/9/chartex" xmlns:cx4="http://schemas.microsoft.com/office/drawing/2016/5/10/chartex" xmlns:cx5="http://schemas.microsoft.com/office/drawing/2016/5/11/chartex" xmlns:cx6="http://schemas.microsoft.com/office/drawing/2016/5/12/chartex" xmlns:cx7="http://schemas.microsoft.com/office/drawing/2016/5/13/chartex" xmlns:cx8="http://schemas.microsoft.com/office/drawing/2016/5/14/chartex" xmlns:mc="http://schemas.openxmlformats.org/markup-compatibility/2006" xmlns:aink="http://schemas.microsoft.com/office/drawing/2016/ink" xmlns:am3d="http://schemas.microsoft.com/office/drawing/2017/model3d" xmlns:o="urn:schemas-microsoft-com:office:office" xmlns:oel="http://schemas.microsoft.com/office/2019/extlst" xmlns:r="http://schemas.openxmlformats.org/officeDocument/2006/relationships" xmlns:m="http://schemas.openxmlformats.org/officeDocument/2006/math" xmlns:v="urn:schemas-microsoft-com:vml" xmlns:wp14="http://schemas.microsoft.com/office/word/2010/wordprocessingDrawing" xmlns:wp="http://schemas.openxmlformats.org/drawingml/2006/wordprocessingDrawing" xmlns:w10="urn:schemas-microsoft-com:office:word" xmlns:w="http://schemas.openxmlformats.org/wordprocessingml/2006/main" xmlns:w14="http://schemas.microsoft.com/office/word/2010/wordml" xmlns:w15="http://schemas.microsoft.com/office/word/2012/wordml" xmlns:w16cei="http://schemas.microsoft.com/office/word/2026/wordml/cei" xmlns:w16cex="http://schemas.microsoft.com/office/word/2018/wordml/cex" xmlns:w16cid="http://schemas.microsoft.com/office/word/2016/wordml/cid" xmlns:w16="http://schemas.microsoft.com/office/word/2018/wordml" xmlns:w16du="http://schemas.microsoft.com/office/word/2023/wordml/word16du" xmlns:w16sdtdh="http://schemas.microsoft.com/office/word/2020/wordml/sdtdatahash" xmlns:w16sdtfl="http://schemas.microsoft.com/office/word/2024/wordml/sdtformatlock" xmlns:w16se="http://schemas.microsoft.com/office/word/2015/wordml/symex" xmlns:wpg="http://schemas.microsoft.com/office/word/2010/wordprocessingGroup" xmlns:wpi="http://schemas.microsoft.com/office/word/2010/wordprocessingInk" xmlns:wne="http://schemas.microsoft.com/office/word/2006/wordml" xmlns:wps="http://schemas.microsoft.com/office/word/2010/wordprocessingShape" mc:Ignorable="w14 w15 w16se w16cid w16 w16cex w16sdtdh w16sdtfl w16du wp14">
   <w:p>
     <w:pPr>
       <w:pStyle w:val="Footer"/>
@@ -1106,16 +1392,8 @@
                                   <w:rPr>
                                     <w:color w:val="808080" w:themeColor="background1" w:themeShade="80"/>
                                   </w:rPr>
-                                  <w:t xml:space="preserve"> &amp; Thabo </w:t>
+                                  <w:t xml:space="preserve"> &amp; Thabo Ngwabi</w:t>
                                 </w:r>
-                                <w:proofErr w:type="spellStart"/>
-                                <w:r>
-                                  <w:rPr>
-                                    <w:color w:val="808080" w:themeColor="background1" w:themeShade="80"/>
-                                  </w:rPr>
-                                  <w:t>Ngwabi</w:t>
-                                </w:r>
-                                <w:proofErr w:type="spellEnd"/>
                               </w:sdtContent>
                             </w:sdt>
                           </w:p>
@@ -1228,16 +1506,8 @@
                             <w:rPr>
                               <w:color w:val="808080" w:themeColor="background1" w:themeShade="80"/>
                             </w:rPr>
-                            <w:t xml:space="preserve"> &amp; Thabo </w:t>
+                            <w:t xml:space="preserve"> &amp; Thabo Ngwabi</w:t>
                           </w:r>
-                          <w:proofErr w:type="spellStart"/>
-                          <w:r>
-                            <w:rPr>
-                              <w:color w:val="808080" w:themeColor="background1" w:themeShade="80"/>
-                            </w:rPr>
-                            <w:t>Ngwabi</w:t>
-                          </w:r>
-                          <w:proofErr w:type="spellEnd"/>
                         </w:sdtContent>
                       </w:sdt>
                     </w:p>
@@ -1255,7 +1525,7 @@
 </file>
 
 <file path=word/footnotes.xml><?xml version="1.0" encoding="utf-8"?>
-<w:footnotes xmlns:wpc="http://schemas.microsoft.com/office/word/2010/wordprocessingCanvas" xmlns:cx="http://schemas.microsoft.com/office/drawing/2014/chartex" xmlns:cx1="http://schemas.microsoft.com/office/drawing/2015/9/8/chartex" xmlns:cx2="http://schemas.microsoft.com/office/drawing/2015/10/21/chartex" xmlns:cx3="http://schemas.microsoft.com/office/drawing/2016/5/9/chartex" xmlns:cx4="http://schemas.microsoft.com/office/drawing/2016/5/10/chartex" xmlns:cx5="http://schemas.microsoft.com/office/drawing/2016/5/11/chartex" xmlns:cx6="http://schemas.microsoft.com/office/drawing/2016/5/12/chartex" xmlns:cx7="http://schemas.microsoft.com/office/drawing/2016/5/13/chartex" xmlns:cx8="http://schemas.microsoft.com/office/drawing/2016/5/14/chartex" xmlns:mc="http://schemas.openxmlformats.org/markup-compatibility/2006" xmlns:aink="http://schemas.microsoft.com/office/drawing/2016/ink" xmlns:am3d="http://schemas.microsoft.com/office/drawing/2017/model3d" xmlns:o="urn:schemas-microsoft-com:office:office" xmlns:oel="http://schemas.microsoft.com/office/2019/extlst" xmlns:r="http://schemas.openxmlformats.org/officeDocument/2006/relationships" xmlns:m="http://schemas.openxmlformats.org/officeDocument/2006/math" xmlns:v="urn:schemas-microsoft-com:vml" xmlns:wp14="http://schemas.microsoft.com/office/word/2010/wordprocessingDrawing" xmlns:wp="http://schemas.openxmlformats.org/drawingml/2006/wordprocessingDrawing" xmlns:w10="urn:schemas-microsoft-com:office:word" xmlns:w="http://schemas.openxmlformats.org/wordprocessingml/2006/main" xmlns:w14="http://schemas.microsoft.com/office/word/2010/wordml" xmlns:w15="http://schemas.microsoft.com/office/word/2012/wordml" xmlns:w16cex="http://schemas.microsoft.com/office/word/2018/wordml/cex" xmlns:w16cid="http://schemas.microsoft.com/office/word/2016/wordml/cid" xmlns:w16="http://schemas.microsoft.com/office/word/2018/wordml" xmlns:w16du="http://schemas.microsoft.com/office/word/2023/wordml/word16du" xmlns:w16sdtdh="http://schemas.microsoft.com/office/word/2020/wordml/sdtdatahash" xmlns:w16sdtfl="http://schemas.microsoft.com/office/word/2024/wordml/sdtformatlock" xmlns:w16se="http://schemas.microsoft.com/office/word/2015/wordml/symex" xmlns:wpg="http://schemas.microsoft.com/office/word/2010/wordprocessingGroup" xmlns:wpi="http://schemas.microsoft.com/office/word/2010/wordprocessingInk" xmlns:wne="http://schemas.microsoft.com/office/word/2006/wordml" xmlns:wps="http://schemas.microsoft.com/office/word/2010/wordprocessingShape" mc:Ignorable="w14 w15 w16se w16cid w16 w16cex w16sdtdh w16sdtfl w16du wp14">
+<w:footnotes xmlns:wpc="http://schemas.microsoft.com/office/word/2010/wordprocessingCanvas" xmlns:cx="http://schemas.microsoft.com/office/drawing/2014/chartex" xmlns:cx1="http://schemas.microsoft.com/office/drawing/2015/9/8/chartex" xmlns:cx2="http://schemas.microsoft.com/office/drawing/2015/10/21/chartex" xmlns:cx3="http://schemas.microsoft.com/office/drawing/2016/5/9/chartex" xmlns:cx4="http://schemas.microsoft.com/office/drawing/2016/5/10/chartex" xmlns:cx5="http://schemas.microsoft.com/office/drawing/2016/5/11/chartex" xmlns:cx6="http://schemas.microsoft.com/office/drawing/2016/5/12/chartex" xmlns:cx7="http://schemas.microsoft.com/office/drawing/2016/5/13/chartex" xmlns:cx8="http://schemas.microsoft.com/office/drawing/2016/5/14/chartex" xmlns:mc="http://schemas.openxmlformats.org/markup-compatibility/2006" xmlns:aink="http://schemas.microsoft.com/office/drawing/2016/ink" xmlns:am3d="http://schemas.microsoft.com/office/drawing/2017/model3d" xmlns:o="urn:schemas-microsoft-com:office:office" xmlns:oel="http://schemas.microsoft.com/office/2019/extlst" xmlns:r="http://schemas.openxmlformats.org/officeDocument/2006/relationships" xmlns:m="http://schemas.openxmlformats.org/officeDocument/2006/math" xmlns:v="urn:schemas-microsoft-com:vml" xmlns:wp14="http://schemas.microsoft.com/office/word/2010/wordprocessingDrawing" xmlns:wp="http://schemas.openxmlformats.org/drawingml/2006/wordprocessingDrawing" xmlns:w10="urn:schemas-microsoft-com:office:word" xmlns:w="http://schemas.openxmlformats.org/wordprocessingml/2006/main" xmlns:w14="http://schemas.microsoft.com/office/word/2010/wordml" xmlns:w15="http://schemas.microsoft.com/office/word/2012/wordml" xmlns:w16cei="http://schemas.microsoft.com/office/word/2026/wordml/cei" xmlns:w16cex="http://schemas.microsoft.com/office/word/2018/wordml/cex" xmlns:w16cid="http://schemas.microsoft.com/office/word/2016/wordml/cid" xmlns:w16="http://schemas.microsoft.com/office/word/2018/wordml" xmlns:w16du="http://schemas.microsoft.com/office/word/2023/wordml/word16du" xmlns:w16sdtdh="http://schemas.microsoft.com/office/word/2020/wordml/sdtdatahash" xmlns:w16sdtfl="http://schemas.microsoft.com/office/word/2024/wordml/sdtformatlock" xmlns:w16se="http://schemas.microsoft.com/office/word/2015/wordml/symex" xmlns:wpg="http://schemas.microsoft.com/office/word/2010/wordprocessingGroup" xmlns:wpi="http://schemas.microsoft.com/office/word/2010/wordprocessingInk" xmlns:wne="http://schemas.microsoft.com/office/word/2006/wordml" xmlns:wps="http://schemas.microsoft.com/office/word/2010/wordprocessingShape" mc:Ignorable="w14 w15 w16se w16cid w16 w16cex w16sdtdh w16sdtfl w16du wp14">
   <w:footnote w:type="separator" w:id="-1">
     <w:p>
       <w:pPr>
@@ -1280,7 +1550,7 @@
 </file>
 
 <file path=word/header1.xml><?xml version="1.0" encoding="utf-8"?>
-<w:hdr xmlns:wpc="http://schemas.microsoft.com/office/word/2010/wordprocessingCanvas" xmlns:cx="http://schemas.microsoft.com/office/drawing/2014/chartex" xmlns:cx1="http://schemas.microsoft.com/office/drawing/2015/9/8/chartex" xmlns:cx2="http://schemas.microsoft.com/office/drawing/2015/10/21/chartex" xmlns:cx3="http://schemas.microsoft.com/office/drawing/2016/5/9/chartex" xmlns:cx4="http://schemas.microsoft.com/office/drawing/2016/5/10/chartex" xmlns:cx5="http://schemas.microsoft.com/office/drawing/2016/5/11/chartex" xmlns:cx6="http://schemas.microsoft.com/office/drawing/2016/5/12/chartex" xmlns:cx7="http://schemas.microsoft.com/office/drawing/2016/5/13/chartex" xmlns:cx8="http://schemas.microsoft.com/office/drawing/2016/5/14/chartex" xmlns:mc="http://schemas.openxmlformats.org/markup-compatibility/2006" xmlns:aink="http://schemas.microsoft.com/office/drawing/2016/ink" xmlns:am3d="http://schemas.microsoft.com/office/drawing/2017/model3d" xmlns:o="urn:schemas-microsoft-com:office:office" xmlns:oel="http://schemas.microsoft.com/office/2019/extlst" xmlns:r="http://schemas.openxmlformats.org/officeDocument/2006/relationships" xmlns:m="http://schemas.openxmlformats.org/officeDocument/2006/math" xmlns:v="urn:schemas-microsoft-com:vml" xmlns:wp14="http://schemas.microsoft.com/office/word/2010/wordprocessingDrawing" xmlns:wp="http://schemas.openxmlformats.org/drawingml/2006/wordprocessingDrawing" xmlns:w10="urn:schemas-microsoft-com:office:word" xmlns:w="http://schemas.openxmlformats.org/wordprocessingml/2006/main" xmlns:w14="http://schemas.microsoft.com/office/word/2010/wordml" xmlns:w15="http://schemas.microsoft.com/office/word/2012/wordml" xmlns:w16cex="http://schemas.microsoft.com/office/word/2018/wordml/cex" xmlns:w16cid="http://schemas.microsoft.com/office/word/2016/wordml/cid" xmlns:w16="http://schemas.microsoft.com/office/word/2018/wordml" xmlns:w16du="http://schemas.microsoft.com/office/word/2023/wordml/word16du" xmlns:w16sdtdh="http://schemas.microsoft.com/office/word/2020/wordml/sdtdatahash" xmlns:w16sdtfl="http://schemas.microsoft.com/office/word/2024/wordml/sdtformatlock" xmlns:w16se="http://schemas.microsoft.com/office/word/2015/wordml/symex" xmlns:wpg="http://schemas.microsoft.com/office/word/2010/wordprocessingGroup" xmlns:wpi="http://schemas.microsoft.com/office/word/2010/wordprocessingInk" xmlns:wne="http://schemas.microsoft.com/office/word/2006/wordml" xmlns:wps="http://schemas.microsoft.com/office/word/2010/wordprocessingShape" mc:Ignorable="w14 w15 w16se w16cid w16 w16cex w16sdtdh w16sdtfl w16du wp14">
+<w:hdr xmlns:wpc="http://schemas.microsoft.com/office/word/2010/wordprocessingCanvas" xmlns:cx="http://schemas.microsoft.com/office/drawing/2014/chartex" xmlns:cx1="http://schemas.microsoft.com/office/drawing/2015/9/8/chartex" xmlns:cx2="http://schemas.microsoft.com/office/drawing/2015/10/21/chartex" xmlns:cx3="http://schemas.microsoft.com/office/drawing/2016/5/9/chartex" xmlns:cx4="http://schemas.microsoft.com/office/drawing/2016/5/10/chartex" xmlns:cx5="http://schemas.microsoft.com/office/drawing/2016/5/11/chartex" xmlns:cx6="http://schemas.microsoft.com/office/drawing/2016/5/12/chartex" xmlns:cx7="http://schemas.microsoft.com/office/drawing/2016/5/13/chartex" xmlns:cx8="http://schemas.microsoft.com/office/drawing/2016/5/14/chartex" xmlns:mc="http://schemas.openxmlformats.org/markup-compatibility/2006" xmlns:aink="http://schemas.microsoft.com/office/drawing/2016/ink" xmlns:am3d="http://schemas.microsoft.com/office/drawing/2017/model3d" xmlns:o="urn:schemas-microsoft-com:office:office" xmlns:oel="http://schemas.microsoft.com/office/2019/extlst" xmlns:r="http://schemas.openxmlformats.org/officeDocument/2006/relationships" xmlns:m="http://schemas.openxmlformats.org/officeDocument/2006/math" xmlns:v="urn:schemas-microsoft-com:vml" xmlns:wp14="http://schemas.microsoft.com/office/word/2010/wordprocessingDrawing" xmlns:wp="http://schemas.openxmlformats.org/drawingml/2006/wordprocessingDrawing" xmlns:w10="urn:schemas-microsoft-com:office:word" xmlns:w="http://schemas.openxmlformats.org/wordprocessingml/2006/main" xmlns:w14="http://schemas.microsoft.com/office/word/2010/wordml" xmlns:w15="http://schemas.microsoft.com/office/word/2012/wordml" xmlns:w16cei="http://schemas.microsoft.com/office/word/2026/wordml/cei" xmlns:w16cex="http://schemas.microsoft.com/office/word/2018/wordml/cex" xmlns:w16cid="http://schemas.microsoft.com/office/word/2016/wordml/cid" xmlns:w16="http://schemas.microsoft.com/office/word/2018/wordml" xmlns:w16du="http://schemas.microsoft.com/office/word/2023/wordml/word16du" xmlns:w16sdtdh="http://schemas.microsoft.com/office/word/2020/wordml/sdtdatahash" xmlns:w16sdtfl="http://schemas.microsoft.com/office/word/2024/wordml/sdtformatlock" xmlns:w16se="http://schemas.microsoft.com/office/word/2015/wordml/symex" xmlns:wpg="http://schemas.microsoft.com/office/word/2010/wordprocessingGroup" xmlns:wpi="http://schemas.microsoft.com/office/word/2010/wordprocessingInk" xmlns:wne="http://schemas.microsoft.com/office/word/2006/wordml" xmlns:wps="http://schemas.microsoft.com/office/word/2010/wordprocessingShape" mc:Ignorable="w14 w15 w16se w16cid w16 w16cex w16sdtdh w16sdtfl w16du wp14">
   <w:p>
     <w:pPr>
       <w:pStyle w:val="Header"/>
@@ -1444,7 +1714,7 @@
 </file>
 
 <file path=word/numbering.xml><?xml version="1.0" encoding="utf-8"?>
-<w:numbering xmlns:wpc="http://schemas.microsoft.com/office/word/2010/wordprocessingCanvas" xmlns:cx="http://schemas.microsoft.com/office/drawing/2014/chartex" xmlns:cx1="http://schemas.microsoft.com/office/drawing/2015/9/8/chartex" xmlns:cx2="http://schemas.microsoft.com/office/drawing/2015/10/21/chartex" xmlns:cx3="http://schemas.microsoft.com/office/drawing/2016/5/9/chartex" xmlns:cx4="http://schemas.microsoft.com/office/drawing/2016/5/10/chartex" xmlns:cx5="http://schemas.microsoft.com/office/drawing/2016/5/11/chartex" xmlns:cx6="http://schemas.microsoft.com/office/drawing/2016/5/12/chartex" xmlns:cx7="http://schemas.microsoft.com/office/drawing/2016/5/13/chartex" xmlns:cx8="http://schemas.microsoft.com/office/drawing/2016/5/14/chartex" xmlns:mc="http://schemas.openxmlformats.org/markup-compatibility/2006" xmlns:aink="http://schemas.microsoft.com/office/drawing/2016/ink" xmlns:am3d="http://schemas.microsoft.com/office/drawing/2017/model3d" xmlns:o="urn:schemas-microsoft-com:office:office" xmlns:oel="http://schemas.microsoft.com/office/2019/extlst" xmlns:r="http://schemas.openxmlformats.org/officeDocument/2006/relationships" xmlns:m="http://schemas.openxmlformats.org/officeDocument/2006/math" xmlns:v="urn:schemas-microsoft-com:vml" xmlns:wp14="http://schemas.microsoft.com/office/word/2010/wordprocessingDrawing" xmlns:wp="http://schemas.openxmlformats.org/drawingml/2006/wordprocessingDrawing" xmlns:w10="urn:schemas-microsoft-com:office:word" xmlns:w="http://schemas.openxmlformats.org/wordprocessingml/2006/main" xmlns:w14="http://schemas.microsoft.com/office/word/2010/wordml" xmlns:w15="http://schemas.microsoft.com/office/word/2012/wordml" xmlns:w16cex="http://schemas.microsoft.com/office/word/2018/wordml/cex" xmlns:w16cid="http://schemas.microsoft.com/office/word/2016/wordml/cid" xmlns:w16="http://schemas.microsoft.com/office/word/2018/wordml" xmlns:w16du="http://schemas.microsoft.com/office/word/2023/wordml/word16du" xmlns:w16sdtdh="http://schemas.microsoft.com/office/word/2020/wordml/sdtdatahash" xmlns:w16sdtfl="http://schemas.microsoft.com/office/word/2024/wordml/sdtformatlock" xmlns:w16se="http://schemas.microsoft.com/office/word/2015/wordml/symex" xmlns:wpg="http://schemas.microsoft.com/office/word/2010/wordprocessingGroup" xmlns:wpi="http://schemas.microsoft.com/office/word/2010/wordprocessingInk" xmlns:wne="http://schemas.microsoft.com/office/word/2006/wordml" xmlns:wps="http://schemas.microsoft.com/office/word/2010/wordprocessingShape" mc:Ignorable="w14 w15 w16se w16cid w16 w16cex w16sdtdh w16sdtfl w16du wp14">
+<w:numbering xmlns:wpc="http://schemas.microsoft.com/office/word/2010/wordprocessingCanvas" xmlns:cx="http://schemas.microsoft.com/office/drawing/2014/chartex" xmlns:cx1="http://schemas.microsoft.com/office/drawing/2015/9/8/chartex" xmlns:cx2="http://schemas.microsoft.com/office/drawing/2015/10/21/chartex" xmlns:cx3="http://schemas.microsoft.com/office/drawing/2016/5/9/chartex" xmlns:cx4="http://schemas.microsoft.com/office/drawing/2016/5/10/chartex" xmlns:cx5="http://schemas.microsoft.com/office/drawing/2016/5/11/chartex" xmlns:cx6="http://schemas.microsoft.com/office/drawing/2016/5/12/chartex" xmlns:cx7="http://schemas.microsoft.com/office/drawing/2016/5/13/chartex" xmlns:cx8="http://schemas.microsoft.com/office/drawing/2016/5/14/chartex" xmlns:mc="http://schemas.openxmlformats.org/markup-compatibility/2006" xmlns:aink="http://schemas.microsoft.com/office/drawing/2016/ink" xmlns:am3d="http://schemas.microsoft.com/office/drawing/2017/model3d" xmlns:o="urn:schemas-microsoft-com:office:office" xmlns:oel="http://schemas.microsoft.com/office/2019/extlst" xmlns:r="http://schemas.openxmlformats.org/officeDocument/2006/relationships" xmlns:m="http://schemas.openxmlformats.org/officeDocument/2006/math" xmlns:v="urn:schemas-microsoft-com:vml" xmlns:wp14="http://schemas.microsoft.com/office/word/2010/wordprocessingDrawing" xmlns:wp="http://schemas.openxmlformats.org/drawingml/2006/wordprocessingDrawing" xmlns:w10="urn:schemas-microsoft-com:office:word" xmlns:w="http://schemas.openxmlformats.org/wordprocessingml/2006/main" xmlns:w14="http://schemas.microsoft.com/office/word/2010/wordml" xmlns:w15="http://schemas.microsoft.com/office/word/2012/wordml" xmlns:w16cei="http://schemas.microsoft.com/office/word/2026/wordml/cei" xmlns:w16cex="http://schemas.microsoft.com/office/word/2018/wordml/cex" xmlns:w16cid="http://schemas.microsoft.com/office/word/2016/wordml/cid" xmlns:w16="http://schemas.microsoft.com/office/word/2018/wordml" xmlns:w16du="http://schemas.microsoft.com/office/word/2023/wordml/word16du" xmlns:w16sdtdh="http://schemas.microsoft.com/office/word/2020/wordml/sdtdatahash" xmlns:w16sdtfl="http://schemas.microsoft.com/office/word/2024/wordml/sdtformatlock" xmlns:w16se="http://schemas.microsoft.com/office/word/2015/wordml/symex" xmlns:wpg="http://schemas.microsoft.com/office/word/2010/wordprocessingGroup" xmlns:wpi="http://schemas.microsoft.com/office/word/2010/wordprocessingInk" xmlns:wne="http://schemas.microsoft.com/office/word/2006/wordml" xmlns:wps="http://schemas.microsoft.com/office/word/2010/wordprocessingShape" mc:Ignorable="w14 w15 w16se w16cid w16 w16cex w16sdtdh w16sdtfl w16du wp14">
   <w:abstractNum w:abstractNumId="0" w15:restartNumberingAfterBreak="0">
     <w:nsid w:val="036205D6"/>
     <w:multiLevelType w:val="multilevel"/>
@@ -3618,7 +3888,7 @@
   <w:style w:type="paragraph" w:default="1" w:styleId="Normal">
     <w:name w:val="Normal"/>
     <w:qFormat/>
-    <w:rsid w:val="004647DD"/>
+    <w:rsid w:val="001802F1"/>
   </w:style>
   <w:style w:type="paragraph" w:styleId="Heading1">
     <w:name w:val="heading 1"/>

</xml_diff>

<commit_message>
Added sequence diagrams to word document
</commit_message>
<xml_diff>
--- a/docs/COS214_Prac3.docx
+++ b/docs/COS214_Prac3.docx
@@ -610,7 +610,7 @@
           <w:noProof/>
         </w:rPr>
         <w:drawing>
-          <wp:anchor distT="0" distB="0" distL="114300" distR="114300" simplePos="0" relativeHeight="251658240" behindDoc="0" locked="0" layoutInCell="1" allowOverlap="1" wp14:anchorId="2C20E90C" wp14:editId="459853EC">
+          <wp:anchor distT="0" distB="0" distL="114300" distR="114300" simplePos="0" relativeHeight="251658240" behindDoc="0" locked="0" layoutInCell="1" allowOverlap="1" wp14:anchorId="2C20E90C" wp14:editId="53B1C671">
             <wp:simplePos x="0" y="0"/>
             <wp:positionH relativeFrom="margin">
               <wp:align>center</wp:align>
@@ -2394,9 +2394,1083 @@
         <w:t xml:space="preserve"> </w:t>
       </w:r>
     </w:p>
+    <w:p>
+      <w:pPr>
+        <w:tabs>
+          <w:tab w:val="left" w:pos="1440"/>
+        </w:tabs>
+      </w:pPr>
+    </w:p>
+    <w:p>
+      <w:pPr>
+        <w:tabs>
+          <w:tab w:val="left" w:pos="1440"/>
+        </w:tabs>
+      </w:pPr>
+    </w:p>
+    <w:p>
+      <w:pPr>
+        <w:tabs>
+          <w:tab w:val="left" w:pos="1440"/>
+        </w:tabs>
+      </w:pPr>
+    </w:p>
+    <w:p>
+      <w:pPr>
+        <w:tabs>
+          <w:tab w:val="left" w:pos="1440"/>
+        </w:tabs>
+      </w:pPr>
+    </w:p>
+    <w:p>
+      <w:pPr>
+        <w:tabs>
+          <w:tab w:val="left" w:pos="1440"/>
+        </w:tabs>
+      </w:pPr>
+    </w:p>
+    <w:p>
+      <w:pPr>
+        <w:tabs>
+          <w:tab w:val="left" w:pos="1440"/>
+        </w:tabs>
+      </w:pPr>
+    </w:p>
+    <w:p>
+      <w:pPr>
+        <w:tabs>
+          <w:tab w:val="left" w:pos="1440"/>
+        </w:tabs>
+      </w:pPr>
+    </w:p>
+    <w:p>
+      <w:pPr>
+        <w:tabs>
+          <w:tab w:val="left" w:pos="1440"/>
+        </w:tabs>
+      </w:pPr>
+    </w:p>
+    <w:p>
+      <w:pPr>
+        <w:tabs>
+          <w:tab w:val="left" w:pos="1440"/>
+        </w:tabs>
+      </w:pPr>
+    </w:p>
+    <w:p>
+      <w:pPr>
+        <w:tabs>
+          <w:tab w:val="left" w:pos="1440"/>
+        </w:tabs>
+      </w:pPr>
+    </w:p>
+    <w:p>
+      <w:pPr>
+        <w:tabs>
+          <w:tab w:val="left" w:pos="1440"/>
+        </w:tabs>
+      </w:pPr>
+    </w:p>
+    <w:p>
+      <w:pPr>
+        <w:tabs>
+          <w:tab w:val="left" w:pos="1440"/>
+        </w:tabs>
+      </w:pPr>
+    </w:p>
+    <w:p>
+      <w:pPr>
+        <w:tabs>
+          <w:tab w:val="left" w:pos="1440"/>
+        </w:tabs>
+      </w:pPr>
+    </w:p>
+    <w:p>
+      <w:pPr>
+        <w:tabs>
+          <w:tab w:val="left" w:pos="1440"/>
+        </w:tabs>
+      </w:pPr>
+    </w:p>
+    <w:p>
+      <w:pPr>
+        <w:tabs>
+          <w:tab w:val="left" w:pos="1440"/>
+        </w:tabs>
+      </w:pPr>
+    </w:p>
+    <w:p>
+      <w:pPr>
+        <w:tabs>
+          <w:tab w:val="left" w:pos="1440"/>
+        </w:tabs>
+      </w:pPr>
+    </w:p>
+    <w:p>
+      <w:pPr>
+        <w:tabs>
+          <w:tab w:val="left" w:pos="1440"/>
+        </w:tabs>
+      </w:pPr>
+    </w:p>
+    <w:p>
+      <w:pPr>
+        <w:tabs>
+          <w:tab w:val="left" w:pos="1440"/>
+        </w:tabs>
+      </w:pPr>
+    </w:p>
+    <w:p>
+      <w:pPr>
+        <w:tabs>
+          <w:tab w:val="left" w:pos="1440"/>
+        </w:tabs>
+      </w:pPr>
+    </w:p>
+    <w:p>
+      <w:pPr>
+        <w:tabs>
+          <w:tab w:val="left" w:pos="1440"/>
+        </w:tabs>
+      </w:pPr>
+    </w:p>
+    <w:p>
+      <w:pPr>
+        <w:tabs>
+          <w:tab w:val="left" w:pos="1440"/>
+        </w:tabs>
+      </w:pPr>
+    </w:p>
+    <w:p>
+      <w:pPr>
+        <w:tabs>
+          <w:tab w:val="left" w:pos="1440"/>
+        </w:tabs>
+      </w:pPr>
+    </w:p>
+    <w:p>
+      <w:pPr>
+        <w:tabs>
+          <w:tab w:val="left" w:pos="1440"/>
+        </w:tabs>
+      </w:pPr>
+    </w:p>
+    <w:p>
+      <w:pPr>
+        <w:tabs>
+          <w:tab w:val="left" w:pos="1440"/>
+        </w:tabs>
+      </w:pPr>
+    </w:p>
+    <w:p>
+      <w:pPr>
+        <w:tabs>
+          <w:tab w:val="left" w:pos="1440"/>
+        </w:tabs>
+      </w:pPr>
+    </w:p>
+    <w:p>
+      <w:pPr>
+        <w:rPr>
+          <w:b/>
+          <w:bCs/>
+          <w:sz w:val="22"/>
+          <w:szCs w:val="22"/>
+        </w:rPr>
+      </w:pPr>
+      <w:r>
+        <w:rPr>
+          <w:noProof/>
+        </w:rPr>
+        <w:lastRenderedPageBreak/>
+        <w:drawing>
+          <wp:anchor distT="0" distB="0" distL="114300" distR="114300" simplePos="0" relativeHeight="251659264" behindDoc="0" locked="0" layoutInCell="1" allowOverlap="1" wp14:anchorId="5D175607" wp14:editId="293327FB">
+            <wp:simplePos x="0" y="0"/>
+            <wp:positionH relativeFrom="column">
+              <wp:posOffset>-742950</wp:posOffset>
+            </wp:positionH>
+            <wp:positionV relativeFrom="paragraph">
+              <wp:posOffset>266065</wp:posOffset>
+            </wp:positionV>
+            <wp:extent cx="7296150" cy="3291205"/>
+            <wp:effectExtent l="0" t="0" r="0" b="4445"/>
+            <wp:wrapSquare wrapText="bothSides"/>
+            <wp:docPr id="525895438" name="Picture 4"/>
+            <wp:cNvGraphicFramePr>
+              <a:graphicFrameLocks xmlns:a="http://schemas.openxmlformats.org/drawingml/2006/main" noChangeAspect="1"/>
+            </wp:cNvGraphicFramePr>
+            <a:graphic xmlns:a="http://schemas.openxmlformats.org/drawingml/2006/main">
+              <a:graphicData uri="http://schemas.openxmlformats.org/drawingml/2006/picture">
+                <pic:pic xmlns:pic="http://schemas.openxmlformats.org/drawingml/2006/picture">
+                  <pic:nvPicPr>
+                    <pic:cNvPr id="525895438" name="Picture 525895438"/>
+                    <pic:cNvPicPr/>
+                  </pic:nvPicPr>
+                  <pic:blipFill>
+                    <a:blip r:embed="rId9">
+                      <a:extLst>
+                        <a:ext uri="{28A0092B-C50C-407E-A947-70E740481C1C}">
+                          <a14:useLocalDpi xmlns:a14="http://schemas.microsoft.com/office/drawing/2010/main" val="0"/>
+                        </a:ext>
+                      </a:extLst>
+                    </a:blip>
+                    <a:stretch>
+                      <a:fillRect/>
+                    </a:stretch>
+                  </pic:blipFill>
+                  <pic:spPr>
+                    <a:xfrm>
+                      <a:off x="0" y="0"/>
+                      <a:ext cx="7296150" cy="3291205"/>
+                    </a:xfrm>
+                    <a:prstGeom prst="rect">
+                      <a:avLst/>
+                    </a:prstGeom>
+                  </pic:spPr>
+                </pic:pic>
+              </a:graphicData>
+            </a:graphic>
+            <wp14:sizeRelH relativeFrom="margin">
+              <wp14:pctWidth>0</wp14:pctWidth>
+            </wp14:sizeRelH>
+            <wp14:sizeRelV relativeFrom="margin">
+              <wp14:pctHeight>0</wp14:pctHeight>
+            </wp14:sizeRelV>
+          </wp:anchor>
+        </w:drawing>
+      </w:r>
+      <w:r>
+        <w:rPr>
+          <w:b/>
+          <w:bCs/>
+          <w:sz w:val="22"/>
+          <w:szCs w:val="22"/>
+        </w:rPr>
+        <w:t xml:space="preserve">Question </w:t>
+      </w:r>
+      <w:r>
+        <w:rPr>
+          <w:b/>
+          <w:bCs/>
+          <w:sz w:val="22"/>
+          <w:szCs w:val="22"/>
+        </w:rPr>
+        <w:t>5</w:t>
+      </w:r>
+      <w:r>
+        <w:rPr>
+          <w:b/>
+          <w:bCs/>
+          <w:sz w:val="22"/>
+          <w:szCs w:val="22"/>
+        </w:rPr>
+        <w:t>.</w:t>
+      </w:r>
+      <w:r>
+        <w:rPr>
+          <w:b/>
+          <w:bCs/>
+          <w:sz w:val="22"/>
+          <w:szCs w:val="22"/>
+        </w:rPr>
+        <w:t>1</w:t>
+      </w:r>
+    </w:p>
+    <w:p>
+      <w:pPr>
+        <w:tabs>
+          <w:tab w:val="left" w:pos="1440"/>
+        </w:tabs>
+      </w:pPr>
+    </w:p>
+    <w:p>
+      <w:pPr>
+        <w:tabs>
+          <w:tab w:val="left" w:pos="1440"/>
+        </w:tabs>
+      </w:pPr>
+    </w:p>
+    <w:p>
+      <w:pPr>
+        <w:tabs>
+          <w:tab w:val="left" w:pos="1440"/>
+        </w:tabs>
+      </w:pPr>
+    </w:p>
+    <w:p>
+      <w:pPr>
+        <w:tabs>
+          <w:tab w:val="left" w:pos="1440"/>
+        </w:tabs>
+      </w:pPr>
+    </w:p>
+    <w:p>
+      <w:pPr>
+        <w:tabs>
+          <w:tab w:val="left" w:pos="1440"/>
+        </w:tabs>
+      </w:pPr>
+    </w:p>
+    <w:p>
+      <w:pPr>
+        <w:tabs>
+          <w:tab w:val="left" w:pos="1440"/>
+        </w:tabs>
+      </w:pPr>
+    </w:p>
+    <w:p>
+      <w:pPr>
+        <w:tabs>
+          <w:tab w:val="left" w:pos="1440"/>
+        </w:tabs>
+      </w:pPr>
+    </w:p>
+    <w:p>
+      <w:pPr>
+        <w:tabs>
+          <w:tab w:val="left" w:pos="1440"/>
+        </w:tabs>
+      </w:pPr>
+    </w:p>
+    <w:p>
+      <w:pPr>
+        <w:tabs>
+          <w:tab w:val="left" w:pos="1440"/>
+        </w:tabs>
+      </w:pPr>
+    </w:p>
+    <w:p>
+      <w:pPr>
+        <w:tabs>
+          <w:tab w:val="left" w:pos="1440"/>
+        </w:tabs>
+      </w:pPr>
+    </w:p>
+    <w:p>
+      <w:pPr>
+        <w:tabs>
+          <w:tab w:val="left" w:pos="1440"/>
+        </w:tabs>
+      </w:pPr>
+    </w:p>
+    <w:p>
+      <w:pPr>
+        <w:tabs>
+          <w:tab w:val="left" w:pos="1440"/>
+        </w:tabs>
+      </w:pPr>
+    </w:p>
+    <w:p>
+      <w:pPr>
+        <w:tabs>
+          <w:tab w:val="left" w:pos="1440"/>
+        </w:tabs>
+      </w:pPr>
+    </w:p>
+    <w:p>
+      <w:pPr>
+        <w:tabs>
+          <w:tab w:val="left" w:pos="1440"/>
+        </w:tabs>
+      </w:pPr>
+    </w:p>
+    <w:p>
+      <w:pPr>
+        <w:tabs>
+          <w:tab w:val="left" w:pos="1440"/>
+        </w:tabs>
+      </w:pPr>
+    </w:p>
+    <w:p>
+      <w:pPr>
+        <w:tabs>
+          <w:tab w:val="left" w:pos="1440"/>
+        </w:tabs>
+      </w:pPr>
+    </w:p>
+    <w:p>
+      <w:pPr>
+        <w:tabs>
+          <w:tab w:val="left" w:pos="1440"/>
+        </w:tabs>
+      </w:pPr>
+    </w:p>
+    <w:p>
+      <w:pPr>
+        <w:tabs>
+          <w:tab w:val="left" w:pos="1440"/>
+        </w:tabs>
+      </w:pPr>
+    </w:p>
+    <w:p>
+      <w:pPr>
+        <w:tabs>
+          <w:tab w:val="left" w:pos="1440"/>
+        </w:tabs>
+      </w:pPr>
+    </w:p>
+    <w:p>
+      <w:pPr>
+        <w:tabs>
+          <w:tab w:val="left" w:pos="1440"/>
+        </w:tabs>
+      </w:pPr>
+    </w:p>
+    <w:p>
+      <w:pPr>
+        <w:tabs>
+          <w:tab w:val="left" w:pos="1440"/>
+        </w:tabs>
+      </w:pPr>
+    </w:p>
+    <w:p>
+      <w:pPr>
+        <w:tabs>
+          <w:tab w:val="left" w:pos="1440"/>
+        </w:tabs>
+      </w:pPr>
+      <w:r>
+        <w:rPr>
+          <w:b/>
+          <w:bCs/>
+          <w:sz w:val="22"/>
+          <w:szCs w:val="22"/>
+        </w:rPr>
+        <w:lastRenderedPageBreak/>
+        <w:t xml:space="preserve">Question </w:t>
+      </w:r>
+      <w:r>
+        <w:rPr>
+          <w:b/>
+          <w:bCs/>
+          <w:sz w:val="22"/>
+          <w:szCs w:val="22"/>
+        </w:rPr>
+        <w:t>5</w:t>
+      </w:r>
+      <w:r>
+        <w:rPr>
+          <w:b/>
+          <w:bCs/>
+          <w:sz w:val="22"/>
+          <w:szCs w:val="22"/>
+        </w:rPr>
+        <w:t>.</w:t>
+      </w:r>
+      <w:r>
+        <w:rPr>
+          <w:b/>
+          <w:bCs/>
+          <w:sz w:val="22"/>
+          <w:szCs w:val="22"/>
+        </w:rPr>
+        <w:t>2</w:t>
+      </w:r>
+    </w:p>
+    <w:p>
+      <w:pPr>
+        <w:tabs>
+          <w:tab w:val="left" w:pos="1440"/>
+        </w:tabs>
+      </w:pPr>
+    </w:p>
+    <w:p>
+      <w:pPr>
+        <w:tabs>
+          <w:tab w:val="left" w:pos="1440"/>
+        </w:tabs>
+      </w:pPr>
+    </w:p>
+    <w:p>
+      <w:pPr>
+        <w:tabs>
+          <w:tab w:val="left" w:pos="1440"/>
+        </w:tabs>
+      </w:pPr>
+    </w:p>
+    <w:p>
+      <w:pPr>
+        <w:tabs>
+          <w:tab w:val="left" w:pos="1440"/>
+        </w:tabs>
+      </w:pPr>
+    </w:p>
+    <w:p>
+      <w:pPr>
+        <w:tabs>
+          <w:tab w:val="left" w:pos="1440"/>
+        </w:tabs>
+      </w:pPr>
+    </w:p>
+    <w:p>
+      <w:pPr>
+        <w:tabs>
+          <w:tab w:val="left" w:pos="1440"/>
+        </w:tabs>
+      </w:pPr>
+    </w:p>
+    <w:p>
+      <w:pPr>
+        <w:tabs>
+          <w:tab w:val="left" w:pos="1440"/>
+        </w:tabs>
+      </w:pPr>
+    </w:p>
+    <w:p>
+      <w:pPr>
+        <w:tabs>
+          <w:tab w:val="left" w:pos="1440"/>
+        </w:tabs>
+      </w:pPr>
+    </w:p>
+    <w:p>
+      <w:pPr>
+        <w:tabs>
+          <w:tab w:val="left" w:pos="1440"/>
+        </w:tabs>
+      </w:pPr>
+      <w:r>
+        <w:rPr>
+          <w:noProof/>
+        </w:rPr>
+        <w:drawing>
+          <wp:anchor distT="0" distB="0" distL="114300" distR="114300" simplePos="0" relativeHeight="251660288" behindDoc="0" locked="0" layoutInCell="1" allowOverlap="1" wp14:anchorId="1B21A846" wp14:editId="0FA10284">
+            <wp:simplePos x="0" y="0"/>
+            <wp:positionH relativeFrom="column">
+              <wp:posOffset>-1678940</wp:posOffset>
+            </wp:positionH>
+            <wp:positionV relativeFrom="paragraph">
+              <wp:posOffset>405130</wp:posOffset>
+            </wp:positionV>
+            <wp:extent cx="7197090" cy="3286125"/>
+            <wp:effectExtent l="0" t="6668" r="0" b="0"/>
+            <wp:wrapSquare wrapText="bothSides"/>
+            <wp:docPr id="1181908208" name="Picture 5"/>
+            <wp:cNvGraphicFramePr>
+              <a:graphicFrameLocks xmlns:a="http://schemas.openxmlformats.org/drawingml/2006/main" noChangeAspect="1"/>
+            </wp:cNvGraphicFramePr>
+            <a:graphic xmlns:a="http://schemas.openxmlformats.org/drawingml/2006/main">
+              <a:graphicData uri="http://schemas.openxmlformats.org/drawingml/2006/picture">
+                <pic:pic xmlns:pic="http://schemas.openxmlformats.org/drawingml/2006/picture">
+                  <pic:nvPicPr>
+                    <pic:cNvPr id="1181908208" name="Picture 1181908208"/>
+                    <pic:cNvPicPr/>
+                  </pic:nvPicPr>
+                  <pic:blipFill>
+                    <a:blip r:embed="rId10">
+                      <a:extLst>
+                        <a:ext uri="{28A0092B-C50C-407E-A947-70E740481C1C}">
+                          <a14:useLocalDpi xmlns:a14="http://schemas.microsoft.com/office/drawing/2010/main" val="0"/>
+                        </a:ext>
+                      </a:extLst>
+                    </a:blip>
+                    <a:stretch>
+                      <a:fillRect/>
+                    </a:stretch>
+                  </pic:blipFill>
+                  <pic:spPr>
+                    <a:xfrm rot="16200000">
+                      <a:off x="0" y="0"/>
+                      <a:ext cx="7197090" cy="3286125"/>
+                    </a:xfrm>
+                    <a:prstGeom prst="rect">
+                      <a:avLst/>
+                    </a:prstGeom>
+                  </pic:spPr>
+                </pic:pic>
+              </a:graphicData>
+            </a:graphic>
+            <wp14:sizeRelH relativeFrom="margin">
+              <wp14:pctWidth>0</wp14:pctWidth>
+            </wp14:sizeRelH>
+            <wp14:sizeRelV relativeFrom="margin">
+              <wp14:pctHeight>0</wp14:pctHeight>
+            </wp14:sizeRelV>
+          </wp:anchor>
+        </w:drawing>
+      </w:r>
+    </w:p>
+    <w:p>
+      <w:pPr>
+        <w:tabs>
+          <w:tab w:val="left" w:pos="1440"/>
+        </w:tabs>
+      </w:pPr>
+    </w:p>
+    <w:p>
+      <w:pPr>
+        <w:tabs>
+          <w:tab w:val="left" w:pos="1440"/>
+        </w:tabs>
+      </w:pPr>
+    </w:p>
+    <w:p>
+      <w:pPr>
+        <w:tabs>
+          <w:tab w:val="left" w:pos="1440"/>
+        </w:tabs>
+      </w:pPr>
+    </w:p>
+    <w:p>
+      <w:pPr>
+        <w:tabs>
+          <w:tab w:val="left" w:pos="1440"/>
+        </w:tabs>
+      </w:pPr>
+    </w:p>
+    <w:p>
+      <w:pPr>
+        <w:tabs>
+          <w:tab w:val="left" w:pos="1440"/>
+        </w:tabs>
+      </w:pPr>
+    </w:p>
+    <w:p>
+      <w:pPr>
+        <w:tabs>
+          <w:tab w:val="left" w:pos="1440"/>
+        </w:tabs>
+      </w:pPr>
+    </w:p>
+    <w:p>
+      <w:pPr>
+        <w:tabs>
+          <w:tab w:val="left" w:pos="1440"/>
+        </w:tabs>
+      </w:pPr>
+    </w:p>
+    <w:p>
+      <w:pPr>
+        <w:tabs>
+          <w:tab w:val="left" w:pos="1440"/>
+        </w:tabs>
+      </w:pPr>
+    </w:p>
+    <w:p>
+      <w:pPr>
+        <w:tabs>
+          <w:tab w:val="left" w:pos="1440"/>
+        </w:tabs>
+      </w:pPr>
+    </w:p>
+    <w:p>
+      <w:pPr>
+        <w:tabs>
+          <w:tab w:val="left" w:pos="1440"/>
+        </w:tabs>
+      </w:pPr>
+    </w:p>
+    <w:p>
+      <w:pPr>
+        <w:tabs>
+          <w:tab w:val="left" w:pos="1440"/>
+        </w:tabs>
+      </w:pPr>
+    </w:p>
+    <w:p>
+      <w:pPr>
+        <w:tabs>
+          <w:tab w:val="left" w:pos="1440"/>
+        </w:tabs>
+      </w:pPr>
+    </w:p>
+    <w:p>
+      <w:pPr>
+        <w:tabs>
+          <w:tab w:val="left" w:pos="1440"/>
+        </w:tabs>
+      </w:pPr>
+    </w:p>
+    <w:p>
+      <w:pPr>
+        <w:tabs>
+          <w:tab w:val="left" w:pos="1440"/>
+        </w:tabs>
+      </w:pPr>
+    </w:p>
+    <w:p>
+      <w:pPr>
+        <w:tabs>
+          <w:tab w:val="left" w:pos="1440"/>
+        </w:tabs>
+      </w:pPr>
+    </w:p>
+    <w:p>
+      <w:pPr>
+        <w:tabs>
+          <w:tab w:val="left" w:pos="1440"/>
+        </w:tabs>
+      </w:pPr>
+    </w:p>
+    <w:p>
+      <w:pPr>
+        <w:tabs>
+          <w:tab w:val="left" w:pos="1440"/>
+        </w:tabs>
+      </w:pPr>
+    </w:p>
+    <w:p>
+      <w:pPr>
+        <w:tabs>
+          <w:tab w:val="left" w:pos="1440"/>
+        </w:tabs>
+      </w:pPr>
+    </w:p>
+    <w:p>
+      <w:pPr>
+        <w:tabs>
+          <w:tab w:val="left" w:pos="1440"/>
+        </w:tabs>
+      </w:pPr>
+    </w:p>
+    <w:p>
+      <w:pPr>
+        <w:tabs>
+          <w:tab w:val="left" w:pos="1440"/>
+        </w:tabs>
+      </w:pPr>
+    </w:p>
+    <w:p>
+      <w:pPr>
+        <w:tabs>
+          <w:tab w:val="left" w:pos="1440"/>
+        </w:tabs>
+      </w:pPr>
+    </w:p>
+    <w:p>
+      <w:pPr>
+        <w:tabs>
+          <w:tab w:val="left" w:pos="1440"/>
+        </w:tabs>
+      </w:pPr>
+    </w:p>
+    <w:p>
+      <w:pPr>
+        <w:tabs>
+          <w:tab w:val="left" w:pos="1440"/>
+        </w:tabs>
+      </w:pPr>
+    </w:p>
+    <w:p>
+      <w:pPr>
+        <w:tabs>
+          <w:tab w:val="left" w:pos="1440"/>
+        </w:tabs>
+      </w:pPr>
+    </w:p>
+    <w:p>
+      <w:pPr>
+        <w:tabs>
+          <w:tab w:val="left" w:pos="1440"/>
+        </w:tabs>
+      </w:pPr>
+    </w:p>
+    <w:p>
+      <w:pPr>
+        <w:tabs>
+          <w:tab w:val="left" w:pos="1440"/>
+        </w:tabs>
+      </w:pPr>
+    </w:p>
+    <w:p>
+      <w:pPr>
+        <w:tabs>
+          <w:tab w:val="left" w:pos="1440"/>
+        </w:tabs>
+      </w:pPr>
+      <w:r>
+        <w:rPr>
+          <w:b/>
+          <w:bCs/>
+          <w:sz w:val="22"/>
+          <w:szCs w:val="22"/>
+        </w:rPr>
+        <w:lastRenderedPageBreak/>
+        <w:t xml:space="preserve">Question </w:t>
+      </w:r>
+      <w:r>
+        <w:rPr>
+          <w:b/>
+          <w:bCs/>
+          <w:sz w:val="22"/>
+          <w:szCs w:val="22"/>
+        </w:rPr>
+        <w:t>5</w:t>
+      </w:r>
+      <w:r>
+        <w:rPr>
+          <w:b/>
+          <w:bCs/>
+          <w:sz w:val="22"/>
+          <w:szCs w:val="22"/>
+        </w:rPr>
+        <w:t>.</w:t>
+      </w:r>
+      <w:r>
+        <w:rPr>
+          <w:b/>
+          <w:bCs/>
+          <w:sz w:val="22"/>
+          <w:szCs w:val="22"/>
+        </w:rPr>
+        <w:t>3</w:t>
+      </w:r>
+    </w:p>
+    <w:p>
+      <w:pPr>
+        <w:tabs>
+          <w:tab w:val="left" w:pos="1440"/>
+        </w:tabs>
+      </w:pPr>
+    </w:p>
+    <w:p>
+      <w:pPr>
+        <w:tabs>
+          <w:tab w:val="left" w:pos="1440"/>
+        </w:tabs>
+      </w:pPr>
+    </w:p>
+    <w:p>
+      <w:pPr>
+        <w:tabs>
+          <w:tab w:val="left" w:pos="1440"/>
+        </w:tabs>
+      </w:pPr>
+    </w:p>
+    <w:p>
+      <w:pPr>
+        <w:tabs>
+          <w:tab w:val="left" w:pos="1440"/>
+        </w:tabs>
+      </w:pPr>
+      <w:r>
+        <w:rPr>
+          <w:noProof/>
+        </w:rPr>
+        <w:drawing>
+          <wp:anchor distT="0" distB="0" distL="114300" distR="114300" simplePos="0" relativeHeight="251661312" behindDoc="0" locked="0" layoutInCell="1" allowOverlap="1" wp14:anchorId="5867CF0C" wp14:editId="40353151">
+            <wp:simplePos x="0" y="0"/>
+            <wp:positionH relativeFrom="column">
+              <wp:posOffset>-2293620</wp:posOffset>
+            </wp:positionH>
+            <wp:positionV relativeFrom="paragraph">
+              <wp:posOffset>1848485</wp:posOffset>
+            </wp:positionV>
+            <wp:extent cx="7730490" cy="3315335"/>
+            <wp:effectExtent l="0" t="2223" r="1588" b="1587"/>
+            <wp:wrapSquare wrapText="bothSides"/>
+            <wp:docPr id="782299131" name="Picture 6"/>
+            <wp:cNvGraphicFramePr>
+              <a:graphicFrameLocks xmlns:a="http://schemas.openxmlformats.org/drawingml/2006/main" noChangeAspect="1"/>
+            </wp:cNvGraphicFramePr>
+            <a:graphic xmlns:a="http://schemas.openxmlformats.org/drawingml/2006/main">
+              <a:graphicData uri="http://schemas.openxmlformats.org/drawingml/2006/picture">
+                <pic:pic xmlns:pic="http://schemas.openxmlformats.org/drawingml/2006/picture">
+                  <pic:nvPicPr>
+                    <pic:cNvPr id="782299131" name="Picture 782299131"/>
+                    <pic:cNvPicPr/>
+                  </pic:nvPicPr>
+                  <pic:blipFill>
+                    <a:blip r:embed="rId11" cstate="print">
+                      <a:extLst>
+                        <a:ext uri="{28A0092B-C50C-407E-A947-70E740481C1C}">
+                          <a14:useLocalDpi xmlns:a14="http://schemas.microsoft.com/office/drawing/2010/main" val="0"/>
+                        </a:ext>
+                      </a:extLst>
+                    </a:blip>
+                    <a:stretch>
+                      <a:fillRect/>
+                    </a:stretch>
+                  </pic:blipFill>
+                  <pic:spPr>
+                    <a:xfrm rot="16200000">
+                      <a:off x="0" y="0"/>
+                      <a:ext cx="7730490" cy="3315335"/>
+                    </a:xfrm>
+                    <a:prstGeom prst="rect">
+                      <a:avLst/>
+                    </a:prstGeom>
+                  </pic:spPr>
+                </pic:pic>
+              </a:graphicData>
+            </a:graphic>
+            <wp14:sizeRelH relativeFrom="margin">
+              <wp14:pctWidth>0</wp14:pctWidth>
+            </wp14:sizeRelH>
+            <wp14:sizeRelV relativeFrom="margin">
+              <wp14:pctHeight>0</wp14:pctHeight>
+            </wp14:sizeRelV>
+          </wp:anchor>
+        </w:drawing>
+      </w:r>
+    </w:p>
+    <w:p/>
+    <w:p/>
+    <w:p/>
+    <w:p/>
+    <w:p/>
+    <w:p/>
+    <w:p/>
+    <w:p/>
+    <w:p/>
+    <w:p/>
+    <w:p/>
+    <w:p/>
+    <w:p/>
+    <w:p/>
+    <w:p/>
+    <w:p/>
+    <w:p/>
+    <w:p/>
+    <w:p/>
+    <w:p/>
+    <w:p/>
+    <w:p/>
+    <w:p/>
+    <w:p/>
+    <w:p/>
+    <w:p/>
+    <w:p/>
+    <w:p/>
+    <w:p/>
+    <w:p>
+      <w:pPr>
+        <w:tabs>
+          <w:tab w:val="left" w:pos="5640"/>
+        </w:tabs>
+      </w:pPr>
+      <w:r>
+        <w:tab/>
+      </w:r>
+    </w:p>
+    <w:p>
+      <w:pPr>
+        <w:tabs>
+          <w:tab w:val="left" w:pos="5640"/>
+        </w:tabs>
+      </w:pPr>
+    </w:p>
+    <w:p>
+      <w:pPr>
+        <w:tabs>
+          <w:tab w:val="left" w:pos="1440"/>
+        </w:tabs>
+      </w:pPr>
+      <w:r>
+        <w:rPr>
+          <w:b/>
+          <w:bCs/>
+          <w:sz w:val="22"/>
+          <w:szCs w:val="22"/>
+        </w:rPr>
+        <w:lastRenderedPageBreak/>
+        <w:t xml:space="preserve">Question </w:t>
+      </w:r>
+      <w:r>
+        <w:rPr>
+          <w:b/>
+          <w:bCs/>
+          <w:sz w:val="22"/>
+          <w:szCs w:val="22"/>
+        </w:rPr>
+        <w:t>5</w:t>
+      </w:r>
+      <w:r>
+        <w:rPr>
+          <w:b/>
+          <w:bCs/>
+          <w:sz w:val="22"/>
+          <w:szCs w:val="22"/>
+        </w:rPr>
+        <w:t>.</w:t>
+      </w:r>
+      <w:r>
+        <w:rPr>
+          <w:b/>
+          <w:bCs/>
+          <w:sz w:val="22"/>
+          <w:szCs w:val="22"/>
+        </w:rPr>
+        <w:t>4</w:t>
+      </w:r>
+    </w:p>
+    <w:p>
+      <w:pPr>
+        <w:tabs>
+          <w:tab w:val="left" w:pos="5640"/>
+        </w:tabs>
+      </w:pPr>
+    </w:p>
+    <w:p>
+      <w:pPr>
+        <w:tabs>
+          <w:tab w:val="left" w:pos="5640"/>
+        </w:tabs>
+      </w:pPr>
+      <w:r>
+        <w:rPr>
+          <w:noProof/>
+        </w:rPr>
+        <w:drawing>
+          <wp:anchor distT="0" distB="0" distL="114300" distR="114300" simplePos="0" relativeHeight="251662336" behindDoc="0" locked="0" layoutInCell="1" allowOverlap="1" wp14:anchorId="77408D56" wp14:editId="4ADA9FE7">
+            <wp:simplePos x="0" y="0"/>
+            <wp:positionH relativeFrom="column">
+              <wp:posOffset>-1788160</wp:posOffset>
+            </wp:positionH>
+            <wp:positionV relativeFrom="paragraph">
+              <wp:posOffset>1601470</wp:posOffset>
+            </wp:positionV>
+            <wp:extent cx="8514715" cy="4891405"/>
+            <wp:effectExtent l="1905" t="0" r="2540" b="2540"/>
+            <wp:wrapSquare wrapText="bothSides"/>
+            <wp:docPr id="236783365" name="Picture 7"/>
+            <wp:cNvGraphicFramePr>
+              <a:graphicFrameLocks xmlns:a="http://schemas.openxmlformats.org/drawingml/2006/main" noChangeAspect="1"/>
+            </wp:cNvGraphicFramePr>
+            <a:graphic xmlns:a="http://schemas.openxmlformats.org/drawingml/2006/main">
+              <a:graphicData uri="http://schemas.openxmlformats.org/drawingml/2006/picture">
+                <pic:pic xmlns:pic="http://schemas.openxmlformats.org/drawingml/2006/picture">
+                  <pic:nvPicPr>
+                    <pic:cNvPr id="236783365" name="Picture 236783365"/>
+                    <pic:cNvPicPr/>
+                  </pic:nvPicPr>
+                  <pic:blipFill>
+                    <a:blip r:embed="rId12" cstate="print">
+                      <a:extLst>
+                        <a:ext uri="{28A0092B-C50C-407E-A947-70E740481C1C}">
+                          <a14:useLocalDpi xmlns:a14="http://schemas.microsoft.com/office/drawing/2010/main" val="0"/>
+                        </a:ext>
+                      </a:extLst>
+                    </a:blip>
+                    <a:stretch>
+                      <a:fillRect/>
+                    </a:stretch>
+                  </pic:blipFill>
+                  <pic:spPr>
+                    <a:xfrm rot="16200000">
+                      <a:off x="0" y="0"/>
+                      <a:ext cx="8514715" cy="4891405"/>
+                    </a:xfrm>
+                    <a:prstGeom prst="rect">
+                      <a:avLst/>
+                    </a:prstGeom>
+                  </pic:spPr>
+                </pic:pic>
+              </a:graphicData>
+            </a:graphic>
+            <wp14:sizeRelH relativeFrom="margin">
+              <wp14:pctWidth>0</wp14:pctWidth>
+            </wp14:sizeRelH>
+            <wp14:sizeRelV relativeFrom="margin">
+              <wp14:pctHeight>0</wp14:pctHeight>
+            </wp14:sizeRelV>
+          </wp:anchor>
+        </w:drawing>
+      </w:r>
+    </w:p>
     <w:sectPr>
-      <w:headerReference w:type="default" r:id="rId9"/>
-      <w:footerReference w:type="default" r:id="rId10"/>
+      <w:headerReference w:type="default" r:id="rId13"/>
+      <w:footerReference w:type="default" r:id="rId14"/>
       <w:pgSz w:w="11906" w:h="16838"/>
       <w:pgMar w:top="1440" w:right="1440" w:bottom="1440" w:left="1440" w:header="708" w:footer="708" w:gutter="0"/>
       <w:cols w:space="708"/>
@@ -2562,7 +3636,6 @@
                                 <w:dataBinding w:prefixMappings="xmlns:ns0='http://purl.org/dc/elements/1.1/' xmlns:ns1='http://schemas.openxmlformats.org/package/2006/metadata/core-properties' " w:xpath="/ns1:coreProperties[1]/ns0:title[1]" w:storeItemID="{6C3C8BC8-F283-45AE-878A-BAB7291924A1}"/>
                                 <w:text/>
                               </w:sdtPr>
-                              <w:sdtEndPr/>
                               <w:sdtContent>
                                 <w:r>
                                   <w:rPr>
@@ -2598,7 +3671,6 @@
                                 <w:dataBinding w:prefixMappings="xmlns:ns0='http://purl.org/dc/elements/1.1/' xmlns:ns1='http://schemas.openxmlformats.org/package/2006/metadata/core-properties' " w:xpath="/ns1:coreProperties[1]/ns0:subject[1]" w:storeItemID="{6C3C8BC8-F283-45AE-878A-BAB7291924A1}"/>
                                 <w:text/>
                               </w:sdtPr>
-                              <w:sdtEndPr/>
                               <w:sdtContent>
                                 <w:r>
                                   <w:rPr>
@@ -2628,16 +3700,8 @@
                                   <w:rPr>
                                     <w:color w:val="808080" w:themeColor="background1" w:themeShade="80"/>
                                   </w:rPr>
-                                  <w:t xml:space="preserve"> &amp; Thabo </w:t>
+                                  <w:t xml:space="preserve"> &amp; Thabo Ngwabi</w:t>
                                 </w:r>
-                                <w:proofErr w:type="spellStart"/>
-                                <w:r>
-                                  <w:rPr>
-                                    <w:color w:val="808080" w:themeColor="background1" w:themeShade="80"/>
-                                  </w:rPr>
-                                  <w:t>Ngwabi</w:t>
-                                </w:r>
-                                <w:proofErr w:type="spellEnd"/>
                               </w:sdtContent>
                             </w:sdt>
                           </w:p>
@@ -2686,7 +3750,6 @@
                           <w:dataBinding w:prefixMappings="xmlns:ns0='http://purl.org/dc/elements/1.1/' xmlns:ns1='http://schemas.openxmlformats.org/package/2006/metadata/core-properties' " w:xpath="/ns1:coreProperties[1]/ns0:title[1]" w:storeItemID="{6C3C8BC8-F283-45AE-878A-BAB7291924A1}"/>
                           <w:text/>
                         </w:sdtPr>
-                        <w:sdtEndPr/>
                         <w:sdtContent>
                           <w:r>
                             <w:rPr>
@@ -2722,7 +3785,6 @@
                           <w:dataBinding w:prefixMappings="xmlns:ns0='http://purl.org/dc/elements/1.1/' xmlns:ns1='http://schemas.openxmlformats.org/package/2006/metadata/core-properties' " w:xpath="/ns1:coreProperties[1]/ns0:subject[1]" w:storeItemID="{6C3C8BC8-F283-45AE-878A-BAB7291924A1}"/>
                           <w:text/>
                         </w:sdtPr>
-                        <w:sdtEndPr/>
                         <w:sdtContent>
                           <w:r>
                             <w:rPr>
@@ -2752,16 +3814,8 @@
                             <w:rPr>
                               <w:color w:val="808080" w:themeColor="background1" w:themeShade="80"/>
                             </w:rPr>
-                            <w:t xml:space="preserve"> &amp; Thabo </w:t>
+                            <w:t xml:space="preserve"> &amp; Thabo Ngwabi</w:t>
                           </w:r>
-                          <w:proofErr w:type="spellStart"/>
-                          <w:r>
-                            <w:rPr>
-                              <w:color w:val="808080" w:themeColor="background1" w:themeShade="80"/>
-                            </w:rPr>
-                            <w:t>Ngwabi</w:t>
-                          </w:r>
-                          <w:proofErr w:type="spellEnd"/>
                         </w:sdtContent>
                       </w:sdt>
                     </w:p>
@@ -2878,7 +3932,6 @@
                             <w:dataBinding w:prefixMappings="xmlns:ns0='http://purl.org/dc/elements/1.1/' xmlns:ns1='http://schemas.openxmlformats.org/package/2006/metadata/core-properties' " w:xpath="/ns1:coreProperties[1]/ns0:title[1]" w:storeItemID="{6C3C8BC8-F283-45AE-878A-BAB7291924A1}"/>
                             <w:text/>
                           </w:sdtPr>
-                          <w:sdtEndPr/>
                           <w:sdtContent>
                             <w:p>
                               <w:pPr>
@@ -2936,7 +3989,6 @@
                       <w:dataBinding w:prefixMappings="xmlns:ns0='http://purl.org/dc/elements/1.1/' xmlns:ns1='http://schemas.openxmlformats.org/package/2006/metadata/core-properties' " w:xpath="/ns1:coreProperties[1]/ns0:title[1]" w:storeItemID="{6C3C8BC8-F283-45AE-878A-BAB7291924A1}"/>
                       <w:text/>
                     </w:sdtPr>
-                    <w:sdtEndPr/>
                     <w:sdtContent>
                       <w:p>
                         <w:pPr>
@@ -5448,7 +6500,7 @@
   <w:style w:type="paragraph" w:default="1" w:styleId="Normal">
     <w:name w:val="Normal"/>
     <w:qFormat/>
-    <w:rsid w:val="004647DD"/>
+    <w:rsid w:val="00031333"/>
   </w:style>
   <w:style w:type="paragraph" w:styleId="Heading1">
     <w:name w:val="heading 1"/>
@@ -5662,6 +6714,7 @@
   <w:style w:type="character" w:default="1" w:styleId="DefaultParagraphFont">
     <w:name w:val="Default Paragraph Font"/>
     <w:uiPriority w:val="1"/>
+    <w:semiHidden/>
     <w:unhideWhenUsed/>
   </w:style>
   <w:style w:type="table" w:default="1" w:styleId="TableNormal">

</xml_diff>

<commit_message>
Updated  SD4 on the word document
</commit_message>
<xml_diff>
--- a/docs/COS214_Prac3.docx
+++ b/docs/COS214_Prac3.docx
@@ -1,6 +1,6 @@
 
 <file path=word/document.xml><?xml version="1.0" encoding="utf-8"?>
-<w:document xmlns:wpc="http://schemas.microsoft.com/office/word/2010/wordprocessingCanvas" xmlns:cx="http://schemas.microsoft.com/office/drawing/2014/chartex" xmlns:cx1="http://schemas.microsoft.com/office/drawing/2015/9/8/chartex" xmlns:cx2="http://schemas.microsoft.com/office/drawing/2015/10/21/chartex" xmlns:cx3="http://schemas.microsoft.com/office/drawing/2016/5/9/chartex" xmlns:cx4="http://schemas.microsoft.com/office/drawing/2016/5/10/chartex" xmlns:cx5="http://schemas.microsoft.com/office/drawing/2016/5/11/chartex" xmlns:cx6="http://schemas.microsoft.com/office/drawing/2016/5/12/chartex" xmlns:cx7="http://schemas.microsoft.com/office/drawing/2016/5/13/chartex" xmlns:cx8="http://schemas.microsoft.com/office/drawing/2016/5/14/chartex" xmlns:mc="http://schemas.openxmlformats.org/markup-compatibility/2006" xmlns:aink="http://schemas.microsoft.com/office/drawing/2016/ink" xmlns:am3d="http://schemas.microsoft.com/office/drawing/2017/model3d" xmlns:o="urn:schemas-microsoft-com:office:office" xmlns:oel="http://schemas.microsoft.com/office/2019/extlst" xmlns:r="http://schemas.openxmlformats.org/officeDocument/2006/relationships" xmlns:m="http://schemas.openxmlformats.org/officeDocument/2006/math" xmlns:v="urn:schemas-microsoft-com:vml" xmlns:wp14="http://schemas.microsoft.com/office/word/2010/wordprocessingDrawing" xmlns:wp="http://schemas.openxmlformats.org/drawingml/2006/wordprocessingDrawing" xmlns:w10="urn:schemas-microsoft-com:office:word" xmlns:w="http://schemas.openxmlformats.org/wordprocessingml/2006/main" xmlns:w14="http://schemas.microsoft.com/office/word/2010/wordml" xmlns:w15="http://schemas.microsoft.com/office/word/2012/wordml" xmlns:w16cex="http://schemas.microsoft.com/office/word/2018/wordml/cex" xmlns:w16cid="http://schemas.microsoft.com/office/word/2016/wordml/cid" xmlns:w16="http://schemas.microsoft.com/office/word/2018/wordml" xmlns:w16du="http://schemas.microsoft.com/office/word/2023/wordml/word16du" xmlns:w16sdtdh="http://schemas.microsoft.com/office/word/2020/wordml/sdtdatahash" xmlns:w16sdtfl="http://schemas.microsoft.com/office/word/2024/wordml/sdtformatlock" xmlns:w16se="http://schemas.microsoft.com/office/word/2015/wordml/symex" xmlns:wpg="http://schemas.microsoft.com/office/word/2010/wordprocessingGroup" xmlns:wpi="http://schemas.microsoft.com/office/word/2010/wordprocessingInk" xmlns:wne="http://schemas.microsoft.com/office/word/2006/wordml" xmlns:wps="http://schemas.microsoft.com/office/word/2010/wordprocessingShape" mc:Ignorable="w14 w15 w16se w16cid w16 w16cex w16sdtdh w16sdtfl w16du wp14">
+<w:document xmlns:wpc="http://schemas.microsoft.com/office/word/2010/wordprocessingCanvas" xmlns:cx="http://schemas.microsoft.com/office/drawing/2014/chartex" xmlns:cx1="http://schemas.microsoft.com/office/drawing/2015/9/8/chartex" xmlns:cx2="http://schemas.microsoft.com/office/drawing/2015/10/21/chartex" xmlns:cx3="http://schemas.microsoft.com/office/drawing/2016/5/9/chartex" xmlns:cx4="http://schemas.microsoft.com/office/drawing/2016/5/10/chartex" xmlns:cx5="http://schemas.microsoft.com/office/drawing/2016/5/11/chartex" xmlns:cx6="http://schemas.microsoft.com/office/drawing/2016/5/12/chartex" xmlns:cx7="http://schemas.microsoft.com/office/drawing/2016/5/13/chartex" xmlns:cx8="http://schemas.microsoft.com/office/drawing/2016/5/14/chartex" xmlns:mc="http://schemas.openxmlformats.org/markup-compatibility/2006" xmlns:aink="http://schemas.microsoft.com/office/drawing/2016/ink" xmlns:am3d="http://schemas.microsoft.com/office/drawing/2017/model3d" xmlns:o="urn:schemas-microsoft-com:office:office" xmlns:oel="http://schemas.microsoft.com/office/2019/extlst" xmlns:r="http://schemas.openxmlformats.org/officeDocument/2006/relationships" xmlns:m="http://schemas.openxmlformats.org/officeDocument/2006/math" xmlns:v="urn:schemas-microsoft-com:vml" xmlns:wp14="http://schemas.microsoft.com/office/word/2010/wordprocessingDrawing" xmlns:wp="http://schemas.openxmlformats.org/drawingml/2006/wordprocessingDrawing" xmlns:w10="urn:schemas-microsoft-com:office:word" xmlns:w="http://schemas.openxmlformats.org/wordprocessingml/2006/main" xmlns:w14="http://schemas.microsoft.com/office/word/2010/wordml" xmlns:w15="http://schemas.microsoft.com/office/word/2012/wordml" xmlns:w16cei="http://schemas.microsoft.com/office/word/2026/wordml/cei" xmlns:w16cex="http://schemas.microsoft.com/office/word/2018/wordml/cex" xmlns:w16cid="http://schemas.microsoft.com/office/word/2016/wordml/cid" xmlns:w16="http://schemas.microsoft.com/office/word/2018/wordml" xmlns:w16du="http://schemas.microsoft.com/office/word/2023/wordml/word16du" xmlns:w16sdtdh="http://schemas.microsoft.com/office/word/2020/wordml/sdtdatahash" xmlns:w16sdtfl="http://schemas.microsoft.com/office/word/2024/wordml/sdtformatlock" xmlns:w16se="http://schemas.microsoft.com/office/word/2015/wordml/symex" xmlns:wpg="http://schemas.microsoft.com/office/word/2010/wordprocessingGroup" xmlns:wpi="http://schemas.microsoft.com/office/word/2010/wordprocessingInk" xmlns:wne="http://schemas.microsoft.com/office/word/2006/wordml" xmlns:wps="http://schemas.microsoft.com/office/word/2010/wordprocessingShape" mc:Ignorable="w14 w15 w16se w16cid w16 w16cex w16sdtdh w16sdtfl w16du wp14">
   <w:body>
     <w:p>
       <w:pPr>
@@ -610,7 +610,7 @@
           <w:noProof/>
         </w:rPr>
         <w:drawing>
-          <wp:anchor distT="0" distB="0" distL="114300" distR="114300" simplePos="0" relativeHeight="251658240" behindDoc="0" locked="0" layoutInCell="1" allowOverlap="1" wp14:anchorId="2C20E90C" wp14:editId="66423131">
+          <wp:anchor distT="0" distB="0" distL="114300" distR="114300" simplePos="0" relativeHeight="251658240" behindDoc="0" locked="0" layoutInCell="1" allowOverlap="1" wp14:anchorId="2C20E90C" wp14:editId="53A1CEBB">
             <wp:simplePos x="0" y="0"/>
             <wp:positionH relativeFrom="margin">
               <wp:align>center</wp:align>
@@ -878,10 +878,7 @@
         <w:pStyle w:val="Heading1"/>
       </w:pPr>
       <w:r>
-        <w:t xml:space="preserve">TASK </w:t>
-      </w:r>
-      <w:r>
-        <w:t>2</w:t>
+        <w:t>TASK 2</w:t>
       </w:r>
     </w:p>
     <w:p>
@@ -1159,11 +1156,11 @@
       </w:r>
       <w:proofErr w:type="gramStart"/>
       <w:r>
-        <w:t>Subject::</w:t>
+        <w:t>Subject::notify(</w:t>
       </w:r>
       <w:proofErr w:type="gramEnd"/>
       <w:r>
-        <w:t xml:space="preserve">notify() is triggered, the subject passes a fully instantiated </w:t>
+        <w:t xml:space="preserve">) is triggered, the subject passes a fully instantiated </w:t>
       </w:r>
       <w:proofErr w:type="spellStart"/>
       <w:r>
@@ -1175,13 +1172,10 @@
       </w:r>
       <w:proofErr w:type="gramStart"/>
       <w:r>
-        <w:t>Observer::</w:t>
-      </w:r>
+        <w:t>Observer::update(</w:t>
+      </w:r>
+      <w:proofErr w:type="spellStart"/>
       <w:proofErr w:type="gramEnd"/>
-      <w:r>
-        <w:t>update(</w:t>
-      </w:r>
-      <w:proofErr w:type="spellStart"/>
       <w:r>
         <w:t>const</w:t>
       </w:r>
@@ -2655,10 +2649,7 @@
       </w:pPr>
       <w:r>
         <w:lastRenderedPageBreak/>
-        <w:t xml:space="preserve">TASK </w:t>
-      </w:r>
-      <w:r>
-        <w:t>4</w:t>
+        <w:t>TASK 4</w:t>
       </w:r>
     </w:p>
     <w:p/>
@@ -3220,20 +3211,23 @@
         <w:t>::</w:t>
       </w:r>
       <w:proofErr w:type="spellStart"/>
+      <w:r>
+        <w:t>attendeeLeaves</w:t>
+      </w:r>
+      <w:proofErr w:type="spellEnd"/>
+      <w:r>
+        <w:t>(</w:t>
+      </w:r>
       <w:proofErr w:type="gramEnd"/>
       <w:r>
-        <w:t>attendeeLeaves</w:t>
+        <w:t xml:space="preserve">) so that the stage's </w:t>
+      </w:r>
+      <w:proofErr w:type="spellStart"/>
+      <w:r>
+        <w:t>currentOccupancy</w:t>
       </w:r>
       <w:proofErr w:type="spellEnd"/>
       <w:r>
-        <w:t xml:space="preserve">() so that the stage's </w:t>
-      </w:r>
-      <w:proofErr w:type="spellStart"/>
-      <w:r>
-        <w:t>currentOccupancy</w:t>
-      </w:r>
-      <w:proofErr w:type="spellEnd"/>
-      <w:r>
         <w:t xml:space="preserve"> is reduced correctly.</w:t>
       </w:r>
     </w:p>
@@ -3413,10 +3407,7 @@
       </w:pPr>
       <w:r>
         <w:lastRenderedPageBreak/>
-        <w:t xml:space="preserve">TASK </w:t>
-      </w:r>
-      <w:r>
-        <w:t>5</w:t>
+        <w:t>TASK 5</w:t>
       </w:r>
     </w:p>
     <w:p>
@@ -4108,7 +4099,7 @@
           <w:noProof/>
         </w:rPr>
         <w:drawing>
-          <wp:anchor distT="0" distB="0" distL="114300" distR="114300" simplePos="0" relativeHeight="251661312" behindDoc="0" locked="0" layoutInCell="1" allowOverlap="1" wp14:anchorId="5867CF0C" wp14:editId="20C55ECD">
+          <wp:anchor distT="0" distB="0" distL="114300" distR="114300" simplePos="0" relativeHeight="251661312" behindDoc="0" locked="0" layoutInCell="1" allowOverlap="1" wp14:anchorId="5867CF0C" wp14:editId="3614B649">
             <wp:simplePos x="0" y="0"/>
             <wp:positionH relativeFrom="margin">
               <wp:align>left</wp:align>
@@ -4295,16 +4286,16 @@
           <w:noProof/>
         </w:rPr>
         <w:drawing>
-          <wp:anchor distT="0" distB="0" distL="114300" distR="114300" simplePos="0" relativeHeight="251662336" behindDoc="0" locked="0" layoutInCell="1" allowOverlap="1" wp14:anchorId="77408D56" wp14:editId="077C3E50">
+          <wp:anchor distT="0" distB="0" distL="114300" distR="114300" simplePos="0" relativeHeight="251662336" behindDoc="0" locked="0" layoutInCell="1" allowOverlap="1" wp14:anchorId="77408D56" wp14:editId="5CDA1998">
             <wp:simplePos x="0" y="0"/>
             <wp:positionH relativeFrom="margin">
-              <wp:posOffset>-1870710</wp:posOffset>
+              <wp:posOffset>-1865947</wp:posOffset>
             </wp:positionH>
             <wp:positionV relativeFrom="paragraph">
-              <wp:posOffset>277495</wp:posOffset>
+              <wp:posOffset>281769</wp:posOffset>
             </wp:positionV>
-            <wp:extent cx="8514715" cy="4891405"/>
-            <wp:effectExtent l="1905" t="0" r="2540" b="2540"/>
+            <wp:extent cx="8514715" cy="4887301"/>
+            <wp:effectExtent l="4128" t="0" r="4762" b="4763"/>
             <wp:wrapNone/>
             <wp:docPr id="236783365" name="Picture 7"/>
             <wp:cNvGraphicFramePr>
@@ -4314,7 +4305,7 @@
               <a:graphicData uri="http://schemas.openxmlformats.org/drawingml/2006/picture">
                 <pic:pic xmlns:pic="http://schemas.openxmlformats.org/drawingml/2006/picture">
                   <pic:nvPicPr>
-                    <pic:cNvPr id="236783365" name="Picture 236783365"/>
+                    <pic:cNvPr id="236783365" name="Picture 7"/>
                     <pic:cNvPicPr/>
                   </pic:nvPicPr>
                   <pic:blipFill>
@@ -4332,7 +4323,7 @@
                   <pic:spPr>
                     <a:xfrm rot="16200000">
                       <a:off x="0" y="0"/>
-                      <a:ext cx="8514715" cy="4891405"/>
+                      <a:ext cx="8514715" cy="4887301"/>
                     </a:xfrm>
                     <a:prstGeom prst="rect">
                       <a:avLst/>
@@ -4567,7 +4558,7 @@
 </file>
 
 <file path=word/endnotes.xml><?xml version="1.0" encoding="utf-8"?>
-<w:endnotes xmlns:wpc="http://schemas.microsoft.com/office/word/2010/wordprocessingCanvas" xmlns:cx="http://schemas.microsoft.com/office/drawing/2014/chartex" xmlns:cx1="http://schemas.microsoft.com/office/drawing/2015/9/8/chartex" xmlns:cx2="http://schemas.microsoft.com/office/drawing/2015/10/21/chartex" xmlns:cx3="http://schemas.microsoft.com/office/drawing/2016/5/9/chartex" xmlns:cx4="http://schemas.microsoft.com/office/drawing/2016/5/10/chartex" xmlns:cx5="http://schemas.microsoft.com/office/drawing/2016/5/11/chartex" xmlns:cx6="http://schemas.microsoft.com/office/drawing/2016/5/12/chartex" xmlns:cx7="http://schemas.microsoft.com/office/drawing/2016/5/13/chartex" xmlns:cx8="http://schemas.microsoft.com/office/drawing/2016/5/14/chartex" xmlns:mc="http://schemas.openxmlformats.org/markup-compatibility/2006" xmlns:aink="http://schemas.microsoft.com/office/drawing/2016/ink" xmlns:am3d="http://schemas.microsoft.com/office/drawing/2017/model3d" xmlns:o="urn:schemas-microsoft-com:office:office" xmlns:oel="http://schemas.microsoft.com/office/2019/extlst" xmlns:r="http://schemas.openxmlformats.org/officeDocument/2006/relationships" xmlns:m="http://schemas.openxmlformats.org/officeDocument/2006/math" xmlns:v="urn:schemas-microsoft-com:vml" xmlns:wp14="http://schemas.microsoft.com/office/word/2010/wordprocessingDrawing" xmlns:wp="http://schemas.openxmlformats.org/drawingml/2006/wordprocessingDrawing" xmlns:w10="urn:schemas-microsoft-com:office:word" xmlns:w="http://schemas.openxmlformats.org/wordprocessingml/2006/main" xmlns:w14="http://schemas.microsoft.com/office/word/2010/wordml" xmlns:w15="http://schemas.microsoft.com/office/word/2012/wordml" xmlns:w16cex="http://schemas.microsoft.com/office/word/2018/wordml/cex" xmlns:w16cid="http://schemas.microsoft.com/office/word/2016/wordml/cid" xmlns:w16="http://schemas.microsoft.com/office/word/2018/wordml" xmlns:w16du="http://schemas.microsoft.com/office/word/2023/wordml/word16du" xmlns:w16sdtdh="http://schemas.microsoft.com/office/word/2020/wordml/sdtdatahash" xmlns:w16sdtfl="http://schemas.microsoft.com/office/word/2024/wordml/sdtformatlock" xmlns:w16se="http://schemas.microsoft.com/office/word/2015/wordml/symex" xmlns:wpg="http://schemas.microsoft.com/office/word/2010/wordprocessingGroup" xmlns:wpi="http://schemas.microsoft.com/office/word/2010/wordprocessingInk" xmlns:wne="http://schemas.microsoft.com/office/word/2006/wordml" xmlns:wps="http://schemas.microsoft.com/office/word/2010/wordprocessingShape" mc:Ignorable="w14 w15 w16se w16cid w16 w16cex w16sdtdh w16sdtfl w16du wp14">
+<w:endnotes xmlns:wpc="http://schemas.microsoft.com/office/word/2010/wordprocessingCanvas" xmlns:cx="http://schemas.microsoft.com/office/drawing/2014/chartex" xmlns:cx1="http://schemas.microsoft.com/office/drawing/2015/9/8/chartex" xmlns:cx2="http://schemas.microsoft.com/office/drawing/2015/10/21/chartex" xmlns:cx3="http://schemas.microsoft.com/office/drawing/2016/5/9/chartex" xmlns:cx4="http://schemas.microsoft.com/office/drawing/2016/5/10/chartex" xmlns:cx5="http://schemas.microsoft.com/office/drawing/2016/5/11/chartex" xmlns:cx6="http://schemas.microsoft.com/office/drawing/2016/5/12/chartex" xmlns:cx7="http://schemas.microsoft.com/office/drawing/2016/5/13/chartex" xmlns:cx8="http://schemas.microsoft.com/office/drawing/2016/5/14/chartex" xmlns:mc="http://schemas.openxmlformats.org/markup-compatibility/2006" xmlns:aink="http://schemas.microsoft.com/office/drawing/2016/ink" xmlns:am3d="http://schemas.microsoft.com/office/drawing/2017/model3d" xmlns:o="urn:schemas-microsoft-com:office:office" xmlns:oel="http://schemas.microsoft.com/office/2019/extlst" xmlns:r="http://schemas.openxmlformats.org/officeDocument/2006/relationships" xmlns:m="http://schemas.openxmlformats.org/officeDocument/2006/math" xmlns:v="urn:schemas-microsoft-com:vml" xmlns:wp14="http://schemas.microsoft.com/office/word/2010/wordprocessingDrawing" xmlns:wp="http://schemas.openxmlformats.org/drawingml/2006/wordprocessingDrawing" xmlns:w10="urn:schemas-microsoft-com:office:word" xmlns:w="http://schemas.openxmlformats.org/wordprocessingml/2006/main" xmlns:w14="http://schemas.microsoft.com/office/word/2010/wordml" xmlns:w15="http://schemas.microsoft.com/office/word/2012/wordml" xmlns:w16cei="http://schemas.microsoft.com/office/word/2026/wordml/cei" xmlns:w16cex="http://schemas.microsoft.com/office/word/2018/wordml/cex" xmlns:w16cid="http://schemas.microsoft.com/office/word/2016/wordml/cid" xmlns:w16="http://schemas.microsoft.com/office/word/2018/wordml" xmlns:w16du="http://schemas.microsoft.com/office/word/2023/wordml/word16du" xmlns:w16sdtdh="http://schemas.microsoft.com/office/word/2020/wordml/sdtdatahash" xmlns:w16sdtfl="http://schemas.microsoft.com/office/word/2024/wordml/sdtformatlock" xmlns:w16se="http://schemas.microsoft.com/office/word/2015/wordml/symex" xmlns:wpg="http://schemas.microsoft.com/office/word/2010/wordprocessingGroup" xmlns:wpi="http://schemas.microsoft.com/office/word/2010/wordprocessingInk" xmlns:wne="http://schemas.microsoft.com/office/word/2006/wordml" xmlns:wps="http://schemas.microsoft.com/office/word/2010/wordprocessingShape" mc:Ignorable="w14 w15 w16se w16cid w16 w16cex w16sdtdh w16sdtfl w16du wp14">
   <w:endnote w:type="separator" w:id="-1">
     <w:p>
       <w:pPr>
@@ -4592,7 +4583,7 @@
 </file>
 
 <file path=word/footer1.xml><?xml version="1.0" encoding="utf-8"?>
-<w:ftr xmlns:wpc="http://schemas.microsoft.com/office/word/2010/wordprocessingCanvas" xmlns:cx="http://schemas.microsoft.com/office/drawing/2014/chartex" xmlns:cx1="http://schemas.microsoft.com/office/drawing/2015/9/8/chartex" xmlns:cx2="http://schemas.microsoft.com/office/drawing/2015/10/21/chartex" xmlns:cx3="http://schemas.microsoft.com/office/drawing/2016/5/9/chartex" xmlns:cx4="http://schemas.microsoft.com/office/drawing/2016/5/10/chartex" xmlns:cx5="http://schemas.microsoft.com/office/drawing/2016/5/11/chartex" xmlns:cx6="http://schemas.microsoft.com/office/drawing/2016/5/12/chartex" xmlns:cx7="http://schemas.microsoft.com/office/drawing/2016/5/13/chartex" xmlns:cx8="http://schemas.microsoft.com/office/drawing/2016/5/14/chartex" xmlns:mc="http://schemas.openxmlformats.org/markup-compatibility/2006" xmlns:aink="http://schemas.microsoft.com/office/drawing/2016/ink" xmlns:am3d="http://schemas.microsoft.com/office/drawing/2017/model3d" xmlns:o="urn:schemas-microsoft-com:office:office" xmlns:oel="http://schemas.microsoft.com/office/2019/extlst" xmlns:r="http://schemas.openxmlformats.org/officeDocument/2006/relationships" xmlns:m="http://schemas.openxmlformats.org/officeDocument/2006/math" xmlns:v="urn:schemas-microsoft-com:vml" xmlns:wp14="http://schemas.microsoft.com/office/word/2010/wordprocessingDrawing" xmlns:wp="http://schemas.openxmlformats.org/drawingml/2006/wordprocessingDrawing" xmlns:w10="urn:schemas-microsoft-com:office:word" xmlns:w="http://schemas.openxmlformats.org/wordprocessingml/2006/main" xmlns:w14="http://schemas.microsoft.com/office/word/2010/wordml" xmlns:w15="http://schemas.microsoft.com/office/word/2012/wordml" xmlns:w16cex="http://schemas.microsoft.com/office/word/2018/wordml/cex" xmlns:w16cid="http://schemas.microsoft.com/office/word/2016/wordml/cid" xmlns:w16="http://schemas.microsoft.com/office/word/2018/wordml" xmlns:w16du="http://schemas.microsoft.com/office/word/2023/wordml/word16du" xmlns:w16sdtdh="http://schemas.microsoft.com/office/word/2020/wordml/sdtdatahash" xmlns:w16sdtfl="http://schemas.microsoft.com/office/word/2024/wordml/sdtformatlock" xmlns:w16se="http://schemas.microsoft.com/office/word/2015/wordml/symex" xmlns:wpg="http://schemas.microsoft.com/office/word/2010/wordprocessingGroup" xmlns:wpi="http://schemas.microsoft.com/office/word/2010/wordprocessingInk" xmlns:wne="http://schemas.microsoft.com/office/word/2006/wordml" xmlns:wps="http://schemas.microsoft.com/office/word/2010/wordprocessingShape" mc:Ignorable="w14 w15 w16se w16cid w16 w16cex w16sdtdh w16sdtfl w16du wp14">
+<w:ftr xmlns:wpc="http://schemas.microsoft.com/office/word/2010/wordprocessingCanvas" xmlns:cx="http://schemas.microsoft.com/office/drawing/2014/chartex" xmlns:cx1="http://schemas.microsoft.com/office/drawing/2015/9/8/chartex" xmlns:cx2="http://schemas.microsoft.com/office/drawing/2015/10/21/chartex" xmlns:cx3="http://schemas.microsoft.com/office/drawing/2016/5/9/chartex" xmlns:cx4="http://schemas.microsoft.com/office/drawing/2016/5/10/chartex" xmlns:cx5="http://schemas.microsoft.com/office/drawing/2016/5/11/chartex" xmlns:cx6="http://schemas.microsoft.com/office/drawing/2016/5/12/chartex" xmlns:cx7="http://schemas.microsoft.com/office/drawing/2016/5/13/chartex" xmlns:cx8="http://schemas.microsoft.com/office/drawing/2016/5/14/chartex" xmlns:mc="http://schemas.openxmlformats.org/markup-compatibility/2006" xmlns:aink="http://schemas.microsoft.com/office/drawing/2016/ink" xmlns:am3d="http://schemas.microsoft.com/office/drawing/2017/model3d" xmlns:o="urn:schemas-microsoft-com:office:office" xmlns:oel="http://schemas.microsoft.com/office/2019/extlst" xmlns:r="http://schemas.openxmlformats.org/officeDocument/2006/relationships" xmlns:m="http://schemas.openxmlformats.org/officeDocument/2006/math" xmlns:v="urn:schemas-microsoft-com:vml" xmlns:wp14="http://schemas.microsoft.com/office/word/2010/wordprocessingDrawing" xmlns:wp="http://schemas.openxmlformats.org/drawingml/2006/wordprocessingDrawing" xmlns:w10="urn:schemas-microsoft-com:office:word" xmlns:w="http://schemas.openxmlformats.org/wordprocessingml/2006/main" xmlns:w14="http://schemas.microsoft.com/office/word/2010/wordml" xmlns:w15="http://schemas.microsoft.com/office/word/2012/wordml" xmlns:w16cei="http://schemas.microsoft.com/office/word/2026/wordml/cei" xmlns:w16cex="http://schemas.microsoft.com/office/word/2018/wordml/cex" xmlns:w16cid="http://schemas.microsoft.com/office/word/2016/wordml/cid" xmlns:w16="http://schemas.microsoft.com/office/word/2018/wordml" xmlns:w16du="http://schemas.microsoft.com/office/word/2023/wordml/word16du" xmlns:w16sdtdh="http://schemas.microsoft.com/office/word/2020/wordml/sdtdatahash" xmlns:w16sdtfl="http://schemas.microsoft.com/office/word/2024/wordml/sdtformatlock" xmlns:w16se="http://schemas.microsoft.com/office/word/2015/wordml/symex" xmlns:wpg="http://schemas.microsoft.com/office/word/2010/wordprocessingGroup" xmlns:wpi="http://schemas.microsoft.com/office/word/2010/wordprocessingInk" xmlns:wne="http://schemas.microsoft.com/office/word/2006/wordml" xmlns:wps="http://schemas.microsoft.com/office/word/2010/wordprocessingShape" mc:Ignorable="w14 w15 w16se w16cid w16 w16cex w16sdtdh w16sdtfl w16du wp14">
   <w:p>
     <w:pPr>
       <w:pStyle w:val="Footer"/>
@@ -4919,7 +4910,7 @@
 </file>
 
 <file path=word/footnotes.xml><?xml version="1.0" encoding="utf-8"?>
-<w:footnotes xmlns:wpc="http://schemas.microsoft.com/office/word/2010/wordprocessingCanvas" xmlns:cx="http://schemas.microsoft.com/office/drawing/2014/chartex" xmlns:cx1="http://schemas.microsoft.com/office/drawing/2015/9/8/chartex" xmlns:cx2="http://schemas.microsoft.com/office/drawing/2015/10/21/chartex" xmlns:cx3="http://schemas.microsoft.com/office/drawing/2016/5/9/chartex" xmlns:cx4="http://schemas.microsoft.com/office/drawing/2016/5/10/chartex" xmlns:cx5="http://schemas.microsoft.com/office/drawing/2016/5/11/chartex" xmlns:cx6="http://schemas.microsoft.com/office/drawing/2016/5/12/chartex" xmlns:cx7="http://schemas.microsoft.com/office/drawing/2016/5/13/chartex" xmlns:cx8="http://schemas.microsoft.com/office/drawing/2016/5/14/chartex" xmlns:mc="http://schemas.openxmlformats.org/markup-compatibility/2006" xmlns:aink="http://schemas.microsoft.com/office/drawing/2016/ink" xmlns:am3d="http://schemas.microsoft.com/office/drawing/2017/model3d" xmlns:o="urn:schemas-microsoft-com:office:office" xmlns:oel="http://schemas.microsoft.com/office/2019/extlst" xmlns:r="http://schemas.openxmlformats.org/officeDocument/2006/relationships" xmlns:m="http://schemas.openxmlformats.org/officeDocument/2006/math" xmlns:v="urn:schemas-microsoft-com:vml" xmlns:wp14="http://schemas.microsoft.com/office/word/2010/wordprocessingDrawing" xmlns:wp="http://schemas.openxmlformats.org/drawingml/2006/wordprocessingDrawing" xmlns:w10="urn:schemas-microsoft-com:office:word" xmlns:w="http://schemas.openxmlformats.org/wordprocessingml/2006/main" xmlns:w14="http://schemas.microsoft.com/office/word/2010/wordml" xmlns:w15="http://schemas.microsoft.com/office/word/2012/wordml" xmlns:w16cex="http://schemas.microsoft.com/office/word/2018/wordml/cex" xmlns:w16cid="http://schemas.microsoft.com/office/word/2016/wordml/cid" xmlns:w16="http://schemas.microsoft.com/office/word/2018/wordml" xmlns:w16du="http://schemas.microsoft.com/office/word/2023/wordml/word16du" xmlns:w16sdtdh="http://schemas.microsoft.com/office/word/2020/wordml/sdtdatahash" xmlns:w16sdtfl="http://schemas.microsoft.com/office/word/2024/wordml/sdtformatlock" xmlns:w16se="http://schemas.microsoft.com/office/word/2015/wordml/symex" xmlns:wpg="http://schemas.microsoft.com/office/word/2010/wordprocessingGroup" xmlns:wpi="http://schemas.microsoft.com/office/word/2010/wordprocessingInk" xmlns:wne="http://schemas.microsoft.com/office/word/2006/wordml" xmlns:wps="http://schemas.microsoft.com/office/word/2010/wordprocessingShape" mc:Ignorable="w14 w15 w16se w16cid w16 w16cex w16sdtdh w16sdtfl w16du wp14">
+<w:footnotes xmlns:wpc="http://schemas.microsoft.com/office/word/2010/wordprocessingCanvas" xmlns:cx="http://schemas.microsoft.com/office/drawing/2014/chartex" xmlns:cx1="http://schemas.microsoft.com/office/drawing/2015/9/8/chartex" xmlns:cx2="http://schemas.microsoft.com/office/drawing/2015/10/21/chartex" xmlns:cx3="http://schemas.microsoft.com/office/drawing/2016/5/9/chartex" xmlns:cx4="http://schemas.microsoft.com/office/drawing/2016/5/10/chartex" xmlns:cx5="http://schemas.microsoft.com/office/drawing/2016/5/11/chartex" xmlns:cx6="http://schemas.microsoft.com/office/drawing/2016/5/12/chartex" xmlns:cx7="http://schemas.microsoft.com/office/drawing/2016/5/13/chartex" xmlns:cx8="http://schemas.microsoft.com/office/drawing/2016/5/14/chartex" xmlns:mc="http://schemas.openxmlformats.org/markup-compatibility/2006" xmlns:aink="http://schemas.microsoft.com/office/drawing/2016/ink" xmlns:am3d="http://schemas.microsoft.com/office/drawing/2017/model3d" xmlns:o="urn:schemas-microsoft-com:office:office" xmlns:oel="http://schemas.microsoft.com/office/2019/extlst" xmlns:r="http://schemas.openxmlformats.org/officeDocument/2006/relationships" xmlns:m="http://schemas.openxmlformats.org/officeDocument/2006/math" xmlns:v="urn:schemas-microsoft-com:vml" xmlns:wp14="http://schemas.microsoft.com/office/word/2010/wordprocessingDrawing" xmlns:wp="http://schemas.openxmlformats.org/drawingml/2006/wordprocessingDrawing" xmlns:w10="urn:schemas-microsoft-com:office:word" xmlns:w="http://schemas.openxmlformats.org/wordprocessingml/2006/main" xmlns:w14="http://schemas.microsoft.com/office/word/2010/wordml" xmlns:w15="http://schemas.microsoft.com/office/word/2012/wordml" xmlns:w16cei="http://schemas.microsoft.com/office/word/2026/wordml/cei" xmlns:w16cex="http://schemas.microsoft.com/office/word/2018/wordml/cex" xmlns:w16cid="http://schemas.microsoft.com/office/word/2016/wordml/cid" xmlns:w16="http://schemas.microsoft.com/office/word/2018/wordml" xmlns:w16du="http://schemas.microsoft.com/office/word/2023/wordml/word16du" xmlns:w16sdtdh="http://schemas.microsoft.com/office/word/2020/wordml/sdtdatahash" xmlns:w16sdtfl="http://schemas.microsoft.com/office/word/2024/wordml/sdtformatlock" xmlns:w16se="http://schemas.microsoft.com/office/word/2015/wordml/symex" xmlns:wpg="http://schemas.microsoft.com/office/word/2010/wordprocessingGroup" xmlns:wpi="http://schemas.microsoft.com/office/word/2010/wordprocessingInk" xmlns:wne="http://schemas.microsoft.com/office/word/2006/wordml" xmlns:wps="http://schemas.microsoft.com/office/word/2010/wordprocessingShape" mc:Ignorable="w14 w15 w16se w16cid w16 w16cex w16sdtdh w16sdtfl w16du wp14">
   <w:footnote w:type="separator" w:id="-1">
     <w:p>
       <w:pPr>
@@ -4944,7 +4935,7 @@
 </file>
 
 <file path=word/header1.xml><?xml version="1.0" encoding="utf-8"?>
-<w:hdr xmlns:wpc="http://schemas.microsoft.com/office/word/2010/wordprocessingCanvas" xmlns:cx="http://schemas.microsoft.com/office/drawing/2014/chartex" xmlns:cx1="http://schemas.microsoft.com/office/drawing/2015/9/8/chartex" xmlns:cx2="http://schemas.microsoft.com/office/drawing/2015/10/21/chartex" xmlns:cx3="http://schemas.microsoft.com/office/drawing/2016/5/9/chartex" xmlns:cx4="http://schemas.microsoft.com/office/drawing/2016/5/10/chartex" xmlns:cx5="http://schemas.microsoft.com/office/drawing/2016/5/11/chartex" xmlns:cx6="http://schemas.microsoft.com/office/drawing/2016/5/12/chartex" xmlns:cx7="http://schemas.microsoft.com/office/drawing/2016/5/13/chartex" xmlns:cx8="http://schemas.microsoft.com/office/drawing/2016/5/14/chartex" xmlns:mc="http://schemas.openxmlformats.org/markup-compatibility/2006" xmlns:aink="http://schemas.microsoft.com/office/drawing/2016/ink" xmlns:am3d="http://schemas.microsoft.com/office/drawing/2017/model3d" xmlns:o="urn:schemas-microsoft-com:office:office" xmlns:oel="http://schemas.microsoft.com/office/2019/extlst" xmlns:r="http://schemas.openxmlformats.org/officeDocument/2006/relationships" xmlns:m="http://schemas.openxmlformats.org/officeDocument/2006/math" xmlns:v="urn:schemas-microsoft-com:vml" xmlns:wp14="http://schemas.microsoft.com/office/word/2010/wordprocessingDrawing" xmlns:wp="http://schemas.openxmlformats.org/drawingml/2006/wordprocessingDrawing" xmlns:w10="urn:schemas-microsoft-com:office:word" xmlns:w="http://schemas.openxmlformats.org/wordprocessingml/2006/main" xmlns:w14="http://schemas.microsoft.com/office/word/2010/wordml" xmlns:w15="http://schemas.microsoft.com/office/word/2012/wordml" xmlns:w16cex="http://schemas.microsoft.com/office/word/2018/wordml/cex" xmlns:w16cid="http://schemas.microsoft.com/office/word/2016/wordml/cid" xmlns:w16="http://schemas.microsoft.com/office/word/2018/wordml" xmlns:w16du="http://schemas.microsoft.com/office/word/2023/wordml/word16du" xmlns:w16sdtdh="http://schemas.microsoft.com/office/word/2020/wordml/sdtdatahash" xmlns:w16sdtfl="http://schemas.microsoft.com/office/word/2024/wordml/sdtformatlock" xmlns:w16se="http://schemas.microsoft.com/office/word/2015/wordml/symex" xmlns:wpg="http://schemas.microsoft.com/office/word/2010/wordprocessingGroup" xmlns:wpi="http://schemas.microsoft.com/office/word/2010/wordprocessingInk" xmlns:wne="http://schemas.microsoft.com/office/word/2006/wordml" xmlns:wps="http://schemas.microsoft.com/office/word/2010/wordprocessingShape" mc:Ignorable="w14 w15 w16se w16cid w16 w16cex w16sdtdh w16sdtfl w16du wp14">
+<w:hdr xmlns:wpc="http://schemas.microsoft.com/office/word/2010/wordprocessingCanvas" xmlns:cx="http://schemas.microsoft.com/office/drawing/2014/chartex" xmlns:cx1="http://schemas.microsoft.com/office/drawing/2015/9/8/chartex" xmlns:cx2="http://schemas.microsoft.com/office/drawing/2015/10/21/chartex" xmlns:cx3="http://schemas.microsoft.com/office/drawing/2016/5/9/chartex" xmlns:cx4="http://schemas.microsoft.com/office/drawing/2016/5/10/chartex" xmlns:cx5="http://schemas.microsoft.com/office/drawing/2016/5/11/chartex" xmlns:cx6="http://schemas.microsoft.com/office/drawing/2016/5/12/chartex" xmlns:cx7="http://schemas.microsoft.com/office/drawing/2016/5/13/chartex" xmlns:cx8="http://schemas.microsoft.com/office/drawing/2016/5/14/chartex" xmlns:mc="http://schemas.openxmlformats.org/markup-compatibility/2006" xmlns:aink="http://schemas.microsoft.com/office/drawing/2016/ink" xmlns:am3d="http://schemas.microsoft.com/office/drawing/2017/model3d" xmlns:o="urn:schemas-microsoft-com:office:office" xmlns:oel="http://schemas.microsoft.com/office/2019/extlst" xmlns:r="http://schemas.openxmlformats.org/officeDocument/2006/relationships" xmlns:m="http://schemas.openxmlformats.org/officeDocument/2006/math" xmlns:v="urn:schemas-microsoft-com:vml" xmlns:wp14="http://schemas.microsoft.com/office/word/2010/wordprocessingDrawing" xmlns:wp="http://schemas.openxmlformats.org/drawingml/2006/wordprocessingDrawing" xmlns:w10="urn:schemas-microsoft-com:office:word" xmlns:w="http://schemas.openxmlformats.org/wordprocessingml/2006/main" xmlns:w14="http://schemas.microsoft.com/office/word/2010/wordml" xmlns:w15="http://schemas.microsoft.com/office/word/2012/wordml" xmlns:w16cei="http://schemas.microsoft.com/office/word/2026/wordml/cei" xmlns:w16cex="http://schemas.microsoft.com/office/word/2018/wordml/cex" xmlns:w16cid="http://schemas.microsoft.com/office/word/2016/wordml/cid" xmlns:w16="http://schemas.microsoft.com/office/word/2018/wordml" xmlns:w16du="http://schemas.microsoft.com/office/word/2023/wordml/word16du" xmlns:w16sdtdh="http://schemas.microsoft.com/office/word/2020/wordml/sdtdatahash" xmlns:w16sdtfl="http://schemas.microsoft.com/office/word/2024/wordml/sdtformatlock" xmlns:w16se="http://schemas.microsoft.com/office/word/2015/wordml/symex" xmlns:wpg="http://schemas.microsoft.com/office/word/2010/wordprocessingGroup" xmlns:wpi="http://schemas.microsoft.com/office/word/2010/wordprocessingInk" xmlns:wne="http://schemas.microsoft.com/office/word/2006/wordml" xmlns:wps="http://schemas.microsoft.com/office/word/2010/wordprocessingShape" mc:Ignorable="w14 w15 w16se w16cid w16 w16cex w16sdtdh w16sdtfl w16du wp14">
   <w:p>
     <w:pPr>
       <w:pStyle w:val="Header"/>
@@ -5108,7 +5099,7 @@
 </file>
 
 <file path=word/numbering.xml><?xml version="1.0" encoding="utf-8"?>
-<w:numbering xmlns:wpc="http://schemas.microsoft.com/office/word/2010/wordprocessingCanvas" xmlns:cx="http://schemas.microsoft.com/office/drawing/2014/chartex" xmlns:cx1="http://schemas.microsoft.com/office/drawing/2015/9/8/chartex" xmlns:cx2="http://schemas.microsoft.com/office/drawing/2015/10/21/chartex" xmlns:cx3="http://schemas.microsoft.com/office/drawing/2016/5/9/chartex" xmlns:cx4="http://schemas.microsoft.com/office/drawing/2016/5/10/chartex" xmlns:cx5="http://schemas.microsoft.com/office/drawing/2016/5/11/chartex" xmlns:cx6="http://schemas.microsoft.com/office/drawing/2016/5/12/chartex" xmlns:cx7="http://schemas.microsoft.com/office/drawing/2016/5/13/chartex" xmlns:cx8="http://schemas.microsoft.com/office/drawing/2016/5/14/chartex" xmlns:mc="http://schemas.openxmlformats.org/markup-compatibility/2006" xmlns:aink="http://schemas.microsoft.com/office/drawing/2016/ink" xmlns:am3d="http://schemas.microsoft.com/office/drawing/2017/model3d" xmlns:o="urn:schemas-microsoft-com:office:office" xmlns:oel="http://schemas.microsoft.com/office/2019/extlst" xmlns:r="http://schemas.openxmlformats.org/officeDocument/2006/relationships" xmlns:m="http://schemas.openxmlformats.org/officeDocument/2006/math" xmlns:v="urn:schemas-microsoft-com:vml" xmlns:wp14="http://schemas.microsoft.com/office/word/2010/wordprocessingDrawing" xmlns:wp="http://schemas.openxmlformats.org/drawingml/2006/wordprocessingDrawing" xmlns:w10="urn:schemas-microsoft-com:office:word" xmlns:w="http://schemas.openxmlformats.org/wordprocessingml/2006/main" xmlns:w14="http://schemas.microsoft.com/office/word/2010/wordml" xmlns:w15="http://schemas.microsoft.com/office/word/2012/wordml" xmlns:w16cex="http://schemas.microsoft.com/office/word/2018/wordml/cex" xmlns:w16cid="http://schemas.microsoft.com/office/word/2016/wordml/cid" xmlns:w16="http://schemas.microsoft.com/office/word/2018/wordml" xmlns:w16du="http://schemas.microsoft.com/office/word/2023/wordml/word16du" xmlns:w16sdtdh="http://schemas.microsoft.com/office/word/2020/wordml/sdtdatahash" xmlns:w16sdtfl="http://schemas.microsoft.com/office/word/2024/wordml/sdtformatlock" xmlns:w16se="http://schemas.microsoft.com/office/word/2015/wordml/symex" xmlns:wpg="http://schemas.microsoft.com/office/word/2010/wordprocessingGroup" xmlns:wpi="http://schemas.microsoft.com/office/word/2010/wordprocessingInk" xmlns:wne="http://schemas.microsoft.com/office/word/2006/wordml" xmlns:wps="http://schemas.microsoft.com/office/word/2010/wordprocessingShape" mc:Ignorable="w14 w15 w16se w16cid w16 w16cex w16sdtdh w16sdtfl w16du wp14">
+<w:numbering xmlns:wpc="http://schemas.microsoft.com/office/word/2010/wordprocessingCanvas" xmlns:cx="http://schemas.microsoft.com/office/drawing/2014/chartex" xmlns:cx1="http://schemas.microsoft.com/office/drawing/2015/9/8/chartex" xmlns:cx2="http://schemas.microsoft.com/office/drawing/2015/10/21/chartex" xmlns:cx3="http://schemas.microsoft.com/office/drawing/2016/5/9/chartex" xmlns:cx4="http://schemas.microsoft.com/office/drawing/2016/5/10/chartex" xmlns:cx5="http://schemas.microsoft.com/office/drawing/2016/5/11/chartex" xmlns:cx6="http://schemas.microsoft.com/office/drawing/2016/5/12/chartex" xmlns:cx7="http://schemas.microsoft.com/office/drawing/2016/5/13/chartex" xmlns:cx8="http://schemas.microsoft.com/office/drawing/2016/5/14/chartex" xmlns:mc="http://schemas.openxmlformats.org/markup-compatibility/2006" xmlns:aink="http://schemas.microsoft.com/office/drawing/2016/ink" xmlns:am3d="http://schemas.microsoft.com/office/drawing/2017/model3d" xmlns:o="urn:schemas-microsoft-com:office:office" xmlns:oel="http://schemas.microsoft.com/office/2019/extlst" xmlns:r="http://schemas.openxmlformats.org/officeDocument/2006/relationships" xmlns:m="http://schemas.openxmlformats.org/officeDocument/2006/math" xmlns:v="urn:schemas-microsoft-com:vml" xmlns:wp14="http://schemas.microsoft.com/office/word/2010/wordprocessingDrawing" xmlns:wp="http://schemas.openxmlformats.org/drawingml/2006/wordprocessingDrawing" xmlns:w10="urn:schemas-microsoft-com:office:word" xmlns:w="http://schemas.openxmlformats.org/wordprocessingml/2006/main" xmlns:w14="http://schemas.microsoft.com/office/word/2010/wordml" xmlns:w15="http://schemas.microsoft.com/office/word/2012/wordml" xmlns:w16cei="http://schemas.microsoft.com/office/word/2026/wordml/cei" xmlns:w16cex="http://schemas.microsoft.com/office/word/2018/wordml/cex" xmlns:w16cid="http://schemas.microsoft.com/office/word/2016/wordml/cid" xmlns:w16="http://schemas.microsoft.com/office/word/2018/wordml" xmlns:w16du="http://schemas.microsoft.com/office/word/2023/wordml/word16du" xmlns:w16sdtdh="http://schemas.microsoft.com/office/word/2020/wordml/sdtdatahash" xmlns:w16sdtfl="http://schemas.microsoft.com/office/word/2024/wordml/sdtformatlock" xmlns:w16se="http://schemas.microsoft.com/office/word/2015/wordml/symex" xmlns:wpg="http://schemas.microsoft.com/office/word/2010/wordprocessingGroup" xmlns:wpi="http://schemas.microsoft.com/office/word/2010/wordprocessingInk" xmlns:wne="http://schemas.microsoft.com/office/word/2006/wordml" xmlns:wps="http://schemas.microsoft.com/office/word/2010/wordprocessingShape" mc:Ignorable="w14 w15 w16se w16cid w16 w16cex w16sdtdh w16sdtfl w16du wp14">
   <w:abstractNum w:abstractNumId="0" w15:restartNumberingAfterBreak="0">
     <w:nsid w:val="036205D6"/>
     <w:multiLevelType w:val="multilevel"/>

</xml_diff>

<commit_message>
Added task 5 to final document
</commit_message>
<xml_diff>
--- a/docs/COS214_Prac3.docx
+++ b/docs/COS214_Prac3.docx
@@ -1,6 +1,6 @@
 
 <file path=word/document.xml><?xml version="1.0" encoding="utf-8"?>
-<w:document xmlns:wpc="http://schemas.microsoft.com/office/word/2010/wordprocessingCanvas" xmlns:cx="http://schemas.microsoft.com/office/drawing/2014/chartex" xmlns:cx1="http://schemas.microsoft.com/office/drawing/2015/9/8/chartex" xmlns:cx2="http://schemas.microsoft.com/office/drawing/2015/10/21/chartex" xmlns:cx3="http://schemas.microsoft.com/office/drawing/2016/5/9/chartex" xmlns:cx4="http://schemas.microsoft.com/office/drawing/2016/5/10/chartex" xmlns:cx5="http://schemas.microsoft.com/office/drawing/2016/5/11/chartex" xmlns:cx6="http://schemas.microsoft.com/office/drawing/2016/5/12/chartex" xmlns:cx7="http://schemas.microsoft.com/office/drawing/2016/5/13/chartex" xmlns:cx8="http://schemas.microsoft.com/office/drawing/2016/5/14/chartex" xmlns:mc="http://schemas.openxmlformats.org/markup-compatibility/2006" xmlns:aink="http://schemas.microsoft.com/office/drawing/2016/ink" xmlns:am3d="http://schemas.microsoft.com/office/drawing/2017/model3d" xmlns:o="urn:schemas-microsoft-com:office:office" xmlns:oel="http://schemas.microsoft.com/office/2019/extlst" xmlns:r="http://schemas.openxmlformats.org/officeDocument/2006/relationships" xmlns:m="http://schemas.openxmlformats.org/officeDocument/2006/math" xmlns:v="urn:schemas-microsoft-com:vml" xmlns:wp14="http://schemas.microsoft.com/office/word/2010/wordprocessingDrawing" xmlns:wp="http://schemas.openxmlformats.org/drawingml/2006/wordprocessingDrawing" xmlns:w10="urn:schemas-microsoft-com:office:word" xmlns:w="http://schemas.openxmlformats.org/wordprocessingml/2006/main" xmlns:w14="http://schemas.microsoft.com/office/word/2010/wordml" xmlns:w15="http://schemas.microsoft.com/office/word/2012/wordml" xmlns:w16cex="http://schemas.microsoft.com/office/word/2018/wordml/cex" xmlns:w16cid="http://schemas.microsoft.com/office/word/2016/wordml/cid" xmlns:w16="http://schemas.microsoft.com/office/word/2018/wordml" xmlns:w16du="http://schemas.microsoft.com/office/word/2023/wordml/word16du" xmlns:w16sdtdh="http://schemas.microsoft.com/office/word/2020/wordml/sdtdatahash" xmlns:w16sdtfl="http://schemas.microsoft.com/office/word/2024/wordml/sdtformatlock" xmlns:w16se="http://schemas.microsoft.com/office/word/2015/wordml/symex" xmlns:wpg="http://schemas.microsoft.com/office/word/2010/wordprocessingGroup" xmlns:wpi="http://schemas.microsoft.com/office/word/2010/wordprocessingInk" xmlns:wne="http://schemas.microsoft.com/office/word/2006/wordml" xmlns:wps="http://schemas.microsoft.com/office/word/2010/wordprocessingShape" mc:Ignorable="w14 w15 w16se w16cid w16 w16cex w16sdtdh w16sdtfl w16du wp14">
+<w:document xmlns:wpc="http://schemas.microsoft.com/office/word/2010/wordprocessingCanvas" xmlns:cx="http://schemas.microsoft.com/office/drawing/2014/chartex" xmlns:cx1="http://schemas.microsoft.com/office/drawing/2015/9/8/chartex" xmlns:cx2="http://schemas.microsoft.com/office/drawing/2015/10/21/chartex" xmlns:cx3="http://schemas.microsoft.com/office/drawing/2016/5/9/chartex" xmlns:cx4="http://schemas.microsoft.com/office/drawing/2016/5/10/chartex" xmlns:cx5="http://schemas.microsoft.com/office/drawing/2016/5/11/chartex" xmlns:cx6="http://schemas.microsoft.com/office/drawing/2016/5/12/chartex" xmlns:cx7="http://schemas.microsoft.com/office/drawing/2016/5/13/chartex" xmlns:cx8="http://schemas.microsoft.com/office/drawing/2016/5/14/chartex" xmlns:mc="http://schemas.openxmlformats.org/markup-compatibility/2006" xmlns:aink="http://schemas.microsoft.com/office/drawing/2016/ink" xmlns:am3d="http://schemas.microsoft.com/office/drawing/2017/model3d" xmlns:o="urn:schemas-microsoft-com:office:office" xmlns:oel="http://schemas.microsoft.com/office/2019/extlst" xmlns:r="http://schemas.openxmlformats.org/officeDocument/2006/relationships" xmlns:m="http://schemas.openxmlformats.org/officeDocument/2006/math" xmlns:v="urn:schemas-microsoft-com:vml" xmlns:wp14="http://schemas.microsoft.com/office/word/2010/wordprocessingDrawing" xmlns:wp="http://schemas.openxmlformats.org/drawingml/2006/wordprocessingDrawing" xmlns:w10="urn:schemas-microsoft-com:office:word" xmlns:w="http://schemas.openxmlformats.org/wordprocessingml/2006/main" xmlns:w14="http://schemas.microsoft.com/office/word/2010/wordml" xmlns:w15="http://schemas.microsoft.com/office/word/2012/wordml" xmlns:w16cei="http://schemas.microsoft.com/office/word/2026/wordml/cei" xmlns:w16cex="http://schemas.microsoft.com/office/word/2018/wordml/cex" xmlns:w16cid="http://schemas.microsoft.com/office/word/2016/wordml/cid" xmlns:w16="http://schemas.microsoft.com/office/word/2018/wordml" xmlns:w16du="http://schemas.microsoft.com/office/word/2023/wordml/word16du" xmlns:w16sdtdh="http://schemas.microsoft.com/office/word/2020/wordml/sdtdatahash" xmlns:w16sdtfl="http://schemas.microsoft.com/office/word/2024/wordml/sdtformatlock" xmlns:w16se="http://schemas.microsoft.com/office/word/2015/wordml/symex" xmlns:wpg="http://schemas.microsoft.com/office/word/2010/wordprocessingGroup" xmlns:wpi="http://schemas.microsoft.com/office/word/2010/wordprocessingInk" xmlns:wne="http://schemas.microsoft.com/office/word/2006/wordml" xmlns:wps="http://schemas.microsoft.com/office/word/2010/wordprocessingShape" mc:Ignorable="w14 w15 w16se w16cid w16 w16cex w16sdtdh w16sdtfl w16du wp14">
   <w:body>
     <w:p>
       <w:pPr>
@@ -73,8 +73,33 @@
           <w:sz w:val="22"/>
           <w:szCs w:val="22"/>
         </w:rPr>
-        <w:t>Event Name</w:t>
-      </w:r>
+        <w:t>Event Name:</w:t>
+      </w:r>
+    </w:p>
+    <w:p>
+      <w:pPr>
+        <w:jc w:val="center"/>
+        <w:rPr>
+          <w:sz w:val="22"/>
+          <w:szCs w:val="22"/>
+        </w:rPr>
+      </w:pPr>
+      <w:r>
+        <w:rPr>
+          <w:sz w:val="22"/>
+          <w:szCs w:val="22"/>
+        </w:rPr>
+        <w:t>Summer Music Festival</w:t>
+      </w:r>
+    </w:p>
+    <w:p>
+      <w:pPr>
+        <w:jc w:val="center"/>
+        <w:rPr>
+          <w:sz w:val="22"/>
+          <w:szCs w:val="22"/>
+        </w:rPr>
+      </w:pPr>
       <w:r>
         <w:rPr>
           <w:b/>
@@ -82,23 +107,15 @@
           <w:sz w:val="22"/>
           <w:szCs w:val="22"/>
         </w:rPr>
-        <w:t>:</w:t>
-      </w:r>
-    </w:p>
-    <w:p>
-      <w:pPr>
-        <w:jc w:val="center"/>
+        <w:t>Event Description:</w:t>
+      </w:r>
+      <w:r>
         <w:rPr>
           <w:sz w:val="22"/>
           <w:szCs w:val="22"/>
         </w:rPr>
-      </w:pPr>
-      <w:r>
-        <w:rPr>
-          <w:sz w:val="22"/>
-          <w:szCs w:val="22"/>
-        </w:rPr>
-        <w:t>Summer Music Festival</w:t>
+        <w:br/>
+        <w:t>It is an outdoor 18+ music event featuring multiple stage areas, food and drink services, security, medical assistance, and controlled entrances. The system manages these festival components dynamically and allows them to respond to events such as weather warnings, capacity alerts, pauses and evacuations.</w:t>
       </w:r>
     </w:p>
     <w:p>
@@ -116,47 +133,116 @@
           <w:sz w:val="22"/>
           <w:szCs w:val="22"/>
         </w:rPr>
-        <w:t>Event Description:</w:t>
-      </w:r>
-      <w:r>
+        <w:t>Group Members:</w:t>
+      </w:r>
+    </w:p>
+    <w:p>
+      <w:pPr>
+        <w:jc w:val="center"/>
         <w:rPr>
           <w:sz w:val="22"/>
           <w:szCs w:val="22"/>
         </w:rPr>
-        <w:br/>
-      </w:r>
+      </w:pPr>
       <w:r>
         <w:rPr>
           <w:sz w:val="22"/>
           <w:szCs w:val="22"/>
         </w:rPr>
-        <w:t>It</w:t>
-      </w:r>
-      <w:r>
+        <w:t>Lindo Skosana- u24891968</w:t>
+      </w:r>
+    </w:p>
+    <w:p>
+      <w:pPr>
+        <w:jc w:val="center"/>
         <w:rPr>
           <w:sz w:val="22"/>
           <w:szCs w:val="22"/>
         </w:rPr>
-        <w:t xml:space="preserve"> is an outdoor 18+ music event featuring multiple stage areas, food and drink services, security, medical assistance, and controlled entrances. The system manages these festival components dynamically and allows them to respond to events such as weather warnings, capacity alerts, pauses and evacuations.</w:t>
-      </w:r>
-    </w:p>
-    <w:p>
-      <w:pPr>
-        <w:jc w:val="center"/>
+      </w:pPr>
+      <w:r>
         <w:rPr>
           <w:sz w:val="22"/>
           <w:szCs w:val="22"/>
         </w:rPr>
-      </w:pPr>
-      <w:r>
+        <w:t>Kristy Heesen- u24702341</w:t>
+      </w:r>
+    </w:p>
+    <w:p>
+      <w:pPr>
+        <w:jc w:val="center"/>
+        <w:rPr>
+          <w:sz w:val="22"/>
+          <w:szCs w:val="22"/>
+        </w:rPr>
+      </w:pPr>
+      <w:r>
+        <w:rPr>
+          <w:sz w:val="22"/>
+          <w:szCs w:val="22"/>
+        </w:rPr>
+        <w:t xml:space="preserve">Thabo </w:t>
+      </w:r>
+      <w:proofErr w:type="spellStart"/>
+      <w:r>
+        <w:rPr>
+          <w:sz w:val="22"/>
+          <w:szCs w:val="22"/>
+        </w:rPr>
+        <w:t>Ngqabi</w:t>
+      </w:r>
+      <w:proofErr w:type="spellEnd"/>
+      <w:r>
+        <w:rPr>
+          <w:sz w:val="22"/>
+          <w:szCs w:val="22"/>
+        </w:rPr>
+        <w:t>- u24742512</w:t>
+      </w:r>
+    </w:p>
+    <w:p>
+      <w:pPr>
+        <w:pStyle w:val="Heading1"/>
+      </w:pPr>
+    </w:p>
+    <w:p>
+      <w:pPr>
+        <w:pStyle w:val="Heading1"/>
+      </w:pPr>
+    </w:p>
+    <w:p>
+      <w:pPr>
+        <w:pStyle w:val="Heading1"/>
+      </w:pPr>
+    </w:p>
+    <w:p/>
+    <w:p/>
+    <w:p/>
+    <w:p/>
+    <w:p/>
+    <w:p/>
+    <w:p/>
+    <w:p/>
+    <w:p/>
+    <w:p>
+      <w:pPr>
+        <w:pStyle w:val="Heading1"/>
+      </w:pPr>
+      <w:r>
+        <w:lastRenderedPageBreak/>
+        <w:t>TASK 1</w:t>
+      </w:r>
+    </w:p>
+    <w:p/>
+    <w:p>
+      <w:pPr>
         <w:rPr>
           <w:b/>
           <w:bCs/>
           <w:sz w:val="22"/>
           <w:szCs w:val="22"/>
         </w:rPr>
-        <w:t>Group Members</w:t>
-      </w:r>
+      </w:pPr>
       <w:r>
         <w:rPr>
           <w:b/>
@@ -164,121 +250,164 @@
           <w:sz w:val="22"/>
           <w:szCs w:val="22"/>
         </w:rPr>
-        <w:t>:</w:t>
-      </w:r>
-    </w:p>
-    <w:p>
-      <w:pPr>
-        <w:jc w:val="center"/>
-        <w:rPr>
-          <w:sz w:val="22"/>
-          <w:szCs w:val="22"/>
-        </w:rPr>
-      </w:pPr>
-      <w:r>
-        <w:rPr>
-          <w:sz w:val="22"/>
-          <w:szCs w:val="22"/>
-        </w:rPr>
-        <w:t xml:space="preserve">Lindo Skosana- </w:t>
-      </w:r>
-      <w:r>
-        <w:rPr>
-          <w:sz w:val="22"/>
-          <w:szCs w:val="22"/>
-        </w:rPr>
-        <w:t>u24891968</w:t>
-      </w:r>
-    </w:p>
-    <w:p>
-      <w:pPr>
-        <w:jc w:val="center"/>
-        <w:rPr>
-          <w:sz w:val="22"/>
-          <w:szCs w:val="22"/>
-        </w:rPr>
-      </w:pPr>
-      <w:r>
-        <w:rPr>
-          <w:sz w:val="22"/>
-          <w:szCs w:val="22"/>
-        </w:rPr>
-        <w:t>Kristy Heesen- u24702341</w:t>
-      </w:r>
-    </w:p>
-    <w:p>
-      <w:pPr>
-        <w:jc w:val="center"/>
-        <w:rPr>
-          <w:sz w:val="22"/>
-          <w:szCs w:val="22"/>
-        </w:rPr>
-      </w:pPr>
-      <w:r>
-        <w:rPr>
-          <w:sz w:val="22"/>
-          <w:szCs w:val="22"/>
-        </w:rPr>
-        <w:t xml:space="preserve">Thabo </w:t>
+        <w:t>Question 1.1</w:t>
+      </w:r>
+    </w:p>
+    <w:p>
+      <w:pPr>
+        <w:spacing w:after="160" w:line="278" w:lineRule="auto"/>
+      </w:pPr>
+      <w:r>
+        <w:t>Summer Music Festival</w:t>
+      </w:r>
+    </w:p>
+    <w:p>
+      <w:pPr>
+        <w:spacing w:after="160" w:line="278" w:lineRule="auto"/>
+      </w:pPr>
+      <w:r>
+        <w:t>Summer Music Festival is a</w:t>
+      </w:r>
+      <w:r>
+        <w:t>n</w:t>
+      </w:r>
+      <w:r>
+        <w:t xml:space="preserve">18+ </w:t>
+      </w:r>
+      <w:r>
+        <w:t xml:space="preserve">indoor(in a tent) and </w:t>
+      </w:r>
+      <w:r>
+        <w:t>outdoor music festival with three main performance areas: the Main Stage, River Stage and Techno Stage. Each stage has a different type of music</w:t>
+      </w:r>
+      <w:r>
+        <w:t xml:space="preserve"> genre</w:t>
+      </w:r>
+      <w:r>
+        <w:t xml:space="preserve"> and atmosphere. The River Stage is located close to the water, while the Techno Stage focuses on electronic music</w:t>
+      </w:r>
+      <w:r>
+        <w:t>, inside a tent,</w:t>
+      </w:r>
+      <w:r>
+        <w:t xml:space="preserve"> and the Main Stage hosts the main headline performances</w:t>
+      </w:r>
+      <w:r>
+        <w:t xml:space="preserve"> outside</w:t>
+      </w:r>
+      <w:r>
+        <w:t>.</w:t>
+      </w:r>
+    </w:p>
+    <w:p>
+      <w:pPr>
+        <w:spacing w:after="160" w:line="278" w:lineRule="auto"/>
+      </w:pPr>
+      <w:r>
+        <w:t>All visitors enter through the main festival entrance. The Entrance Gate checks identification to make sure that everyone entering the festival is 18 years or older. Each stage area also has its own Stage Gate. These gates monitor how many people are inside the stage area. If the stage reaches its maximum capacity, the gate stops allowing people to enter until space becomes available.</w:t>
+      </w:r>
+    </w:p>
+    <w:p>
+      <w:pPr>
+        <w:spacing w:after="160" w:line="278" w:lineRule="auto"/>
+      </w:pPr>
+      <w:r>
+        <w:t>Each stage area contains a Stage, Stage Gate and Bar. The festival also has Food Vendors, Security Teams and Medical Teams. These units all have different responsibilities. For example, Security Teams help control crowds and respond to safety problems, while Medical Teams remain available to treat injured or sick attendees.</w:t>
+      </w:r>
+    </w:p>
+    <w:p>
+      <w:pPr>
+        <w:spacing w:after="160" w:line="278" w:lineRule="auto"/>
+      </w:pPr>
+      <w:r>
+        <w:t>The festival is divided into different groups that form the Composite structure. These include the Festival Grounds, the different Stage Zones, and Service Areas. These groups may contain smaller groups or individual event unit</w:t>
+      </w:r>
+      <w:r>
+        <w:t xml:space="preserve">, such as </w:t>
+      </w:r>
+      <w:r>
+        <w:t>Main Stage</w:t>
+      </w:r>
+      <w:r>
+        <w:t xml:space="preserve"> Zone</w:t>
+      </w:r>
+      <w:r>
+        <w:t xml:space="preserve">, River Stage </w:t>
+      </w:r>
+      <w:r>
+        <w:t xml:space="preserve">Zone </w:t>
+      </w:r>
+      <w:r>
+        <w:t>and Techno Stage</w:t>
+      </w:r>
+      <w:r>
+        <w:t xml:space="preserve"> Zone.</w:t>
+      </w:r>
+    </w:p>
+    <w:p>
+      <w:pPr>
+        <w:spacing w:after="160" w:line="278" w:lineRule="auto"/>
+      </w:pPr>
+      <w:r>
+        <w:t xml:space="preserve">The main concrete event units are Stage, </w:t>
       </w:r>
       <w:proofErr w:type="spellStart"/>
       <w:r>
-        <w:rPr>
-          <w:sz w:val="22"/>
-          <w:szCs w:val="22"/>
-        </w:rPr>
-        <w:t>Ngqabi</w:t>
+        <w:t>EntranceGate</w:t>
       </w:r>
       <w:proofErr w:type="spellEnd"/>
       <w:r>
-        <w:rPr>
-          <w:sz w:val="22"/>
-          <w:szCs w:val="22"/>
-        </w:rPr>
-        <w:t xml:space="preserve">- </w:t>
-      </w:r>
-      <w:r>
-        <w:rPr>
-          <w:sz w:val="22"/>
-          <w:szCs w:val="22"/>
-        </w:rPr>
-        <w:t>u24742512</w:t>
-      </w:r>
-    </w:p>
-    <w:p>
-      <w:pPr>
-        <w:pStyle w:val="Heading1"/>
-      </w:pPr>
-    </w:p>
-    <w:p>
-      <w:pPr>
-        <w:pStyle w:val="Heading1"/>
-      </w:pPr>
-    </w:p>
-    <w:p>
-      <w:pPr>
-        <w:pStyle w:val="Heading1"/>
-      </w:pPr>
-    </w:p>
-    <w:p/>
-    <w:p/>
-    <w:p/>
-    <w:p/>
-    <w:p/>
-    <w:p/>
-    <w:p/>
-    <w:p/>
-    <w:p/>
-    <w:p>
-      <w:pPr>
-        <w:pStyle w:val="Heading1"/>
-      </w:pPr>
-      <w:r>
-        <w:lastRenderedPageBreak/>
-        <w:t>TASK 1</w:t>
-      </w:r>
-    </w:p>
-    <w:p/>
+        <w:t xml:space="preserve">, </w:t>
+      </w:r>
+      <w:proofErr w:type="spellStart"/>
+      <w:r>
+        <w:t>StageGate</w:t>
+      </w:r>
+      <w:proofErr w:type="spellEnd"/>
+      <w:r>
+        <w:t xml:space="preserve">, Bar, </w:t>
+      </w:r>
+      <w:proofErr w:type="spellStart"/>
+      <w:r>
+        <w:t>FoodVendor</w:t>
+      </w:r>
+      <w:proofErr w:type="spellEnd"/>
+      <w:r>
+        <w:t xml:space="preserve">, </w:t>
+      </w:r>
+      <w:proofErr w:type="spellStart"/>
+      <w:r>
+        <w:t>SecurityTeam</w:t>
+      </w:r>
+      <w:proofErr w:type="spellEnd"/>
+      <w:r>
+        <w:t xml:space="preserve"> and </w:t>
+      </w:r>
+      <w:proofErr w:type="spellStart"/>
+      <w:r>
+        <w:t>MedicalTeam</w:t>
+      </w:r>
+      <w:proofErr w:type="spellEnd"/>
+      <w:r>
+        <w:t>.</w:t>
+      </w:r>
+    </w:p>
+    <w:p>
+      <w:pPr>
+        <w:spacing w:after="160" w:line="278" w:lineRule="auto"/>
+      </w:pPr>
+      <w:r>
+        <w:t>During the festival, the control centre can send notices such as weather warnings, capacity alerts, schedule changes, pauses, evacuations and resume notices. Different units respond differently to the same notice. For example, a Stage may pause a performance during an evacuation, a Stage Gate may stop admitting people, a Bar may stop serving, while a Medical Team remains operational.</w:t>
+      </w:r>
+    </w:p>
+    <w:p>
+      <w:pPr>
+        <w:spacing w:after="160" w:line="278" w:lineRule="auto"/>
+      </w:pPr>
+      <w:r>
+        <w:t>This gives the event enough nested structure and changing behaviour to make use of both the Composite and Observer patterns.</w:t>
+      </w:r>
+    </w:p>
     <w:p>
       <w:pPr>
         <w:rPr>
@@ -295,182 +424,382 @@
           <w:sz w:val="22"/>
           <w:szCs w:val="22"/>
         </w:rPr>
-        <w:t>Question 1.1</w:t>
-      </w:r>
-    </w:p>
-    <w:p>
-      <w:pPr>
-        <w:spacing w:after="160" w:line="278" w:lineRule="auto"/>
-      </w:pPr>
-      <w:r>
-        <w:t>Summer Music Festival</w:t>
-      </w:r>
-    </w:p>
-    <w:p>
-      <w:pPr>
-        <w:spacing w:after="160" w:line="278" w:lineRule="auto"/>
-      </w:pPr>
-      <w:r>
-        <w:t>Summer Music Festival is a</w:t>
-      </w:r>
-      <w:r>
-        <w:t>n</w:t>
-      </w:r>
-      <w:r>
-        <w:t xml:space="preserve">18+ </w:t>
-      </w:r>
-      <w:r>
-        <w:t xml:space="preserve">indoor(in a tent) and </w:t>
-      </w:r>
-      <w:r>
-        <w:t>outdoor music festival with three main performance areas: the Main Stage, River Stage and Techno Stage. Each stage has a different type of music</w:t>
-      </w:r>
-      <w:r>
-        <w:t xml:space="preserve"> genre</w:t>
-      </w:r>
-      <w:r>
-        <w:t xml:space="preserve"> and atmosphere. The River Stage is located close to the water, while the Techno Stage focuses on electronic music</w:t>
-      </w:r>
-      <w:r>
-        <w:t>, inside a tent,</w:t>
-      </w:r>
-      <w:r>
-        <w:t xml:space="preserve"> and the Main Stage hosts the main headline performances</w:t>
-      </w:r>
-      <w:r>
-        <w:t xml:space="preserve"> outside</w:t>
-      </w:r>
-      <w:r>
-        <w:t>.</w:t>
-      </w:r>
-    </w:p>
-    <w:p>
-      <w:pPr>
-        <w:spacing w:after="160" w:line="278" w:lineRule="auto"/>
-      </w:pPr>
-      <w:r>
-        <w:t>All visitors enter through the main festival entrance. The Entrance Gate checks identification to make sure that everyone entering the festival is 18 years or older. Each stage area also has its own Stage Gate. These gates monitor how many people are inside the stage area. If the stage reaches its maximum capacity, the gate stops allowing people to enter until space becomes available.</w:t>
-      </w:r>
-    </w:p>
-    <w:p>
-      <w:pPr>
-        <w:spacing w:after="160" w:line="278" w:lineRule="auto"/>
-      </w:pPr>
-      <w:r>
-        <w:t>Each stage area contains a Stage, Stage Gate and Bar. The festival also has Food Vendors, Security Teams and Medical Teams. These units all have different responsibilities. For example, Security Teams help control crowds and respond to safety problems, while Medical Teams remain available to treat injured or sick attendees.</w:t>
-      </w:r>
-    </w:p>
-    <w:p>
-      <w:pPr>
-        <w:spacing w:after="160" w:line="278" w:lineRule="auto"/>
-      </w:pPr>
-      <w:r>
-        <w:t>The festival is divided into different groups that form the Composite structure. These include the Festival Grounds, the different Stage Zones, and Service Areas. These groups may contain smaller groups or individual event unit</w:t>
-      </w:r>
-      <w:r>
-        <w:t xml:space="preserve">, such as </w:t>
-      </w:r>
-      <w:r>
-        <w:t>Main Stage</w:t>
-      </w:r>
-      <w:r>
-        <w:t xml:space="preserve"> Zone</w:t>
-      </w:r>
-      <w:r>
-        <w:t xml:space="preserve">, River Stage </w:t>
-      </w:r>
-      <w:r>
-        <w:t xml:space="preserve">Zone </w:t>
-      </w:r>
-      <w:r>
-        <w:t>and Techno Stage</w:t>
-      </w:r>
-      <w:r>
-        <w:t xml:space="preserve"> Zone.</w:t>
-      </w:r>
-    </w:p>
-    <w:p>
-      <w:pPr>
-        <w:spacing w:after="160" w:line="278" w:lineRule="auto"/>
-      </w:pPr>
-      <w:r>
-        <w:t xml:space="preserve">The main concrete event units are Stage, </w:t>
-      </w:r>
-      <w:proofErr w:type="spellStart"/>
-      <w:r>
-        <w:t>EntranceGate</w:t>
-      </w:r>
-      <w:proofErr w:type="spellEnd"/>
-      <w:r>
-        <w:t xml:space="preserve">, </w:t>
-      </w:r>
-      <w:proofErr w:type="spellStart"/>
-      <w:r>
-        <w:t>StageGate</w:t>
-      </w:r>
-      <w:proofErr w:type="spellEnd"/>
-      <w:r>
-        <w:t xml:space="preserve">, Bar, </w:t>
-      </w:r>
-      <w:proofErr w:type="spellStart"/>
-      <w:r>
-        <w:t>FoodVendor</w:t>
-      </w:r>
-      <w:proofErr w:type="spellEnd"/>
-      <w:r>
-        <w:t xml:space="preserve">, </w:t>
-      </w:r>
-      <w:proofErr w:type="spellStart"/>
-      <w:r>
-        <w:t>SecurityTeam</w:t>
-      </w:r>
-      <w:proofErr w:type="spellEnd"/>
-      <w:r>
-        <w:t xml:space="preserve"> and </w:t>
-      </w:r>
-      <w:proofErr w:type="spellStart"/>
-      <w:r>
-        <w:t>MedicalTeam</w:t>
-      </w:r>
-      <w:proofErr w:type="spellEnd"/>
-      <w:r>
-        <w:t>.</w:t>
-      </w:r>
-    </w:p>
-    <w:p>
-      <w:pPr>
-        <w:spacing w:after="160" w:line="278" w:lineRule="auto"/>
-      </w:pPr>
-      <w:r>
-        <w:t>During the festival, the control centre can send notices such as weather warnings, capacity alerts, schedule changes, pauses, evacuations and resume notices. Different units respond differently to the same notice. For example, a Stage may pause a performance during an evacuation, a Stage Gate may stop admitting people, a Bar may stop serving, while a Medical Team remains operational.</w:t>
-      </w:r>
-    </w:p>
-    <w:p>
-      <w:pPr>
-        <w:spacing w:after="160" w:line="278" w:lineRule="auto"/>
-      </w:pPr>
-      <w:r>
-        <w:t>This gives the event enough nested structure and changing behaviour to make use of both the Composite and Observer patterns.</w:t>
-      </w:r>
-    </w:p>
-    <w:p>
-      <w:pPr>
+        <w:t>Question 1.</w:t>
+      </w:r>
+      <w:r>
         <w:rPr>
           <w:b/>
           <w:bCs/>
           <w:sz w:val="22"/>
           <w:szCs w:val="22"/>
         </w:rPr>
-      </w:pPr>
-      <w:r>
+        <w:t>2</w:t>
+      </w:r>
+    </w:p>
+    <w:p>
+      <w:pPr>
+        <w:spacing w:after="160" w:line="278" w:lineRule="auto"/>
+        <w:rPr>
+          <w:u w:val="single"/>
+        </w:rPr>
+      </w:pPr>
+      <w:r>
+        <w:rPr>
+          <w:u w:val="single"/>
+        </w:rPr>
+        <w:t>Composite Pattern</w:t>
+      </w:r>
+      <w:r>
+        <w:rPr>
+          <w:u w:val="single"/>
+        </w:rPr>
+        <w:t>:</w:t>
+      </w:r>
+    </w:p>
+    <w:p>
+      <w:pPr>
+        <w:spacing w:after="160" w:line="278" w:lineRule="auto"/>
+      </w:pPr>
+      <w:r>
+        <w:t xml:space="preserve">Component - </w:t>
+      </w:r>
+      <w:proofErr w:type="spellStart"/>
+      <w:r>
+        <w:t>EventComponent</w:t>
+      </w:r>
+      <w:proofErr w:type="spellEnd"/>
+    </w:p>
+    <w:p>
+      <w:pPr>
+        <w:spacing w:after="160" w:line="278" w:lineRule="auto"/>
+      </w:pPr>
+      <w:proofErr w:type="spellStart"/>
+      <w:r>
+        <w:t>EventComponent</w:t>
+      </w:r>
+      <w:proofErr w:type="spellEnd"/>
+      <w:r>
+        <w:t xml:space="preserve"> is the common base class for everything that forms part of the festival structure. It provides operations such as open(), close(), </w:t>
+      </w:r>
+      <w:proofErr w:type="spellStart"/>
+      <w:r>
+        <w:t>reportStatus</w:t>
+      </w:r>
+      <w:proofErr w:type="spellEnd"/>
+      <w:r>
+        <w:t xml:space="preserve">() and </w:t>
+      </w:r>
+      <w:proofErr w:type="spellStart"/>
+      <w:r>
+        <w:t>getCapacity</w:t>
+      </w:r>
+      <w:proofErr w:type="spellEnd"/>
+      <w:r>
+        <w:t>().</w:t>
+      </w:r>
+    </w:p>
+    <w:p>
+      <w:pPr>
+        <w:spacing w:after="160" w:line="278" w:lineRule="auto"/>
+      </w:pPr>
+      <w:r>
+        <w:t xml:space="preserve">Composite - </w:t>
+      </w:r>
+      <w:proofErr w:type="spellStart"/>
+      <w:r>
+        <w:t>EventGroup</w:t>
+      </w:r>
+      <w:proofErr w:type="spellEnd"/>
+    </w:p>
+    <w:p>
+      <w:pPr>
+        <w:spacing w:after="160" w:line="278" w:lineRule="auto"/>
+      </w:pPr>
+      <w:proofErr w:type="spellStart"/>
+      <w:r>
+        <w:t>EventGroup</w:t>
+      </w:r>
+      <w:proofErr w:type="spellEnd"/>
+      <w:r>
+        <w:t xml:space="preserve"> represents a group or area in the festival. Examples include the Festival Grounds, Main Stage Zone, River Stage Zone, Techno Stage Zone and Service Area. An </w:t>
+      </w:r>
+      <w:proofErr w:type="spellStart"/>
+      <w:r>
+        <w:t>EventGroup</w:t>
+      </w:r>
+      <w:proofErr w:type="spellEnd"/>
+      <w:r>
+        <w:t xml:space="preserve"> can contain both other </w:t>
+      </w:r>
+      <w:proofErr w:type="spellStart"/>
+      <w:r>
+        <w:t>EventGroup</w:t>
+      </w:r>
+      <w:proofErr w:type="spellEnd"/>
+      <w:r>
+        <w:t xml:space="preserve"> objects and individual event units.</w:t>
+      </w:r>
+    </w:p>
+    <w:p>
+      <w:pPr>
+        <w:spacing w:after="160" w:line="278" w:lineRule="auto"/>
+      </w:pPr>
+      <w:r>
+        <w:lastRenderedPageBreak/>
+        <w:t>Leaf - Concrete Event Units</w:t>
+      </w:r>
+    </w:p>
+    <w:p>
+      <w:pPr>
+        <w:spacing w:after="160" w:line="278" w:lineRule="auto"/>
+      </w:pPr>
+      <w:r>
+        <w:t xml:space="preserve">The Leaf classes are Stage, </w:t>
+      </w:r>
+      <w:proofErr w:type="spellStart"/>
+      <w:r>
+        <w:t>EntranceGate</w:t>
+      </w:r>
+      <w:proofErr w:type="spellEnd"/>
+      <w:r>
+        <w:t xml:space="preserve">, </w:t>
+      </w:r>
+      <w:proofErr w:type="spellStart"/>
+      <w:r>
+        <w:t>StageGate</w:t>
+      </w:r>
+      <w:proofErr w:type="spellEnd"/>
+      <w:r>
+        <w:t xml:space="preserve">, Bar, </w:t>
+      </w:r>
+      <w:proofErr w:type="spellStart"/>
+      <w:r>
+        <w:t>FoodVendor</w:t>
+      </w:r>
+      <w:proofErr w:type="spellEnd"/>
+      <w:r>
+        <w:t xml:space="preserve">, </w:t>
+      </w:r>
+      <w:proofErr w:type="spellStart"/>
+      <w:r>
+        <w:t>SecurityTeam</w:t>
+      </w:r>
+      <w:proofErr w:type="spellEnd"/>
+      <w:r>
+        <w:t xml:space="preserve"> and </w:t>
+      </w:r>
+      <w:proofErr w:type="spellStart"/>
+      <w:r>
+        <w:t>MedicalTeam</w:t>
+      </w:r>
+      <w:proofErr w:type="spellEnd"/>
+      <w:r>
+        <w:t>. These are individual units and do not contain other event components.</w:t>
+      </w:r>
+    </w:p>
+    <w:p>
+      <w:pPr>
+        <w:spacing w:after="160" w:line="278" w:lineRule="auto"/>
+      </w:pPr>
+      <w:r>
+        <w:t>Client - main.cpp</w:t>
+      </w:r>
+    </w:p>
+    <w:p>
+      <w:pPr>
+        <w:spacing w:after="160" w:line="278" w:lineRule="auto"/>
+      </w:pPr>
+      <w:r>
+        <w:t xml:space="preserve">main.cpp creates the festival structure and interacts with the event through the common </w:t>
+      </w:r>
+      <w:proofErr w:type="spellStart"/>
+      <w:r>
+        <w:t>EventComponent</w:t>
+      </w:r>
+      <w:proofErr w:type="spellEnd"/>
+      <w:r>
+        <w:t xml:space="preserve"> interface.</w:t>
+      </w:r>
+    </w:p>
+    <w:p>
+      <w:pPr>
+        <w:spacing w:after="160" w:line="278" w:lineRule="auto"/>
+        <w:rPr>
+          <w:u w:val="single"/>
+        </w:rPr>
+      </w:pPr>
+      <w:r>
+        <w:rPr>
+          <w:u w:val="single"/>
+        </w:rPr>
+        <w:t>Observer Pattern</w:t>
+      </w:r>
+      <w:r>
+        <w:rPr>
+          <w:u w:val="single"/>
+        </w:rPr>
+        <w:t>:</w:t>
+      </w:r>
+    </w:p>
+    <w:p>
+      <w:pPr>
+        <w:spacing w:after="160" w:line="278" w:lineRule="auto"/>
+      </w:pPr>
+      <w:r>
+        <w:t>Subject - Subject</w:t>
+      </w:r>
+    </w:p>
+    <w:p>
+      <w:pPr>
+        <w:spacing w:after="160" w:line="278" w:lineRule="auto"/>
+      </w:pPr>
+      <w:r>
+        <w:t>Subject provides the operations needed to register and remove observers using attach(), detach() and notify().</w:t>
+      </w:r>
+    </w:p>
+    <w:p>
+      <w:pPr>
+        <w:spacing w:after="160" w:line="278" w:lineRule="auto"/>
+      </w:pPr>
+      <w:r>
+        <w:t xml:space="preserve">Concrete Subject - </w:t>
+      </w:r>
+      <w:proofErr w:type="spellStart"/>
+      <w:r>
+        <w:t>EventControl</w:t>
+      </w:r>
+      <w:proofErr w:type="spellEnd"/>
+    </w:p>
+    <w:p>
+      <w:pPr>
+        <w:spacing w:after="160" w:line="278" w:lineRule="auto"/>
+      </w:pPr>
+      <w:proofErr w:type="spellStart"/>
+      <w:r>
+        <w:t>EventControl</w:t>
+      </w:r>
+      <w:proofErr w:type="spellEnd"/>
+      <w:r>
+        <w:t xml:space="preserve"> represents the central festival control centre. It creates and sends notices to registered observers.</w:t>
+      </w:r>
+    </w:p>
+    <w:p>
+      <w:pPr>
+        <w:spacing w:after="160" w:line="278" w:lineRule="auto"/>
+      </w:pPr>
+      <w:r>
+        <w:t>Observer - Observer</w:t>
+      </w:r>
+    </w:p>
+    <w:p>
+      <w:pPr>
+        <w:spacing w:after="160" w:line="278" w:lineRule="auto"/>
+      </w:pPr>
+      <w:r>
+        <w:t>Observer provides the common update() operation used by objects that receive notices.</w:t>
+      </w:r>
+    </w:p>
+    <w:p>
+      <w:pPr>
+        <w:spacing w:after="160" w:line="278" w:lineRule="auto"/>
+      </w:pPr>
+      <w:r>
+        <w:t>Concrete Observers - Event Units</w:t>
+      </w:r>
+    </w:p>
+    <w:p>
+      <w:pPr>
+        <w:spacing w:after="160" w:line="278" w:lineRule="auto"/>
+      </w:pPr>
+      <w:r>
+        <w:t xml:space="preserve">The concrete event units such as Stage, </w:t>
+      </w:r>
+      <w:proofErr w:type="spellStart"/>
+      <w:r>
+        <w:t>StageGate</w:t>
+      </w:r>
+      <w:proofErr w:type="spellEnd"/>
+      <w:r>
+        <w:t xml:space="preserve">, Bar, </w:t>
+      </w:r>
+      <w:proofErr w:type="spellStart"/>
+      <w:r>
+        <w:t>FoodVendor</w:t>
+      </w:r>
+      <w:proofErr w:type="spellEnd"/>
+      <w:r>
+        <w:t xml:space="preserve">, </w:t>
+      </w:r>
+      <w:proofErr w:type="spellStart"/>
+      <w:r>
+        <w:t>SecurityTeam</w:t>
+      </w:r>
+      <w:proofErr w:type="spellEnd"/>
+      <w:r>
+        <w:t xml:space="preserve"> and </w:t>
+      </w:r>
+      <w:proofErr w:type="spellStart"/>
+      <w:r>
+        <w:t>MedicalTeam</w:t>
+      </w:r>
+      <w:proofErr w:type="spellEnd"/>
+      <w:r>
+        <w:t xml:space="preserve"> act as observers. Each one responds differently when it receives a notice.</w:t>
+      </w:r>
+    </w:p>
+    <w:p>
+      <w:pPr>
+        <w:spacing w:after="160" w:line="278" w:lineRule="auto"/>
+      </w:pPr>
+      <w:proofErr w:type="spellStart"/>
+      <w:r>
+        <w:t>EventGroup</w:t>
+      </w:r>
+      <w:proofErr w:type="spellEnd"/>
+      <w:r>
+        <w:t xml:space="preserve"> as Observer and Subject</w:t>
+      </w:r>
+    </w:p>
+    <w:p>
+      <w:pPr>
+        <w:spacing w:after="160" w:line="278" w:lineRule="auto"/>
+      </w:pPr>
+      <w:proofErr w:type="spellStart"/>
+      <w:r>
+        <w:t>EventGroup</w:t>
+      </w:r>
+      <w:proofErr w:type="spellEnd"/>
+      <w:r>
+        <w:t xml:space="preserve"> has more than one role. It acts as an Observer when it receives a notice from another Subject. It then acts as a Subject by passing that notice to its own registered observers.</w:t>
+      </w:r>
+    </w:p>
+    <w:p>
+      <w:r>
+        <w:t>This is not a conflict because the roles are used for different purposes. The Composite role describes where the group exists in the festival structure</w:t>
+      </w:r>
+    </w:p>
+    <w:p/>
+    <w:p/>
+    <w:p/>
+    <w:p/>
+    <w:p/>
+    <w:p/>
+    <w:p/>
+    <w:p/>
+    <w:p/>
+    <w:p/>
+    <w:p/>
+    <w:p/>
+    <w:p/>
+    <w:p>
+      <w:pPr>
         <w:rPr>
           <w:b/>
           <w:bCs/>
           <w:sz w:val="22"/>
           <w:szCs w:val="22"/>
         </w:rPr>
-        <w:t>Question 1.</w:t>
-      </w:r>
+      </w:pPr>
       <w:r>
         <w:rPr>
           <w:b/>
@@ -478,389 +807,15 @@
           <w:sz w:val="22"/>
           <w:szCs w:val="22"/>
         </w:rPr>
-        <w:t>2</w:t>
-      </w:r>
-    </w:p>
-    <w:p>
-      <w:pPr>
-        <w:spacing w:after="160" w:line="278" w:lineRule="auto"/>
-        <w:rPr>
-          <w:u w:val="single"/>
-        </w:rPr>
-      </w:pPr>
-      <w:r>
-        <w:rPr>
-          <w:u w:val="single"/>
-        </w:rPr>
-        <w:t>Composite Pattern</w:t>
-      </w:r>
-      <w:r>
-        <w:rPr>
-          <w:u w:val="single"/>
-        </w:rPr>
-        <w:t>:</w:t>
-      </w:r>
-    </w:p>
-    <w:p>
-      <w:pPr>
-        <w:spacing w:after="160" w:line="278" w:lineRule="auto"/>
-      </w:pPr>
-      <w:r>
-        <w:t xml:space="preserve">Component - </w:t>
-      </w:r>
-      <w:proofErr w:type="spellStart"/>
-      <w:r>
-        <w:t>EventComponent</w:t>
-      </w:r>
-      <w:proofErr w:type="spellEnd"/>
-    </w:p>
-    <w:p>
-      <w:pPr>
-        <w:spacing w:after="160" w:line="278" w:lineRule="auto"/>
-      </w:pPr>
-      <w:proofErr w:type="spellStart"/>
-      <w:r>
-        <w:t>EventComponent</w:t>
-      </w:r>
-      <w:proofErr w:type="spellEnd"/>
-      <w:r>
-        <w:t xml:space="preserve"> is the common base class for everything that forms part of the festival structure. It provides operations such as open(), close(), </w:t>
-      </w:r>
-      <w:proofErr w:type="spellStart"/>
-      <w:r>
-        <w:t>reportStatus</w:t>
-      </w:r>
-      <w:proofErr w:type="spellEnd"/>
-      <w:r>
-        <w:t xml:space="preserve">() and </w:t>
-      </w:r>
-      <w:proofErr w:type="spellStart"/>
-      <w:r>
-        <w:t>getCapacity</w:t>
-      </w:r>
-      <w:proofErr w:type="spellEnd"/>
-      <w:r>
-        <w:t>().</w:t>
-      </w:r>
-    </w:p>
-    <w:p>
-      <w:pPr>
-        <w:spacing w:after="160" w:line="278" w:lineRule="auto"/>
-      </w:pPr>
-      <w:r>
-        <w:t xml:space="preserve">Composite - </w:t>
-      </w:r>
-      <w:proofErr w:type="spellStart"/>
-      <w:r>
-        <w:t>EventGroup</w:t>
-      </w:r>
-      <w:proofErr w:type="spellEnd"/>
-    </w:p>
-    <w:p>
-      <w:pPr>
-        <w:spacing w:after="160" w:line="278" w:lineRule="auto"/>
-      </w:pPr>
-      <w:proofErr w:type="spellStart"/>
-      <w:r>
-        <w:t>EventGroup</w:t>
-      </w:r>
-      <w:proofErr w:type="spellEnd"/>
-      <w:r>
-        <w:t xml:space="preserve"> represents a group or area in the festival. Examples include the Festival Grounds, Main Stage Zone, River Stage Zone, Techno Stage Zone and Service Area. An </w:t>
-      </w:r>
-      <w:proofErr w:type="spellStart"/>
-      <w:r>
-        <w:t>EventGroup</w:t>
-      </w:r>
-      <w:proofErr w:type="spellEnd"/>
-      <w:r>
-        <w:t xml:space="preserve"> can contain both other </w:t>
-      </w:r>
-      <w:proofErr w:type="spellStart"/>
-      <w:r>
-        <w:t>EventGroup</w:t>
-      </w:r>
-      <w:proofErr w:type="spellEnd"/>
-      <w:r>
-        <w:t xml:space="preserve"> objects and individual event units.</w:t>
-      </w:r>
-    </w:p>
-    <w:p>
-      <w:pPr>
-        <w:spacing w:after="160" w:line="278" w:lineRule="auto"/>
-      </w:pPr>
-      <w:r>
-        <w:lastRenderedPageBreak/>
-        <w:t>Leaf - Concrete Event Units</w:t>
-      </w:r>
-    </w:p>
-    <w:p>
-      <w:pPr>
-        <w:spacing w:after="160" w:line="278" w:lineRule="auto"/>
-      </w:pPr>
-      <w:r>
-        <w:t xml:space="preserve">The Leaf classes are Stage, </w:t>
-      </w:r>
-      <w:proofErr w:type="spellStart"/>
-      <w:r>
-        <w:t>EntranceGate</w:t>
-      </w:r>
-      <w:proofErr w:type="spellEnd"/>
-      <w:r>
-        <w:t xml:space="preserve">, </w:t>
-      </w:r>
-      <w:proofErr w:type="spellStart"/>
-      <w:r>
-        <w:t>StageGate</w:t>
-      </w:r>
-      <w:proofErr w:type="spellEnd"/>
-      <w:r>
-        <w:t xml:space="preserve">, Bar, </w:t>
-      </w:r>
-      <w:proofErr w:type="spellStart"/>
-      <w:r>
-        <w:t>FoodVendor</w:t>
-      </w:r>
-      <w:proofErr w:type="spellEnd"/>
-      <w:r>
-        <w:t xml:space="preserve">, </w:t>
-      </w:r>
-      <w:proofErr w:type="spellStart"/>
-      <w:r>
-        <w:t>SecurityTeam</w:t>
-      </w:r>
-      <w:proofErr w:type="spellEnd"/>
-      <w:r>
-        <w:t xml:space="preserve"> and </w:t>
-      </w:r>
-      <w:proofErr w:type="spellStart"/>
-      <w:r>
-        <w:t>MedicalTeam</w:t>
-      </w:r>
-      <w:proofErr w:type="spellEnd"/>
-      <w:r>
-        <w:t>. These are individual units and do not contain other event components.</w:t>
-      </w:r>
-    </w:p>
-    <w:p>
-      <w:pPr>
-        <w:spacing w:after="160" w:line="278" w:lineRule="auto"/>
-      </w:pPr>
-      <w:r>
-        <w:t>Client - main.cpp</w:t>
-      </w:r>
-    </w:p>
-    <w:p>
-      <w:pPr>
-        <w:spacing w:after="160" w:line="278" w:lineRule="auto"/>
-      </w:pPr>
-      <w:r>
-        <w:t xml:space="preserve">main.cpp creates the festival structure and interacts with the event through the common </w:t>
-      </w:r>
-      <w:proofErr w:type="spellStart"/>
-      <w:r>
-        <w:t>EventComponent</w:t>
-      </w:r>
-      <w:proofErr w:type="spellEnd"/>
-      <w:r>
-        <w:t xml:space="preserve"> interface.</w:t>
-      </w:r>
-    </w:p>
-    <w:p>
-      <w:pPr>
-        <w:spacing w:after="160" w:line="278" w:lineRule="auto"/>
-        <w:rPr>
-          <w:u w:val="single"/>
-        </w:rPr>
-      </w:pPr>
-      <w:r>
-        <w:rPr>
-          <w:u w:val="single"/>
-        </w:rPr>
-        <w:t>Observer Pattern</w:t>
-      </w:r>
-      <w:r>
-        <w:rPr>
-          <w:u w:val="single"/>
-        </w:rPr>
-        <w:t>:</w:t>
-      </w:r>
-    </w:p>
-    <w:p>
-      <w:pPr>
-        <w:spacing w:after="160" w:line="278" w:lineRule="auto"/>
-      </w:pPr>
-      <w:r>
-        <w:t>Subject - Subject</w:t>
-      </w:r>
-    </w:p>
-    <w:p>
-      <w:pPr>
-        <w:spacing w:after="160" w:line="278" w:lineRule="auto"/>
-      </w:pPr>
-      <w:r>
-        <w:t>Subject provides the operations needed to register and remove observers using attach(), detach() and notify().</w:t>
-      </w:r>
-    </w:p>
-    <w:p>
-      <w:pPr>
-        <w:spacing w:after="160" w:line="278" w:lineRule="auto"/>
-      </w:pPr>
-      <w:r>
-        <w:t xml:space="preserve">Concrete Subject - </w:t>
-      </w:r>
-      <w:proofErr w:type="spellStart"/>
-      <w:r>
-        <w:t>EventControl</w:t>
-      </w:r>
-      <w:proofErr w:type="spellEnd"/>
-    </w:p>
-    <w:p>
-      <w:pPr>
-        <w:spacing w:after="160" w:line="278" w:lineRule="auto"/>
-      </w:pPr>
-      <w:proofErr w:type="spellStart"/>
-      <w:r>
-        <w:t>EventControl</w:t>
-      </w:r>
-      <w:proofErr w:type="spellEnd"/>
-      <w:r>
-        <w:t xml:space="preserve"> represents the central festival control centre. It creates and sends notices to registered observers.</w:t>
-      </w:r>
-    </w:p>
-    <w:p>
-      <w:pPr>
-        <w:spacing w:after="160" w:line="278" w:lineRule="auto"/>
-      </w:pPr>
-      <w:r>
-        <w:t>Observer - Observer</w:t>
-      </w:r>
-    </w:p>
-    <w:p>
-      <w:pPr>
-        <w:spacing w:after="160" w:line="278" w:lineRule="auto"/>
-      </w:pPr>
-      <w:r>
-        <w:t>Observer provides the common update() operation used by objects that receive notices.</w:t>
-      </w:r>
-    </w:p>
-    <w:p>
-      <w:pPr>
-        <w:spacing w:after="160" w:line="278" w:lineRule="auto"/>
-      </w:pPr>
-      <w:r>
-        <w:t>Concrete Observers - Event Units</w:t>
-      </w:r>
-    </w:p>
-    <w:p>
-      <w:pPr>
-        <w:spacing w:after="160" w:line="278" w:lineRule="auto"/>
-      </w:pPr>
-      <w:r>
-        <w:t xml:space="preserve">The concrete event units such as Stage, </w:t>
-      </w:r>
-      <w:proofErr w:type="spellStart"/>
-      <w:r>
-        <w:t>StageGate</w:t>
-      </w:r>
-      <w:proofErr w:type="spellEnd"/>
-      <w:r>
-        <w:t xml:space="preserve">, Bar, </w:t>
-      </w:r>
-      <w:proofErr w:type="spellStart"/>
-      <w:r>
-        <w:t>FoodVendor</w:t>
-      </w:r>
-      <w:proofErr w:type="spellEnd"/>
-      <w:r>
-        <w:t xml:space="preserve">, </w:t>
-      </w:r>
-      <w:proofErr w:type="spellStart"/>
-      <w:r>
-        <w:t>SecurityTeam</w:t>
-      </w:r>
-      <w:proofErr w:type="spellEnd"/>
-      <w:r>
-        <w:t xml:space="preserve"> and </w:t>
-      </w:r>
-      <w:proofErr w:type="spellStart"/>
-      <w:r>
-        <w:t>MedicalTeam</w:t>
-      </w:r>
-      <w:proofErr w:type="spellEnd"/>
-      <w:r>
-        <w:t xml:space="preserve"> act as observers. Each one responds differently when it receives a notice.</w:t>
-      </w:r>
-    </w:p>
-    <w:p>
-      <w:pPr>
-        <w:spacing w:after="160" w:line="278" w:lineRule="auto"/>
-      </w:pPr>
-      <w:proofErr w:type="spellStart"/>
-      <w:r>
-        <w:t>EventGroup</w:t>
-      </w:r>
-      <w:proofErr w:type="spellEnd"/>
-      <w:r>
-        <w:t xml:space="preserve"> as Observer and Subject</w:t>
-      </w:r>
-    </w:p>
-    <w:p>
-      <w:pPr>
-        <w:spacing w:after="160" w:line="278" w:lineRule="auto"/>
-      </w:pPr>
-      <w:proofErr w:type="spellStart"/>
-      <w:r>
-        <w:t>EventGroup</w:t>
-      </w:r>
-      <w:proofErr w:type="spellEnd"/>
-      <w:r>
-        <w:t xml:space="preserve"> has more than one role. It acts as an Observer when it receives a notice from another Subject. It then acts as a Subject by passing that notice to its own registered observers.</w:t>
-      </w:r>
-    </w:p>
-    <w:p>
-      <w:r>
-        <w:t>This is not a conflict because the roles are used for different purposes. The Composite role describes where the group exists in the festival structure</w:t>
-      </w:r>
-    </w:p>
-    <w:p/>
-    <w:p/>
-    <w:p/>
-    <w:p/>
-    <w:p/>
-    <w:p/>
-    <w:p/>
-    <w:p/>
-    <w:p/>
-    <w:p/>
-    <w:p/>
-    <w:p/>
-    <w:p/>
-    <w:p>
-      <w:pPr>
+        <w:t>Question 1.</w:t>
+      </w:r>
+      <w:r>
         <w:rPr>
           <w:b/>
           <w:bCs/>
           <w:sz w:val="22"/>
           <w:szCs w:val="22"/>
         </w:rPr>
-      </w:pPr>
-      <w:r>
-        <w:rPr>
-          <w:b/>
-          <w:bCs/>
-          <w:sz w:val="22"/>
-          <w:szCs w:val="22"/>
-        </w:rPr>
-        <w:t>Question 1.</w:t>
-      </w:r>
-      <w:r>
-        <w:rPr>
-          <w:b/>
-          <w:bCs/>
-          <w:sz w:val="22"/>
-          <w:szCs w:val="22"/>
-        </w:rPr>
         <w:t>3</w:t>
       </w:r>
     </w:p>
@@ -881,7 +836,7 @@
           <w:noProof/>
         </w:rPr>
         <w:drawing>
-          <wp:anchor distT="0" distB="0" distL="114300" distR="114300" simplePos="0" relativeHeight="251658240" behindDoc="0" locked="0" layoutInCell="1" allowOverlap="1" wp14:anchorId="2C20E90C" wp14:editId="05ADBF54">
+          <wp:anchor distT="0" distB="0" distL="114300" distR="114300" simplePos="0" relativeHeight="251658240" behindDoc="0" locked="0" layoutInCell="1" allowOverlap="1" wp14:anchorId="2C20E90C" wp14:editId="0022C332">
             <wp:simplePos x="0" y="0"/>
             <wp:positionH relativeFrom="margin">
               <wp:align>center</wp:align>
@@ -1265,11 +1220,11 @@
       </w:r>
       <w:proofErr w:type="gramStart"/>
       <w:r>
-        <w:t>Subject::</w:t>
+        <w:t>Subject::attach(</w:t>
       </w:r>
       <w:proofErr w:type="gramEnd"/>
       <w:r>
-        <w:t>attach(Observer* observer), the method scans the vector to verify whether observer is already registered. Duplicate entries are rejected to prevent multi-triggering during a single notify() pass.</w:t>
+        <w:t>Observer* observer), the method scans the vector to verify whether observer is already registered. Duplicate entries are rejected to prevent multi-triggering during a single notify() pass.</w:t>
       </w:r>
     </w:p>
     <w:p>
@@ -1389,11 +1344,11 @@
       </w:r>
       <w:proofErr w:type="gramStart"/>
       <w:r>
-        <w:t>Subject::</w:t>
+        <w:t>Subject::notify(</w:t>
       </w:r>
       <w:proofErr w:type="gramEnd"/>
       <w:r>
-        <w:t xml:space="preserve">notify() will dereference a dangling pointer, causing undefined </w:t>
+        <w:t xml:space="preserve">) will dereference a dangling pointer, causing undefined </w:t>
       </w:r>
       <w:proofErr w:type="spellStart"/>
       <w:r>
@@ -1543,10 +1498,18 @@
     </w:p>
     <w:p>
       <w:r>
-        <w:t xml:space="preserve">The detach() algorithm uses </w:t>
+        <w:t xml:space="preserve">The </w:t>
       </w:r>
       <w:proofErr w:type="gramStart"/>
       <w:r>
+        <w:t>detach(</w:t>
+      </w:r>
+      <w:proofErr w:type="gramEnd"/>
+      <w:r>
+        <w:t xml:space="preserve">) algorithm uses </w:t>
+      </w:r>
+      <w:proofErr w:type="gramStart"/>
+      <w:r>
         <w:t>std::vector::</w:t>
       </w:r>
       <w:proofErr w:type="gramEnd"/>
@@ -1567,7 +1530,15 @@
       </w:r>
       <w:proofErr w:type="spellEnd"/>
       <w:r>
-        <w:t>, ensuring the notify() iteration never touches unallocated address space.</w:t>
+        <w:t xml:space="preserve">, ensuring the </w:t>
+      </w:r>
+      <w:proofErr w:type="gramStart"/>
+      <w:r>
+        <w:t>notify(</w:t>
+      </w:r>
+      <w:proofErr w:type="gramEnd"/>
+      <w:r>
+        <w:t>) iteration never touches unallocated address space.</w:t>
       </w:r>
     </w:p>
     <w:p>
@@ -3502,13 +3473,10 @@
       </w:r>
       <w:proofErr w:type="gramStart"/>
       <w:r>
-        <w:t>Observer::</w:t>
-      </w:r>
+        <w:t>Observer::update(</w:t>
+      </w:r>
+      <w:proofErr w:type="spellStart"/>
       <w:proofErr w:type="gramEnd"/>
-      <w:r>
-        <w:t>update(</w:t>
-      </w:r>
-      <w:proofErr w:type="spellStart"/>
       <w:r>
         <w:t>const</w:t>
       </w:r>
@@ -3568,15 +3536,7 @@
       </w:r>
       <w:proofErr w:type="spellEnd"/>
       <w:r>
-        <w:t xml:space="preserve"> (acting as a Subject for its internal scope) forwards the notice down to all child components by invoking this-&gt;notify(notice). If the target matched the group name, it overrides the child target </w:t>
-      </w:r>
-      <w:proofErr w:type="gramStart"/>
-      <w:r>
-        <w:t>filter</w:t>
-      </w:r>
-      <w:proofErr w:type="gramEnd"/>
-      <w:r>
-        <w:t xml:space="preserve"> so sub-units react uniformly.</w:t>
+        <w:t xml:space="preserve"> (acting as a Subject for its internal scope) forwards the notice down to all child components by invoking this-&gt;notify(notice). If the target matched the group name, it overrides the child target filter so sub-units react uniformly.</w:t>
       </w:r>
     </w:p>
     <w:p>
@@ -3700,11 +3660,16 @@
       </w:r>
       <w:proofErr w:type="gramStart"/>
       <w:r>
-        <w:t>Subject::</w:t>
-      </w:r>
+        <w:t>Subject::notify(</w:t>
+      </w:r>
+      <w:proofErr w:type="spellStart"/>
       <w:proofErr w:type="gramEnd"/>
       <w:r>
-        <w:t>notify(</w:t>
+        <w:t>const</w:t>
+      </w:r>
+      <w:proofErr w:type="spellEnd"/>
+      <w:r>
+        <w:t xml:space="preserve"> Notice&amp; notice) is called, the Subject directly passes a fully instantiated </w:t>
       </w:r>
       <w:proofErr w:type="spellStart"/>
       <w:r>
@@ -3712,25 +3677,14 @@
       </w:r>
       <w:proofErr w:type="spellEnd"/>
       <w:r>
-        <w:t xml:space="preserve"> Notice&amp; notice) is called, the Subject directly passes a fully instantiated </w:t>
+        <w:t xml:space="preserve"> Notice&amp; payload into </w:t>
+      </w:r>
+      <w:proofErr w:type="gramStart"/>
+      <w:r>
+        <w:t>Observer::update(</w:t>
       </w:r>
       <w:proofErr w:type="spellStart"/>
-      <w:r>
-        <w:t>const</w:t>
-      </w:r>
-      <w:proofErr w:type="spellEnd"/>
-      <w:r>
-        <w:t xml:space="preserve"> Notice&amp; payload into </w:t>
-      </w:r>
-      <w:proofErr w:type="gramStart"/>
-      <w:r>
-        <w:t>Observer::</w:t>
-      </w:r>
       <w:proofErr w:type="gramEnd"/>
-      <w:r>
-        <w:t>update(</w:t>
-      </w:r>
-      <w:proofErr w:type="spellStart"/>
       <w:r>
         <w:t>const</w:t>
       </w:r>
@@ -3787,21 +3741,12 @@
           <w:numId w:val="20"/>
         </w:numPr>
       </w:pPr>
-      <w:proofErr w:type="gramStart"/>
       <w:r>
         <w:rPr>
           <w:b/>
           <w:bCs/>
         </w:rPr>
-        <w:t>Loose</w:t>
-      </w:r>
-      <w:proofErr w:type="gramEnd"/>
-      <w:r>
-        <w:rPr>
-          <w:b/>
-          <w:bCs/>
-        </w:rPr>
-        <w:t xml:space="preserve"> Coupling (Observer </w:t>
+        <w:t xml:space="preserve">Loose Coupling (Observer </w:t>
       </w:r>
       <m:oMath>
         <m:r>
@@ -3857,11 +3802,643 @@
       </w:r>
     </w:p>
     <w:p/>
+    <w:p/>
+    <w:p/>
+    <w:p/>
+    <w:p/>
+    <w:p/>
+    <w:p/>
+    <w:p/>
+    <w:p/>
+    <w:p/>
+    <w:p/>
+    <w:p/>
+    <w:p/>
+    <w:p/>
+    <w:p/>
+    <w:p/>
     <w:p>
       <w:pPr>
         <w:pStyle w:val="Heading1"/>
       </w:pPr>
       <w:r>
+        <w:lastRenderedPageBreak/>
+        <w:t xml:space="preserve">TASK </w:t>
+      </w:r>
+      <w:r>
+        <w:t>5</w:t>
+      </w:r>
+    </w:p>
+    <w:p>
+      <w:pPr>
+        <w:rPr>
+          <w:b/>
+          <w:bCs/>
+          <w:sz w:val="22"/>
+          <w:szCs w:val="22"/>
+        </w:rPr>
+      </w:pPr>
+      <w:r>
+        <w:rPr>
+          <w:noProof/>
+        </w:rPr>
+        <w:drawing>
+          <wp:anchor distT="0" distB="0" distL="114300" distR="114300" simplePos="0" relativeHeight="251660288" behindDoc="0" locked="0" layoutInCell="1" allowOverlap="1" wp14:anchorId="06970014" wp14:editId="44452981">
+            <wp:simplePos x="0" y="0"/>
+            <wp:positionH relativeFrom="column">
+              <wp:posOffset>-772160</wp:posOffset>
+            </wp:positionH>
+            <wp:positionV relativeFrom="paragraph">
+              <wp:posOffset>178435</wp:posOffset>
+            </wp:positionV>
+            <wp:extent cx="7286625" cy="3286760"/>
+            <wp:effectExtent l="0" t="0" r="9525" b="8890"/>
+            <wp:wrapSquare wrapText="bothSides"/>
+            <wp:docPr id="1338608177" name="Picture 4"/>
+            <wp:cNvGraphicFramePr>
+              <a:graphicFrameLocks xmlns:a="http://schemas.openxmlformats.org/drawingml/2006/main" noChangeAspect="1"/>
+            </wp:cNvGraphicFramePr>
+            <a:graphic xmlns:a="http://schemas.openxmlformats.org/drawingml/2006/main">
+              <a:graphicData uri="http://schemas.openxmlformats.org/drawingml/2006/picture">
+                <pic:pic xmlns:pic="http://schemas.openxmlformats.org/drawingml/2006/picture">
+                  <pic:nvPicPr>
+                    <pic:cNvPr id="1338608177" name="Picture 1338608177"/>
+                    <pic:cNvPicPr/>
+                  </pic:nvPicPr>
+                  <pic:blipFill>
+                    <a:blip r:embed="rId9">
+                      <a:extLst>
+                        <a:ext uri="{28A0092B-C50C-407E-A947-70E740481C1C}">
+                          <a14:useLocalDpi xmlns:a14="http://schemas.microsoft.com/office/drawing/2010/main" val="0"/>
+                        </a:ext>
+                      </a:extLst>
+                    </a:blip>
+                    <a:stretch>
+                      <a:fillRect/>
+                    </a:stretch>
+                  </pic:blipFill>
+                  <pic:spPr>
+                    <a:xfrm>
+                      <a:off x="0" y="0"/>
+                      <a:ext cx="7286625" cy="3286760"/>
+                    </a:xfrm>
+                    <a:prstGeom prst="rect">
+                      <a:avLst/>
+                    </a:prstGeom>
+                  </pic:spPr>
+                </pic:pic>
+              </a:graphicData>
+            </a:graphic>
+            <wp14:sizeRelH relativeFrom="margin">
+              <wp14:pctWidth>0</wp14:pctWidth>
+            </wp14:sizeRelH>
+            <wp14:sizeRelV relativeFrom="margin">
+              <wp14:pctHeight>0</wp14:pctHeight>
+            </wp14:sizeRelV>
+          </wp:anchor>
+        </w:drawing>
+      </w:r>
+      <w:r>
+        <w:rPr>
+          <w:b/>
+          <w:bCs/>
+          <w:sz w:val="22"/>
+          <w:szCs w:val="22"/>
+        </w:rPr>
+        <w:t>Task</w:t>
+      </w:r>
+      <w:r>
+        <w:rPr>
+          <w:b/>
+          <w:bCs/>
+          <w:sz w:val="22"/>
+          <w:szCs w:val="22"/>
+        </w:rPr>
+        <w:t xml:space="preserve"> </w:t>
+      </w:r>
+      <w:r>
+        <w:rPr>
+          <w:b/>
+          <w:bCs/>
+          <w:sz w:val="22"/>
+          <w:szCs w:val="22"/>
+        </w:rPr>
+        <w:t>5</w:t>
+      </w:r>
+      <w:r>
+        <w:rPr>
+          <w:b/>
+          <w:bCs/>
+          <w:sz w:val="22"/>
+          <w:szCs w:val="22"/>
+        </w:rPr>
+        <w:t>.</w:t>
+      </w:r>
+      <w:r>
+        <w:rPr>
+          <w:b/>
+          <w:bCs/>
+          <w:sz w:val="22"/>
+          <w:szCs w:val="22"/>
+        </w:rPr>
+        <w:t>1</w:t>
+      </w:r>
+    </w:p>
+    <w:p/>
+    <w:p/>
+    <w:p/>
+    <w:p/>
+    <w:p/>
+    <w:p/>
+    <w:p/>
+    <w:p/>
+    <w:p/>
+    <w:p/>
+    <w:p/>
+    <w:p/>
+    <w:p/>
+    <w:p/>
+    <w:p/>
+    <w:p/>
+    <w:p/>
+    <w:p/>
+    <w:p/>
+    <w:p/>
+    <w:p/>
+    <w:p>
+      <w:r>
+        <w:rPr>
+          <w:b/>
+          <w:bCs/>
+          <w:sz w:val="22"/>
+          <w:szCs w:val="22"/>
+        </w:rPr>
+        <w:lastRenderedPageBreak/>
+        <w:t>Task</w:t>
+      </w:r>
+      <w:r>
+        <w:rPr>
+          <w:b/>
+          <w:bCs/>
+          <w:sz w:val="22"/>
+          <w:szCs w:val="22"/>
+        </w:rPr>
+        <w:t xml:space="preserve"> </w:t>
+      </w:r>
+      <w:r>
+        <w:rPr>
+          <w:b/>
+          <w:bCs/>
+          <w:sz w:val="22"/>
+          <w:szCs w:val="22"/>
+        </w:rPr>
+        <w:t>5</w:t>
+      </w:r>
+      <w:r>
+        <w:rPr>
+          <w:b/>
+          <w:bCs/>
+          <w:sz w:val="22"/>
+          <w:szCs w:val="22"/>
+        </w:rPr>
+        <w:t>.</w:t>
+      </w:r>
+      <w:r>
+        <w:rPr>
+          <w:b/>
+          <w:bCs/>
+          <w:sz w:val="22"/>
+          <w:szCs w:val="22"/>
+        </w:rPr>
+        <w:t>2</w:t>
+      </w:r>
+    </w:p>
+    <w:p/>
+    <w:p/>
+    <w:p/>
+    <w:p/>
+    <w:p/>
+    <w:p/>
+    <w:p/>
+    <w:p/>
+    <w:p/>
+    <w:p/>
+    <w:p/>
+    <w:p>
+      <w:r>
+        <w:rPr>
+          <w:noProof/>
+        </w:rPr>
+        <w:drawing>
+          <wp:anchor distT="0" distB="0" distL="114300" distR="114300" simplePos="0" relativeHeight="251661312" behindDoc="0" locked="0" layoutInCell="1" allowOverlap="1" wp14:anchorId="5C19BA4C" wp14:editId="5AE78D40">
+            <wp:simplePos x="0" y="0"/>
+            <wp:positionH relativeFrom="column">
+              <wp:posOffset>-2886710</wp:posOffset>
+            </wp:positionH>
+            <wp:positionV relativeFrom="paragraph">
+              <wp:posOffset>276860</wp:posOffset>
+            </wp:positionV>
+            <wp:extent cx="8122285" cy="2490470"/>
+            <wp:effectExtent l="0" t="3492" r="8572" b="8573"/>
+            <wp:wrapSquare wrapText="bothSides"/>
+            <wp:docPr id="604754158" name="Picture 5"/>
+            <wp:cNvGraphicFramePr>
+              <a:graphicFrameLocks xmlns:a="http://schemas.openxmlformats.org/drawingml/2006/main" noChangeAspect="1"/>
+            </wp:cNvGraphicFramePr>
+            <a:graphic xmlns:a="http://schemas.openxmlformats.org/drawingml/2006/main">
+              <a:graphicData uri="http://schemas.openxmlformats.org/drawingml/2006/picture">
+                <pic:pic xmlns:pic="http://schemas.openxmlformats.org/drawingml/2006/picture">
+                  <pic:nvPicPr>
+                    <pic:cNvPr id="604754158" name="Picture 604754158"/>
+                    <pic:cNvPicPr/>
+                  </pic:nvPicPr>
+                  <pic:blipFill>
+                    <a:blip r:embed="rId10" cstate="print">
+                      <a:extLst>
+                        <a:ext uri="{28A0092B-C50C-407E-A947-70E740481C1C}">
+                          <a14:useLocalDpi xmlns:a14="http://schemas.microsoft.com/office/drawing/2010/main" val="0"/>
+                        </a:ext>
+                      </a:extLst>
+                    </a:blip>
+                    <a:stretch>
+                      <a:fillRect/>
+                    </a:stretch>
+                  </pic:blipFill>
+                  <pic:spPr>
+                    <a:xfrm rot="16200000">
+                      <a:off x="0" y="0"/>
+                      <a:ext cx="8122285" cy="2490470"/>
+                    </a:xfrm>
+                    <a:prstGeom prst="rect">
+                      <a:avLst/>
+                    </a:prstGeom>
+                  </pic:spPr>
+                </pic:pic>
+              </a:graphicData>
+            </a:graphic>
+            <wp14:sizeRelH relativeFrom="margin">
+              <wp14:pctWidth>0</wp14:pctWidth>
+            </wp14:sizeRelH>
+            <wp14:sizeRelV relativeFrom="margin">
+              <wp14:pctHeight>0</wp14:pctHeight>
+            </wp14:sizeRelV>
+          </wp:anchor>
+        </w:drawing>
+      </w:r>
+    </w:p>
+    <w:p/>
+    <w:p/>
+    <w:p/>
+    <w:p/>
+    <w:p/>
+    <w:p/>
+    <w:p/>
+    <w:p/>
+    <w:p/>
+    <w:p/>
+    <w:p/>
+    <w:p/>
+    <w:p/>
+    <w:p/>
+    <w:p/>
+    <w:p/>
+    <w:p/>
+    <w:p/>
+    <w:p/>
+    <w:p/>
+    <w:p/>
+    <w:p/>
+    <w:p/>
+    <w:p>
+      <w:r>
+        <w:rPr>
+          <w:b/>
+          <w:bCs/>
+          <w:sz w:val="22"/>
+          <w:szCs w:val="22"/>
+        </w:rPr>
+        <w:lastRenderedPageBreak/>
+        <w:t>Task</w:t>
+      </w:r>
+      <w:r>
+        <w:rPr>
+          <w:b/>
+          <w:bCs/>
+          <w:sz w:val="22"/>
+          <w:szCs w:val="22"/>
+        </w:rPr>
+        <w:t xml:space="preserve"> </w:t>
+      </w:r>
+      <w:r>
+        <w:rPr>
+          <w:b/>
+          <w:bCs/>
+          <w:sz w:val="22"/>
+          <w:szCs w:val="22"/>
+        </w:rPr>
+        <w:t>5</w:t>
+      </w:r>
+      <w:r>
+        <w:rPr>
+          <w:b/>
+          <w:bCs/>
+          <w:sz w:val="22"/>
+          <w:szCs w:val="22"/>
+        </w:rPr>
+        <w:t>.</w:t>
+      </w:r>
+      <w:r>
+        <w:rPr>
+          <w:b/>
+          <w:bCs/>
+          <w:sz w:val="22"/>
+          <w:szCs w:val="22"/>
+        </w:rPr>
+        <w:t>3</w:t>
+      </w:r>
+    </w:p>
+    <w:p/>
+    <w:p/>
+    <w:p/>
+    <w:p/>
+    <w:p/>
+    <w:p/>
+    <w:p/>
+    <w:p/>
+    <w:p/>
+    <w:p>
+      <w:r>
+        <w:rPr>
+          <w:noProof/>
+        </w:rPr>
+        <w:drawing>
+          <wp:anchor distT="0" distB="0" distL="114300" distR="114300" simplePos="0" relativeHeight="251662336" behindDoc="0" locked="0" layoutInCell="1" allowOverlap="1" wp14:anchorId="2690434E" wp14:editId="203636F8">
+            <wp:simplePos x="0" y="0"/>
+            <wp:positionH relativeFrom="column">
+              <wp:posOffset>-2387600</wp:posOffset>
+            </wp:positionH>
+            <wp:positionV relativeFrom="paragraph">
+              <wp:posOffset>355600</wp:posOffset>
+            </wp:positionV>
+            <wp:extent cx="8114665" cy="3480435"/>
+            <wp:effectExtent l="0" t="6985" r="0" b="0"/>
+            <wp:wrapSquare wrapText="bothSides"/>
+            <wp:docPr id="1633173369" name="Picture 6"/>
+            <wp:cNvGraphicFramePr>
+              <a:graphicFrameLocks xmlns:a="http://schemas.openxmlformats.org/drawingml/2006/main" noChangeAspect="1"/>
+            </wp:cNvGraphicFramePr>
+            <a:graphic xmlns:a="http://schemas.openxmlformats.org/drawingml/2006/main">
+              <a:graphicData uri="http://schemas.openxmlformats.org/drawingml/2006/picture">
+                <pic:pic xmlns:pic="http://schemas.openxmlformats.org/drawingml/2006/picture">
+                  <pic:nvPicPr>
+                    <pic:cNvPr id="1633173369" name="Picture 1633173369"/>
+                    <pic:cNvPicPr/>
+                  </pic:nvPicPr>
+                  <pic:blipFill>
+                    <a:blip r:embed="rId11" cstate="print">
+                      <a:extLst>
+                        <a:ext uri="{28A0092B-C50C-407E-A947-70E740481C1C}">
+                          <a14:useLocalDpi xmlns:a14="http://schemas.microsoft.com/office/drawing/2010/main" val="0"/>
+                        </a:ext>
+                      </a:extLst>
+                    </a:blip>
+                    <a:stretch>
+                      <a:fillRect/>
+                    </a:stretch>
+                  </pic:blipFill>
+                  <pic:spPr>
+                    <a:xfrm rot="16200000">
+                      <a:off x="0" y="0"/>
+                      <a:ext cx="8114665" cy="3480435"/>
+                    </a:xfrm>
+                    <a:prstGeom prst="rect">
+                      <a:avLst/>
+                    </a:prstGeom>
+                  </pic:spPr>
+                </pic:pic>
+              </a:graphicData>
+            </a:graphic>
+            <wp14:sizeRelH relativeFrom="margin">
+              <wp14:pctWidth>0</wp14:pctWidth>
+            </wp14:sizeRelH>
+            <wp14:sizeRelV relativeFrom="margin">
+              <wp14:pctHeight>0</wp14:pctHeight>
+            </wp14:sizeRelV>
+          </wp:anchor>
+        </w:drawing>
+      </w:r>
+    </w:p>
+    <w:p/>
+    <w:p/>
+    <w:p/>
+    <w:p/>
+    <w:p/>
+    <w:p/>
+    <w:p/>
+    <w:p/>
+    <w:p/>
+    <w:p/>
+    <w:p/>
+    <w:p/>
+    <w:p/>
+    <w:p/>
+    <w:p/>
+    <w:p/>
+    <w:p/>
+    <w:p/>
+    <w:p/>
+    <w:p/>
+    <w:p/>
+    <w:p/>
+    <w:p/>
+    <w:p/>
+    <w:p/>
+    <w:p>
+      <w:r>
+        <w:rPr>
+          <w:b/>
+          <w:bCs/>
+          <w:sz w:val="22"/>
+          <w:szCs w:val="22"/>
+        </w:rPr>
+        <w:lastRenderedPageBreak/>
+        <w:t>Task</w:t>
+      </w:r>
+      <w:r>
+        <w:rPr>
+          <w:b/>
+          <w:bCs/>
+          <w:sz w:val="22"/>
+          <w:szCs w:val="22"/>
+        </w:rPr>
+        <w:t xml:space="preserve"> </w:t>
+      </w:r>
+      <w:r>
+        <w:rPr>
+          <w:b/>
+          <w:bCs/>
+          <w:sz w:val="22"/>
+          <w:szCs w:val="22"/>
+        </w:rPr>
+        <w:t>5</w:t>
+      </w:r>
+      <w:r>
+        <w:rPr>
+          <w:b/>
+          <w:bCs/>
+          <w:sz w:val="22"/>
+          <w:szCs w:val="22"/>
+        </w:rPr>
+        <w:t>.</w:t>
+      </w:r>
+      <w:r>
+        <w:rPr>
+          <w:b/>
+          <w:bCs/>
+          <w:sz w:val="22"/>
+          <w:szCs w:val="22"/>
+        </w:rPr>
+        <w:t>4</w:t>
+      </w:r>
+    </w:p>
+    <w:p>
+      <w:r>
+        <w:rPr>
+          <w:noProof/>
+        </w:rPr>
+        <w:drawing>
+          <wp:anchor distT="0" distB="0" distL="114300" distR="114300" simplePos="0" relativeHeight="251663360" behindDoc="0" locked="0" layoutInCell="1" allowOverlap="1" wp14:anchorId="26E35126" wp14:editId="7C4C8FD1">
+            <wp:simplePos x="0" y="0"/>
+            <wp:positionH relativeFrom="column">
+              <wp:posOffset>-1785620</wp:posOffset>
+            </wp:positionH>
+            <wp:positionV relativeFrom="paragraph">
+              <wp:posOffset>1994535</wp:posOffset>
+            </wp:positionV>
+            <wp:extent cx="8345170" cy="4789805"/>
+            <wp:effectExtent l="6032" t="0" r="4763" b="4762"/>
+            <wp:wrapSquare wrapText="bothSides"/>
+            <wp:docPr id="1339413032" name="Picture 8"/>
+            <wp:cNvGraphicFramePr>
+              <a:graphicFrameLocks xmlns:a="http://schemas.openxmlformats.org/drawingml/2006/main" noChangeAspect="1"/>
+            </wp:cNvGraphicFramePr>
+            <a:graphic xmlns:a="http://schemas.openxmlformats.org/drawingml/2006/main">
+              <a:graphicData uri="http://schemas.openxmlformats.org/drawingml/2006/picture">
+                <pic:pic xmlns:pic="http://schemas.openxmlformats.org/drawingml/2006/picture">
+                  <pic:nvPicPr>
+                    <pic:cNvPr id="1339413032" name="Picture 1339413032"/>
+                    <pic:cNvPicPr/>
+                  </pic:nvPicPr>
+                  <pic:blipFill>
+                    <a:blip r:embed="rId12" cstate="print">
+                      <a:extLst>
+                        <a:ext uri="{28A0092B-C50C-407E-A947-70E740481C1C}">
+                          <a14:useLocalDpi xmlns:a14="http://schemas.microsoft.com/office/drawing/2010/main" val="0"/>
+                        </a:ext>
+                      </a:extLst>
+                    </a:blip>
+                    <a:stretch>
+                      <a:fillRect/>
+                    </a:stretch>
+                  </pic:blipFill>
+                  <pic:spPr>
+                    <a:xfrm rot="16200000">
+                      <a:off x="0" y="0"/>
+                      <a:ext cx="8345170" cy="4789805"/>
+                    </a:xfrm>
+                    <a:prstGeom prst="rect">
+                      <a:avLst/>
+                    </a:prstGeom>
+                  </pic:spPr>
+                </pic:pic>
+              </a:graphicData>
+            </a:graphic>
+            <wp14:sizeRelH relativeFrom="margin">
+              <wp14:pctWidth>0</wp14:pctWidth>
+            </wp14:sizeRelH>
+            <wp14:sizeRelV relativeFrom="margin">
+              <wp14:pctHeight>0</wp14:pctHeight>
+            </wp14:sizeRelV>
+          </wp:anchor>
+        </w:drawing>
+      </w:r>
+    </w:p>
+    <w:p>
+      <w:pPr>
+        <w:pStyle w:val="Heading1"/>
+      </w:pPr>
+    </w:p>
+    <w:p>
+      <w:pPr>
+        <w:pStyle w:val="Heading1"/>
+      </w:pPr>
+    </w:p>
+    <w:p>
+      <w:pPr>
+        <w:pStyle w:val="Heading1"/>
+      </w:pPr>
+    </w:p>
+    <w:p>
+      <w:pPr>
+        <w:pStyle w:val="Heading1"/>
+      </w:pPr>
+    </w:p>
+    <w:p>
+      <w:pPr>
+        <w:pStyle w:val="Heading1"/>
+      </w:pPr>
+    </w:p>
+    <w:p>
+      <w:pPr>
+        <w:pStyle w:val="Heading1"/>
+      </w:pPr>
+    </w:p>
+    <w:p>
+      <w:pPr>
+        <w:pStyle w:val="Heading1"/>
+      </w:pPr>
+    </w:p>
+    <w:p>
+      <w:pPr>
+        <w:pStyle w:val="Heading1"/>
+      </w:pPr>
+    </w:p>
+    <w:p>
+      <w:pPr>
+        <w:pStyle w:val="Heading1"/>
+      </w:pPr>
+    </w:p>
+    <w:p>
+      <w:pPr>
+        <w:pStyle w:val="Heading1"/>
+      </w:pPr>
+    </w:p>
+    <w:p>
+      <w:pPr>
+        <w:pStyle w:val="Heading1"/>
+      </w:pPr>
+    </w:p>
+    <w:p>
+      <w:pPr>
+        <w:pStyle w:val="Heading1"/>
+      </w:pPr>
+    </w:p>
+    <w:p/>
+    <w:p/>
+    <w:p/>
+    <w:p/>
+    <w:p/>
+    <w:p/>
+    <w:p/>
+    <w:p/>
+    <w:p/>
+    <w:p/>
+    <w:p>
+      <w:pPr>
+        <w:pStyle w:val="Heading1"/>
+      </w:pPr>
+      <w:r>
+        <w:lastRenderedPageBreak/>
         <w:t>TASK 6</w:t>
       </w:r>
     </w:p>
@@ -3871,7 +4448,7 @@
           <w:noProof/>
         </w:rPr>
         <w:drawing>
-          <wp:anchor distT="0" distB="0" distL="114300" distR="114300" simplePos="0" relativeHeight="251659264" behindDoc="0" locked="0" layoutInCell="1" allowOverlap="1" wp14:anchorId="67E0F5CF" wp14:editId="00A99B0C">
+          <wp:anchor distT="0" distB="0" distL="114300" distR="114300" simplePos="0" relativeHeight="251659264" behindDoc="0" locked="0" layoutInCell="1" allowOverlap="1" wp14:anchorId="67E0F5CF" wp14:editId="67928D88">
             <wp:simplePos x="0" y="0"/>
             <wp:positionH relativeFrom="column">
               <wp:posOffset>-68580</wp:posOffset>
@@ -3894,7 +4471,7 @@
                     <pic:cNvPicPr/>
                   </pic:nvPicPr>
                   <pic:blipFill>
-                    <a:blip r:embed="rId9" cstate="print">
+                    <a:blip r:embed="rId13" cstate="print">
                       <a:extLst>
                         <a:ext uri="{28A0092B-C50C-407E-A947-70E740481C1C}">
                           <a14:useLocalDpi xmlns:a14="http://schemas.microsoft.com/office/drawing/2010/main" val="0"/>
@@ -3946,7 +4523,6 @@
         <w:pStyle w:val="Heading1"/>
       </w:pPr>
       <w:r>
-        <w:lastRenderedPageBreak/>
         <w:t>TASK 7</w:t>
       </w:r>
     </w:p>
@@ -4128,118 +4704,6 @@
         <w:tabs>
           <w:tab w:val="left" w:pos="5640"/>
         </w:tabs>
-      </w:pPr>
-    </w:p>
-    <w:p>
-      <w:pPr>
-        <w:tabs>
-          <w:tab w:val="left" w:pos="5640"/>
-        </w:tabs>
-      </w:pPr>
-    </w:p>
-    <w:p>
-      <w:pPr>
-        <w:tabs>
-          <w:tab w:val="left" w:pos="5640"/>
-        </w:tabs>
-      </w:pPr>
-    </w:p>
-    <w:p>
-      <w:pPr>
-        <w:tabs>
-          <w:tab w:val="left" w:pos="5640"/>
-        </w:tabs>
-      </w:pPr>
-    </w:p>
-    <w:p>
-      <w:pPr>
-        <w:tabs>
-          <w:tab w:val="left" w:pos="5640"/>
-        </w:tabs>
-      </w:pPr>
-    </w:p>
-    <w:p>
-      <w:pPr>
-        <w:tabs>
-          <w:tab w:val="left" w:pos="5640"/>
-        </w:tabs>
-      </w:pPr>
-    </w:p>
-    <w:p>
-      <w:pPr>
-        <w:tabs>
-          <w:tab w:val="left" w:pos="5640"/>
-        </w:tabs>
-      </w:pPr>
-    </w:p>
-    <w:p>
-      <w:pPr>
-        <w:tabs>
-          <w:tab w:val="left" w:pos="5640"/>
-        </w:tabs>
-      </w:pPr>
-    </w:p>
-    <w:p>
-      <w:pPr>
-        <w:tabs>
-          <w:tab w:val="left" w:pos="5640"/>
-        </w:tabs>
-      </w:pPr>
-    </w:p>
-    <w:p>
-      <w:pPr>
-        <w:tabs>
-          <w:tab w:val="left" w:pos="5640"/>
-        </w:tabs>
-      </w:pPr>
-    </w:p>
-    <w:p>
-      <w:pPr>
-        <w:tabs>
-          <w:tab w:val="left" w:pos="5640"/>
-        </w:tabs>
-      </w:pPr>
-    </w:p>
-    <w:p>
-      <w:pPr>
-        <w:tabs>
-          <w:tab w:val="left" w:pos="5640"/>
-        </w:tabs>
-      </w:pPr>
-    </w:p>
-    <w:p>
-      <w:pPr>
-        <w:tabs>
-          <w:tab w:val="left" w:pos="5640"/>
-        </w:tabs>
-      </w:pPr>
-    </w:p>
-    <w:p>
-      <w:pPr>
-        <w:tabs>
-          <w:tab w:val="left" w:pos="5640"/>
-        </w:tabs>
-      </w:pPr>
-    </w:p>
-    <w:p>
-      <w:pPr>
-        <w:tabs>
-          <w:tab w:val="left" w:pos="5640"/>
-        </w:tabs>
-      </w:pPr>
-    </w:p>
-    <w:p>
-      <w:pPr>
-        <w:tabs>
-          <w:tab w:val="left" w:pos="5640"/>
-        </w:tabs>
-      </w:pPr>
-    </w:p>
-    <w:p>
-      <w:pPr>
-        <w:tabs>
-          <w:tab w:val="left" w:pos="5640"/>
-        </w:tabs>
         <w:rPr>
           <w:b/>
           <w:bCs/>
@@ -4258,14 +4722,7 @@
           <w:b/>
           <w:bCs/>
         </w:rPr>
-        <w:t xml:space="preserve"> contribution statement</w:t>
-      </w:r>
-      <w:r>
-        <w:rPr>
-          <w:b/>
-          <w:bCs/>
-        </w:rPr>
-        <w:t>:</w:t>
+        <w:t xml:space="preserve"> contribution statement:</w:t>
       </w:r>
     </w:p>
     <w:p>
@@ -4296,79 +4753,63 @@
           <w:szCs w:val="22"/>
           <w:u w:val="single"/>
         </w:rPr>
-        <w:t>Thab</w:t>
-      </w:r>
-      <w:r>
+        <w:t>Thabo’s Contribution</w:t>
+      </w:r>
+    </w:p>
+    <w:p>
+      <w:pPr>
+        <w:tabs>
+          <w:tab w:val="left" w:pos="5640"/>
+        </w:tabs>
+        <w:rPr>
+          <w:sz w:val="22"/>
+          <w:szCs w:val="22"/>
+        </w:rPr>
+      </w:pPr>
+      <w:r>
+        <w:rPr>
+          <w:sz w:val="22"/>
+          <w:szCs w:val="22"/>
+        </w:rPr>
+        <w:t xml:space="preserve">I completed the UML sequence diagrams (task 5), mapping out object interactions, lifelines and combined fragments for SD1 through SD4. I made sure the sequence diagrams were consistent with the classes and relationships defined in the main UML class diagram and reflected how the implemented code operates. </w:t>
+      </w:r>
+    </w:p>
+    <w:p>
+      <w:pPr>
+        <w:tabs>
+          <w:tab w:val="left" w:pos="5640"/>
+        </w:tabs>
+        <w:rPr>
+          <w:sz w:val="22"/>
+          <w:szCs w:val="22"/>
+        </w:rPr>
+      </w:pPr>
+      <w:r>
+        <w:rPr>
+          <w:sz w:val="22"/>
+          <w:szCs w:val="22"/>
+        </w:rPr>
+        <w:t>I also configured the main.cpp to run the signature event scenario showing runtime behaviour. This included showing how changes like pausing or resuming can work.</w:t>
+      </w:r>
+    </w:p>
+    <w:p>
+      <w:pPr>
+        <w:tabs>
+          <w:tab w:val="left" w:pos="5640"/>
+        </w:tabs>
         <w:rPr>
           <w:sz w:val="22"/>
           <w:szCs w:val="22"/>
           <w:u w:val="single"/>
         </w:rPr>
-        <w:t>o’s Contribution</w:t>
-      </w:r>
-    </w:p>
-    <w:p>
-      <w:pPr>
-        <w:tabs>
-          <w:tab w:val="left" w:pos="5640"/>
-        </w:tabs>
-        <w:rPr>
-          <w:sz w:val="22"/>
-          <w:szCs w:val="22"/>
-        </w:rPr>
-      </w:pPr>
-      <w:r>
-        <w:rPr>
-          <w:sz w:val="22"/>
-          <w:szCs w:val="22"/>
-        </w:rPr>
-        <w:t xml:space="preserve">I completed the UML sequence diagrams (task 5), mapping out object interactions, lifelines and combined fragments for SD1 through SD4. I made sure the sequence diagrams were consistent with the classes and relationships defined in the main UML class diagram and reflected how the implemented code operates. </w:t>
-      </w:r>
-    </w:p>
-    <w:p>
-      <w:pPr>
-        <w:tabs>
-          <w:tab w:val="left" w:pos="5640"/>
-        </w:tabs>
-        <w:rPr>
-          <w:sz w:val="22"/>
-          <w:szCs w:val="22"/>
-        </w:rPr>
-      </w:pPr>
-      <w:r>
-        <w:rPr>
-          <w:sz w:val="22"/>
-          <w:szCs w:val="22"/>
-        </w:rPr>
-        <w:t>I also configured the main.cpp to run the signature event scenario showing runtime behaviour. This included showing how changes like pausing or resuming can work.</w:t>
-      </w:r>
-    </w:p>
-    <w:p>
-      <w:pPr>
-        <w:tabs>
-          <w:tab w:val="left" w:pos="5640"/>
-        </w:tabs>
+      </w:pPr>
+      <w:r>
         <w:rPr>
           <w:sz w:val="22"/>
           <w:szCs w:val="22"/>
           <w:u w:val="single"/>
         </w:rPr>
-      </w:pPr>
-      <w:r>
-        <w:rPr>
-          <w:sz w:val="22"/>
-          <w:szCs w:val="22"/>
-          <w:u w:val="single"/>
-        </w:rPr>
-        <w:t>Lindo</w:t>
-      </w:r>
-      <w:r>
-        <w:rPr>
-          <w:sz w:val="22"/>
-          <w:szCs w:val="22"/>
-          <w:u w:val="single"/>
-        </w:rPr>
-        <w:t>’s Contribution</w:t>
+        <w:t>Lindo’s Contribution</w:t>
       </w:r>
     </w:p>
     <w:p>
@@ -4523,65 +4964,23 @@
           <w:sz w:val="22"/>
           <w:szCs w:val="22"/>
         </w:rPr>
-        <w:t xml:space="preserve">My main contribution to the project was the initial </w:t>
-      </w:r>
+        <w:t>My main contribution to the project was the initial project design and structure. I created the UML class diagram and designed how the Composite and Observer patterns would collaborate in the system. Once the design was complete, I created the initial skeletons of the .h and .</w:t>
+      </w:r>
+      <w:proofErr w:type="spellStart"/>
       <w:r>
         <w:rPr>
           <w:sz w:val="22"/>
           <w:szCs w:val="22"/>
         </w:rPr>
-        <w:t xml:space="preserve">project </w:t>
-      </w:r>
+        <w:t>cpp</w:t>
+      </w:r>
+      <w:proofErr w:type="spellEnd"/>
       <w:r>
         <w:rPr>
           <w:sz w:val="22"/>
           <w:szCs w:val="22"/>
         </w:rPr>
-        <w:t>design and structure. I created the UML class diagram and designed how the Composite and Observer patterns would</w:t>
-      </w:r>
-      <w:r>
-        <w:rPr>
-          <w:sz w:val="22"/>
-          <w:szCs w:val="22"/>
-        </w:rPr>
-        <w:t xml:space="preserve"> collaborate </w:t>
-      </w:r>
-      <w:r>
-        <w:rPr>
-          <w:sz w:val="22"/>
-          <w:szCs w:val="22"/>
-        </w:rPr>
-        <w:t>in the system. Once the design was complete, I created the initial skeletons of the .h and .</w:t>
-      </w:r>
-      <w:proofErr w:type="spellStart"/>
-      <w:r>
-        <w:rPr>
-          <w:sz w:val="22"/>
-          <w:szCs w:val="22"/>
-        </w:rPr>
-        <w:t>cpp</w:t>
-      </w:r>
-      <w:proofErr w:type="spellEnd"/>
-      <w:r>
-        <w:rPr>
-          <w:sz w:val="22"/>
-          <w:szCs w:val="22"/>
-        </w:rPr>
-        <w:t xml:space="preserve"> files so that the rest of the team had a </w:t>
-      </w:r>
-      <w:r>
-        <w:rPr>
-          <w:sz w:val="22"/>
-          <w:szCs w:val="22"/>
-        </w:rPr>
-        <w:t>base</w:t>
-      </w:r>
-      <w:r>
-        <w:rPr>
-          <w:sz w:val="22"/>
-          <w:szCs w:val="22"/>
-        </w:rPr>
-        <w:t xml:space="preserve"> structure to work from when implementing their assigned sections. I was mainly responsible for Tasks 1, 2 and 4, including developing the Composite structure, implementing the concrete event units and adding the event rules, condition-based behaviour, runtime reorganisation and original festival features. I also set up the GitHub repository rules, including protection of the main branch and requiring approval before pull requests could be merged.</w:t>
+        <w:t xml:space="preserve"> files so that the rest of the team had a base structure to work from when implementing their assigned sections. I was mainly responsible for Tasks 1, 2 and 4, including developing the Composite structure, implementing the concrete event units and adding the event rules, condition-based behaviour, runtime reorganisation and original festival features. I also set up the GitHub repository rules, including protection of the main branch and requiring approval before pull requests could be merged.</w:t>
       </w:r>
     </w:p>
     <w:p>
@@ -4619,28 +5018,7 @@
           <w:sz w:val="22"/>
           <w:szCs w:val="22"/>
         </w:rPr>
-        <w:t>Our</w:t>
-      </w:r>
-      <w:r>
-        <w:rPr>
-          <w:sz w:val="22"/>
-          <w:szCs w:val="22"/>
-        </w:rPr>
-        <w:t xml:space="preserve"> team divided the practical by discussing the available tasks and choosing sections that suited </w:t>
-      </w:r>
-      <w:r>
-        <w:rPr>
-          <w:sz w:val="22"/>
-          <w:szCs w:val="22"/>
-        </w:rPr>
-        <w:t>our</w:t>
-      </w:r>
-      <w:r>
-        <w:rPr>
-          <w:sz w:val="22"/>
-          <w:szCs w:val="22"/>
-        </w:rPr>
-        <w:t xml:space="preserve"> strengths and interests. Kristy mainly completed Tasks 1, 2 and 4, Thabo completed Task 5 and assisted with Task 3, while Lindo completed Tasks 3, 6 and 8.1. Although each member had their own main responsibilities, we helped each other when problems arose and reviewed each other's work before it was integrated into the final project.</w:t>
+        <w:t>Our team divided the practical by discussing the available tasks and choosing sections that suited our strengths and interests. Kristy mainly completed Tasks 1, 2 and 4, Thabo completed Task 5 and assisted with Task 3, while Lindo completed Tasks 3, 6 and 8.1. Although each member had their own main responsibilities, we helped each other when problems arose and reviewed each other's work before it was integrated into the final project.</w:t>
       </w:r>
     </w:p>
     <w:p>
@@ -4689,8 +5067,8 @@
     <w:p/>
     <w:p/>
     <w:sectPr>
-      <w:headerReference w:type="default" r:id="rId10"/>
-      <w:footerReference w:type="default" r:id="rId11"/>
+      <w:headerReference w:type="default" r:id="rId14"/>
+      <w:footerReference w:type="default" r:id="rId15"/>
       <w:pgSz w:w="11906" w:h="16838"/>
       <w:pgMar w:top="1440" w:right="1440" w:bottom="1440" w:left="1440" w:header="708" w:footer="708" w:gutter="0"/>
       <w:cols w:space="708"/>
@@ -4701,7 +5079,7 @@
 </file>
 
 <file path=word/endnotes.xml><?xml version="1.0" encoding="utf-8"?>
-<w:endnotes xmlns:wpc="http://schemas.microsoft.com/office/word/2010/wordprocessingCanvas" xmlns:cx="http://schemas.microsoft.com/office/drawing/2014/chartex" xmlns:cx1="http://schemas.microsoft.com/office/drawing/2015/9/8/chartex" xmlns:cx2="http://schemas.microsoft.com/office/drawing/2015/10/21/chartex" xmlns:cx3="http://schemas.microsoft.com/office/drawing/2016/5/9/chartex" xmlns:cx4="http://schemas.microsoft.com/office/drawing/2016/5/10/chartex" xmlns:cx5="http://schemas.microsoft.com/office/drawing/2016/5/11/chartex" xmlns:cx6="http://schemas.microsoft.com/office/drawing/2016/5/12/chartex" xmlns:cx7="http://schemas.microsoft.com/office/drawing/2016/5/13/chartex" xmlns:cx8="http://schemas.microsoft.com/office/drawing/2016/5/14/chartex" xmlns:mc="http://schemas.openxmlformats.org/markup-compatibility/2006" xmlns:aink="http://schemas.microsoft.com/office/drawing/2016/ink" xmlns:am3d="http://schemas.microsoft.com/office/drawing/2017/model3d" xmlns:o="urn:schemas-microsoft-com:office:office" xmlns:oel="http://schemas.microsoft.com/office/2019/extlst" xmlns:r="http://schemas.openxmlformats.org/officeDocument/2006/relationships" xmlns:m="http://schemas.openxmlformats.org/officeDocument/2006/math" xmlns:v="urn:schemas-microsoft-com:vml" xmlns:wp14="http://schemas.microsoft.com/office/word/2010/wordprocessingDrawing" xmlns:wp="http://schemas.openxmlformats.org/drawingml/2006/wordprocessingDrawing" xmlns:w10="urn:schemas-microsoft-com:office:word" xmlns:w="http://schemas.openxmlformats.org/wordprocessingml/2006/main" xmlns:w14="http://schemas.microsoft.com/office/word/2010/wordml" xmlns:w15="http://schemas.microsoft.com/office/word/2012/wordml" xmlns:w16cex="http://schemas.microsoft.com/office/word/2018/wordml/cex" xmlns:w16cid="http://schemas.microsoft.com/office/word/2016/wordml/cid" xmlns:w16="http://schemas.microsoft.com/office/word/2018/wordml" xmlns:w16du="http://schemas.microsoft.com/office/word/2023/wordml/word16du" xmlns:w16sdtdh="http://schemas.microsoft.com/office/word/2020/wordml/sdtdatahash" xmlns:w16sdtfl="http://schemas.microsoft.com/office/word/2024/wordml/sdtformatlock" xmlns:w16se="http://schemas.microsoft.com/office/word/2015/wordml/symex" xmlns:wpg="http://schemas.microsoft.com/office/word/2010/wordprocessingGroup" xmlns:wpi="http://schemas.microsoft.com/office/word/2010/wordprocessingInk" xmlns:wne="http://schemas.microsoft.com/office/word/2006/wordml" xmlns:wps="http://schemas.microsoft.com/office/word/2010/wordprocessingShape" mc:Ignorable="w14 w15 w16se w16cid w16 w16cex w16sdtdh w16sdtfl w16du wp14">
+<w:endnotes xmlns:wpc="http://schemas.microsoft.com/office/word/2010/wordprocessingCanvas" xmlns:cx="http://schemas.microsoft.com/office/drawing/2014/chartex" xmlns:cx1="http://schemas.microsoft.com/office/drawing/2015/9/8/chartex" xmlns:cx2="http://schemas.microsoft.com/office/drawing/2015/10/21/chartex" xmlns:cx3="http://schemas.microsoft.com/office/drawing/2016/5/9/chartex" xmlns:cx4="http://schemas.microsoft.com/office/drawing/2016/5/10/chartex" xmlns:cx5="http://schemas.microsoft.com/office/drawing/2016/5/11/chartex" xmlns:cx6="http://schemas.microsoft.com/office/drawing/2016/5/12/chartex" xmlns:cx7="http://schemas.microsoft.com/office/drawing/2016/5/13/chartex" xmlns:cx8="http://schemas.microsoft.com/office/drawing/2016/5/14/chartex" xmlns:mc="http://schemas.openxmlformats.org/markup-compatibility/2006" xmlns:aink="http://schemas.microsoft.com/office/drawing/2016/ink" xmlns:am3d="http://schemas.microsoft.com/office/drawing/2017/model3d" xmlns:o="urn:schemas-microsoft-com:office:office" xmlns:oel="http://schemas.microsoft.com/office/2019/extlst" xmlns:r="http://schemas.openxmlformats.org/officeDocument/2006/relationships" xmlns:m="http://schemas.openxmlformats.org/officeDocument/2006/math" xmlns:v="urn:schemas-microsoft-com:vml" xmlns:wp14="http://schemas.microsoft.com/office/word/2010/wordprocessingDrawing" xmlns:wp="http://schemas.openxmlformats.org/drawingml/2006/wordprocessingDrawing" xmlns:w10="urn:schemas-microsoft-com:office:word" xmlns:w="http://schemas.openxmlformats.org/wordprocessingml/2006/main" xmlns:w14="http://schemas.microsoft.com/office/word/2010/wordml" xmlns:w15="http://schemas.microsoft.com/office/word/2012/wordml" xmlns:w16cei="http://schemas.microsoft.com/office/word/2026/wordml/cei" xmlns:w16cex="http://schemas.microsoft.com/office/word/2018/wordml/cex" xmlns:w16cid="http://schemas.microsoft.com/office/word/2016/wordml/cid" xmlns:w16="http://schemas.microsoft.com/office/word/2018/wordml" xmlns:w16du="http://schemas.microsoft.com/office/word/2023/wordml/word16du" xmlns:w16sdtdh="http://schemas.microsoft.com/office/word/2020/wordml/sdtdatahash" xmlns:w16sdtfl="http://schemas.microsoft.com/office/word/2024/wordml/sdtformatlock" xmlns:w16se="http://schemas.microsoft.com/office/word/2015/wordml/symex" xmlns:wpg="http://schemas.microsoft.com/office/word/2010/wordprocessingGroup" xmlns:wpi="http://schemas.microsoft.com/office/word/2010/wordprocessingInk" xmlns:wne="http://schemas.microsoft.com/office/word/2006/wordml" xmlns:wps="http://schemas.microsoft.com/office/word/2010/wordprocessingShape" mc:Ignorable="w14 w15 w16se w16cid w16 w16cex w16sdtdh w16sdtfl w16du wp14">
   <w:endnote w:type="separator" w:id="-1">
     <w:p>
       <w:pPr>
@@ -4726,7 +5104,7 @@
 </file>
 
 <file path=word/footer1.xml><?xml version="1.0" encoding="utf-8"?>
-<w:ftr xmlns:wpc="http://schemas.microsoft.com/office/word/2010/wordprocessingCanvas" xmlns:cx="http://schemas.microsoft.com/office/drawing/2014/chartex" xmlns:cx1="http://schemas.microsoft.com/office/drawing/2015/9/8/chartex" xmlns:cx2="http://schemas.microsoft.com/office/drawing/2015/10/21/chartex" xmlns:cx3="http://schemas.microsoft.com/office/drawing/2016/5/9/chartex" xmlns:cx4="http://schemas.microsoft.com/office/drawing/2016/5/10/chartex" xmlns:cx5="http://schemas.microsoft.com/office/drawing/2016/5/11/chartex" xmlns:cx6="http://schemas.microsoft.com/office/drawing/2016/5/12/chartex" xmlns:cx7="http://schemas.microsoft.com/office/drawing/2016/5/13/chartex" xmlns:cx8="http://schemas.microsoft.com/office/drawing/2016/5/14/chartex" xmlns:mc="http://schemas.openxmlformats.org/markup-compatibility/2006" xmlns:aink="http://schemas.microsoft.com/office/drawing/2016/ink" xmlns:am3d="http://schemas.microsoft.com/office/drawing/2017/model3d" xmlns:o="urn:schemas-microsoft-com:office:office" xmlns:oel="http://schemas.microsoft.com/office/2019/extlst" xmlns:r="http://schemas.openxmlformats.org/officeDocument/2006/relationships" xmlns:m="http://schemas.openxmlformats.org/officeDocument/2006/math" xmlns:v="urn:schemas-microsoft-com:vml" xmlns:wp14="http://schemas.microsoft.com/office/word/2010/wordprocessingDrawing" xmlns:wp="http://schemas.openxmlformats.org/drawingml/2006/wordprocessingDrawing" xmlns:w10="urn:schemas-microsoft-com:office:word" xmlns:w="http://schemas.openxmlformats.org/wordprocessingml/2006/main" xmlns:w14="http://schemas.microsoft.com/office/word/2010/wordml" xmlns:w15="http://schemas.microsoft.com/office/word/2012/wordml" xmlns:w16cex="http://schemas.microsoft.com/office/word/2018/wordml/cex" xmlns:w16cid="http://schemas.microsoft.com/office/word/2016/wordml/cid" xmlns:w16="http://schemas.microsoft.com/office/word/2018/wordml" xmlns:w16du="http://schemas.microsoft.com/office/word/2023/wordml/word16du" xmlns:w16sdtdh="http://schemas.microsoft.com/office/word/2020/wordml/sdtdatahash" xmlns:w16sdtfl="http://schemas.microsoft.com/office/word/2024/wordml/sdtformatlock" xmlns:w16se="http://schemas.microsoft.com/office/word/2015/wordml/symex" xmlns:wpg="http://schemas.microsoft.com/office/word/2010/wordprocessingGroup" xmlns:wpi="http://schemas.microsoft.com/office/word/2010/wordprocessingInk" xmlns:wne="http://schemas.microsoft.com/office/word/2006/wordml" xmlns:wps="http://schemas.microsoft.com/office/word/2010/wordprocessingShape" mc:Ignorable="w14 w15 w16se w16cid w16 w16cex w16sdtdh w16sdtfl w16du wp14">
+<w:ftr xmlns:wpc="http://schemas.microsoft.com/office/word/2010/wordprocessingCanvas" xmlns:cx="http://schemas.microsoft.com/office/drawing/2014/chartex" xmlns:cx1="http://schemas.microsoft.com/office/drawing/2015/9/8/chartex" xmlns:cx2="http://schemas.microsoft.com/office/drawing/2015/10/21/chartex" xmlns:cx3="http://schemas.microsoft.com/office/drawing/2016/5/9/chartex" xmlns:cx4="http://schemas.microsoft.com/office/drawing/2016/5/10/chartex" xmlns:cx5="http://schemas.microsoft.com/office/drawing/2016/5/11/chartex" xmlns:cx6="http://schemas.microsoft.com/office/drawing/2016/5/12/chartex" xmlns:cx7="http://schemas.microsoft.com/office/drawing/2016/5/13/chartex" xmlns:cx8="http://schemas.microsoft.com/office/drawing/2016/5/14/chartex" xmlns:mc="http://schemas.openxmlformats.org/markup-compatibility/2006" xmlns:aink="http://schemas.microsoft.com/office/drawing/2016/ink" xmlns:am3d="http://schemas.microsoft.com/office/drawing/2017/model3d" xmlns:o="urn:schemas-microsoft-com:office:office" xmlns:oel="http://schemas.microsoft.com/office/2019/extlst" xmlns:r="http://schemas.openxmlformats.org/officeDocument/2006/relationships" xmlns:m="http://schemas.openxmlformats.org/officeDocument/2006/math" xmlns:v="urn:schemas-microsoft-com:vml" xmlns:wp14="http://schemas.microsoft.com/office/word/2010/wordprocessingDrawing" xmlns:wp="http://schemas.openxmlformats.org/drawingml/2006/wordprocessingDrawing" xmlns:w10="urn:schemas-microsoft-com:office:word" xmlns:w="http://schemas.openxmlformats.org/wordprocessingml/2006/main" xmlns:w14="http://schemas.microsoft.com/office/word/2010/wordml" xmlns:w15="http://schemas.microsoft.com/office/word/2012/wordml" xmlns:w16cei="http://schemas.microsoft.com/office/word/2026/wordml/cei" xmlns:w16cex="http://schemas.microsoft.com/office/word/2018/wordml/cex" xmlns:w16cid="http://schemas.microsoft.com/office/word/2016/wordml/cid" xmlns:w16="http://schemas.microsoft.com/office/word/2018/wordml" xmlns:w16du="http://schemas.microsoft.com/office/word/2023/wordml/word16du" xmlns:w16sdtdh="http://schemas.microsoft.com/office/word/2020/wordml/sdtdatahash" xmlns:w16sdtfl="http://schemas.microsoft.com/office/word/2024/wordml/sdtformatlock" xmlns:w16se="http://schemas.microsoft.com/office/word/2015/wordml/symex" xmlns:wpg="http://schemas.microsoft.com/office/word/2010/wordprocessingGroup" xmlns:wpi="http://schemas.microsoft.com/office/word/2010/wordprocessingInk" xmlns:wne="http://schemas.microsoft.com/office/word/2006/wordml" xmlns:wps="http://schemas.microsoft.com/office/word/2010/wordprocessingShape" mc:Ignorable="w14 w15 w16se w16cid w16 w16cex w16sdtdh w16sdtfl w16du wp14">
   <w:p>
     <w:pPr>
       <w:pStyle w:val="Footer"/>
@@ -4920,16 +5298,8 @@
                                   <w:rPr>
                                     <w:color w:val="808080" w:themeColor="background1" w:themeShade="80"/>
                                   </w:rPr>
-                                  <w:t xml:space="preserve"> &amp; Thabo </w:t>
+                                  <w:t xml:space="preserve"> &amp; Thabo Ngwabi</w:t>
                                 </w:r>
-                                <w:proofErr w:type="spellStart"/>
-                                <w:r>
-                                  <w:rPr>
-                                    <w:color w:val="808080" w:themeColor="background1" w:themeShade="80"/>
-                                  </w:rPr>
-                                  <w:t>Ngwabi</w:t>
-                                </w:r>
-                                <w:proofErr w:type="spellEnd"/>
                               </w:sdtContent>
                             </w:sdt>
                           </w:p>
@@ -5042,16 +5412,8 @@
                             <w:rPr>
                               <w:color w:val="808080" w:themeColor="background1" w:themeShade="80"/>
                             </w:rPr>
-                            <w:t xml:space="preserve"> &amp; Thabo </w:t>
+                            <w:t xml:space="preserve"> &amp; Thabo Ngwabi</w:t>
                           </w:r>
-                          <w:proofErr w:type="spellStart"/>
-                          <w:r>
-                            <w:rPr>
-                              <w:color w:val="808080" w:themeColor="background1" w:themeShade="80"/>
-                            </w:rPr>
-                            <w:t>Ngwabi</w:t>
-                          </w:r>
-                          <w:proofErr w:type="spellEnd"/>
                         </w:sdtContent>
                       </w:sdt>
                     </w:p>
@@ -5069,7 +5431,7 @@
 </file>
 
 <file path=word/footnotes.xml><?xml version="1.0" encoding="utf-8"?>
-<w:footnotes xmlns:wpc="http://schemas.microsoft.com/office/word/2010/wordprocessingCanvas" xmlns:cx="http://schemas.microsoft.com/office/drawing/2014/chartex" xmlns:cx1="http://schemas.microsoft.com/office/drawing/2015/9/8/chartex" xmlns:cx2="http://schemas.microsoft.com/office/drawing/2015/10/21/chartex" xmlns:cx3="http://schemas.microsoft.com/office/drawing/2016/5/9/chartex" xmlns:cx4="http://schemas.microsoft.com/office/drawing/2016/5/10/chartex" xmlns:cx5="http://schemas.microsoft.com/office/drawing/2016/5/11/chartex" xmlns:cx6="http://schemas.microsoft.com/office/drawing/2016/5/12/chartex" xmlns:cx7="http://schemas.microsoft.com/office/drawing/2016/5/13/chartex" xmlns:cx8="http://schemas.microsoft.com/office/drawing/2016/5/14/chartex" xmlns:mc="http://schemas.openxmlformats.org/markup-compatibility/2006" xmlns:aink="http://schemas.microsoft.com/office/drawing/2016/ink" xmlns:am3d="http://schemas.microsoft.com/office/drawing/2017/model3d" xmlns:o="urn:schemas-microsoft-com:office:office" xmlns:oel="http://schemas.microsoft.com/office/2019/extlst" xmlns:r="http://schemas.openxmlformats.org/officeDocument/2006/relationships" xmlns:m="http://schemas.openxmlformats.org/officeDocument/2006/math" xmlns:v="urn:schemas-microsoft-com:vml" xmlns:wp14="http://schemas.microsoft.com/office/word/2010/wordprocessingDrawing" xmlns:wp="http://schemas.openxmlformats.org/drawingml/2006/wordprocessingDrawing" xmlns:w10="urn:schemas-microsoft-com:office:word" xmlns:w="http://schemas.openxmlformats.org/wordprocessingml/2006/main" xmlns:w14="http://schemas.microsoft.com/office/word/2010/wordml" xmlns:w15="http://schemas.microsoft.com/office/word/2012/wordml" xmlns:w16cex="http://schemas.microsoft.com/office/word/2018/wordml/cex" xmlns:w16cid="http://schemas.microsoft.com/office/word/2016/wordml/cid" xmlns:w16="http://schemas.microsoft.com/office/word/2018/wordml" xmlns:w16du="http://schemas.microsoft.com/office/word/2023/wordml/word16du" xmlns:w16sdtdh="http://schemas.microsoft.com/office/word/2020/wordml/sdtdatahash" xmlns:w16sdtfl="http://schemas.microsoft.com/office/word/2024/wordml/sdtformatlock" xmlns:w16se="http://schemas.microsoft.com/office/word/2015/wordml/symex" xmlns:wpg="http://schemas.microsoft.com/office/word/2010/wordprocessingGroup" xmlns:wpi="http://schemas.microsoft.com/office/word/2010/wordprocessingInk" xmlns:wne="http://schemas.microsoft.com/office/word/2006/wordml" xmlns:wps="http://schemas.microsoft.com/office/word/2010/wordprocessingShape" mc:Ignorable="w14 w15 w16se w16cid w16 w16cex w16sdtdh w16sdtfl w16du wp14">
+<w:footnotes xmlns:wpc="http://schemas.microsoft.com/office/word/2010/wordprocessingCanvas" xmlns:cx="http://schemas.microsoft.com/office/drawing/2014/chartex" xmlns:cx1="http://schemas.microsoft.com/office/drawing/2015/9/8/chartex" xmlns:cx2="http://schemas.microsoft.com/office/drawing/2015/10/21/chartex" xmlns:cx3="http://schemas.microsoft.com/office/drawing/2016/5/9/chartex" xmlns:cx4="http://schemas.microsoft.com/office/drawing/2016/5/10/chartex" xmlns:cx5="http://schemas.microsoft.com/office/drawing/2016/5/11/chartex" xmlns:cx6="http://schemas.microsoft.com/office/drawing/2016/5/12/chartex" xmlns:cx7="http://schemas.microsoft.com/office/drawing/2016/5/13/chartex" xmlns:cx8="http://schemas.microsoft.com/office/drawing/2016/5/14/chartex" xmlns:mc="http://schemas.openxmlformats.org/markup-compatibility/2006" xmlns:aink="http://schemas.microsoft.com/office/drawing/2016/ink" xmlns:am3d="http://schemas.microsoft.com/office/drawing/2017/model3d" xmlns:o="urn:schemas-microsoft-com:office:office" xmlns:oel="http://schemas.microsoft.com/office/2019/extlst" xmlns:r="http://schemas.openxmlformats.org/officeDocument/2006/relationships" xmlns:m="http://schemas.openxmlformats.org/officeDocument/2006/math" xmlns:v="urn:schemas-microsoft-com:vml" xmlns:wp14="http://schemas.microsoft.com/office/word/2010/wordprocessingDrawing" xmlns:wp="http://schemas.openxmlformats.org/drawingml/2006/wordprocessingDrawing" xmlns:w10="urn:schemas-microsoft-com:office:word" xmlns:w="http://schemas.openxmlformats.org/wordprocessingml/2006/main" xmlns:w14="http://schemas.microsoft.com/office/word/2010/wordml" xmlns:w15="http://schemas.microsoft.com/office/word/2012/wordml" xmlns:w16cei="http://schemas.microsoft.com/office/word/2026/wordml/cei" xmlns:w16cex="http://schemas.microsoft.com/office/word/2018/wordml/cex" xmlns:w16cid="http://schemas.microsoft.com/office/word/2016/wordml/cid" xmlns:w16="http://schemas.microsoft.com/office/word/2018/wordml" xmlns:w16du="http://schemas.microsoft.com/office/word/2023/wordml/word16du" xmlns:w16sdtdh="http://schemas.microsoft.com/office/word/2020/wordml/sdtdatahash" xmlns:w16sdtfl="http://schemas.microsoft.com/office/word/2024/wordml/sdtformatlock" xmlns:w16se="http://schemas.microsoft.com/office/word/2015/wordml/symex" xmlns:wpg="http://schemas.microsoft.com/office/word/2010/wordprocessingGroup" xmlns:wpi="http://schemas.microsoft.com/office/word/2010/wordprocessingInk" xmlns:wne="http://schemas.microsoft.com/office/word/2006/wordml" xmlns:wps="http://schemas.microsoft.com/office/word/2010/wordprocessingShape" mc:Ignorable="w14 w15 w16se w16cid w16 w16cex w16sdtdh w16sdtfl w16du wp14">
   <w:footnote w:type="separator" w:id="-1">
     <w:p>
       <w:pPr>
@@ -5094,7 +5456,7 @@
 </file>
 
 <file path=word/header1.xml><?xml version="1.0" encoding="utf-8"?>
-<w:hdr xmlns:wpc="http://schemas.microsoft.com/office/word/2010/wordprocessingCanvas" xmlns:cx="http://schemas.microsoft.com/office/drawing/2014/chartex" xmlns:cx1="http://schemas.microsoft.com/office/drawing/2015/9/8/chartex" xmlns:cx2="http://schemas.microsoft.com/office/drawing/2015/10/21/chartex" xmlns:cx3="http://schemas.microsoft.com/office/drawing/2016/5/9/chartex" xmlns:cx4="http://schemas.microsoft.com/office/drawing/2016/5/10/chartex" xmlns:cx5="http://schemas.microsoft.com/office/drawing/2016/5/11/chartex" xmlns:cx6="http://schemas.microsoft.com/office/drawing/2016/5/12/chartex" xmlns:cx7="http://schemas.microsoft.com/office/drawing/2016/5/13/chartex" xmlns:cx8="http://schemas.microsoft.com/office/drawing/2016/5/14/chartex" xmlns:mc="http://schemas.openxmlformats.org/markup-compatibility/2006" xmlns:aink="http://schemas.microsoft.com/office/drawing/2016/ink" xmlns:am3d="http://schemas.microsoft.com/office/drawing/2017/model3d" xmlns:o="urn:schemas-microsoft-com:office:office" xmlns:oel="http://schemas.microsoft.com/office/2019/extlst" xmlns:r="http://schemas.openxmlformats.org/officeDocument/2006/relationships" xmlns:m="http://schemas.openxmlformats.org/officeDocument/2006/math" xmlns:v="urn:schemas-microsoft-com:vml" xmlns:wp14="http://schemas.microsoft.com/office/word/2010/wordprocessingDrawing" xmlns:wp="http://schemas.openxmlformats.org/drawingml/2006/wordprocessingDrawing" xmlns:w10="urn:schemas-microsoft-com:office:word" xmlns:w="http://schemas.openxmlformats.org/wordprocessingml/2006/main" xmlns:w14="http://schemas.microsoft.com/office/word/2010/wordml" xmlns:w15="http://schemas.microsoft.com/office/word/2012/wordml" xmlns:w16cex="http://schemas.microsoft.com/office/word/2018/wordml/cex" xmlns:w16cid="http://schemas.microsoft.com/office/word/2016/wordml/cid" xmlns:w16="http://schemas.microsoft.com/office/word/2018/wordml" xmlns:w16du="http://schemas.microsoft.com/office/word/2023/wordml/word16du" xmlns:w16sdtdh="http://schemas.microsoft.com/office/word/2020/wordml/sdtdatahash" xmlns:w16sdtfl="http://schemas.microsoft.com/office/word/2024/wordml/sdtformatlock" xmlns:w16se="http://schemas.microsoft.com/office/word/2015/wordml/symex" xmlns:wpg="http://schemas.microsoft.com/office/word/2010/wordprocessingGroup" xmlns:wpi="http://schemas.microsoft.com/office/word/2010/wordprocessingInk" xmlns:wne="http://schemas.microsoft.com/office/word/2006/wordml" xmlns:wps="http://schemas.microsoft.com/office/word/2010/wordprocessingShape" mc:Ignorable="w14 w15 w16se w16cid w16 w16cex w16sdtdh w16sdtfl w16du wp14">
+<w:hdr xmlns:wpc="http://schemas.microsoft.com/office/word/2010/wordprocessingCanvas" xmlns:cx="http://schemas.microsoft.com/office/drawing/2014/chartex" xmlns:cx1="http://schemas.microsoft.com/office/drawing/2015/9/8/chartex" xmlns:cx2="http://schemas.microsoft.com/office/drawing/2015/10/21/chartex" xmlns:cx3="http://schemas.microsoft.com/office/drawing/2016/5/9/chartex" xmlns:cx4="http://schemas.microsoft.com/office/drawing/2016/5/10/chartex" xmlns:cx5="http://schemas.microsoft.com/office/drawing/2016/5/11/chartex" xmlns:cx6="http://schemas.microsoft.com/office/drawing/2016/5/12/chartex" xmlns:cx7="http://schemas.microsoft.com/office/drawing/2016/5/13/chartex" xmlns:cx8="http://schemas.microsoft.com/office/drawing/2016/5/14/chartex" xmlns:mc="http://schemas.openxmlformats.org/markup-compatibility/2006" xmlns:aink="http://schemas.microsoft.com/office/drawing/2016/ink" xmlns:am3d="http://schemas.microsoft.com/office/drawing/2017/model3d" xmlns:o="urn:schemas-microsoft-com:office:office" xmlns:oel="http://schemas.microsoft.com/office/2019/extlst" xmlns:r="http://schemas.openxmlformats.org/officeDocument/2006/relationships" xmlns:m="http://schemas.openxmlformats.org/officeDocument/2006/math" xmlns:v="urn:schemas-microsoft-com:vml" xmlns:wp14="http://schemas.microsoft.com/office/word/2010/wordprocessingDrawing" xmlns:wp="http://schemas.openxmlformats.org/drawingml/2006/wordprocessingDrawing" xmlns:w10="urn:schemas-microsoft-com:office:word" xmlns:w="http://schemas.openxmlformats.org/wordprocessingml/2006/main" xmlns:w14="http://schemas.microsoft.com/office/word/2010/wordml" xmlns:w15="http://schemas.microsoft.com/office/word/2012/wordml" xmlns:w16cei="http://schemas.microsoft.com/office/word/2026/wordml/cei" xmlns:w16cex="http://schemas.microsoft.com/office/word/2018/wordml/cex" xmlns:w16cid="http://schemas.microsoft.com/office/word/2016/wordml/cid" xmlns:w16="http://schemas.microsoft.com/office/word/2018/wordml" xmlns:w16du="http://schemas.microsoft.com/office/word/2023/wordml/word16du" xmlns:w16sdtdh="http://schemas.microsoft.com/office/word/2020/wordml/sdtdatahash" xmlns:w16sdtfl="http://schemas.microsoft.com/office/word/2024/wordml/sdtformatlock" xmlns:w16se="http://schemas.microsoft.com/office/word/2015/wordml/symex" xmlns:wpg="http://schemas.microsoft.com/office/word/2010/wordprocessingGroup" xmlns:wpi="http://schemas.microsoft.com/office/word/2010/wordprocessingInk" xmlns:wne="http://schemas.microsoft.com/office/word/2006/wordml" xmlns:wps="http://schemas.microsoft.com/office/word/2010/wordprocessingShape" mc:Ignorable="w14 w15 w16se w16cid w16 w16cex w16sdtdh w16sdtfl w16du wp14">
   <w:p>
     <w:pPr>
       <w:pStyle w:val="Header"/>
@@ -5258,7 +5620,7 @@
 </file>
 
 <file path=word/numbering.xml><?xml version="1.0" encoding="utf-8"?>
-<w:numbering xmlns:wpc="http://schemas.microsoft.com/office/word/2010/wordprocessingCanvas" xmlns:cx="http://schemas.microsoft.com/office/drawing/2014/chartex" xmlns:cx1="http://schemas.microsoft.com/office/drawing/2015/9/8/chartex" xmlns:cx2="http://schemas.microsoft.com/office/drawing/2015/10/21/chartex" xmlns:cx3="http://schemas.microsoft.com/office/drawing/2016/5/9/chartex" xmlns:cx4="http://schemas.microsoft.com/office/drawing/2016/5/10/chartex" xmlns:cx5="http://schemas.microsoft.com/office/drawing/2016/5/11/chartex" xmlns:cx6="http://schemas.microsoft.com/office/drawing/2016/5/12/chartex" xmlns:cx7="http://schemas.microsoft.com/office/drawing/2016/5/13/chartex" xmlns:cx8="http://schemas.microsoft.com/office/drawing/2016/5/14/chartex" xmlns:mc="http://schemas.openxmlformats.org/markup-compatibility/2006" xmlns:aink="http://schemas.microsoft.com/office/drawing/2016/ink" xmlns:am3d="http://schemas.microsoft.com/office/drawing/2017/model3d" xmlns:o="urn:schemas-microsoft-com:office:office" xmlns:oel="http://schemas.microsoft.com/office/2019/extlst" xmlns:r="http://schemas.openxmlformats.org/officeDocument/2006/relationships" xmlns:m="http://schemas.openxmlformats.org/officeDocument/2006/math" xmlns:v="urn:schemas-microsoft-com:vml" xmlns:wp14="http://schemas.microsoft.com/office/word/2010/wordprocessingDrawing" xmlns:wp="http://schemas.openxmlformats.org/drawingml/2006/wordprocessingDrawing" xmlns:w10="urn:schemas-microsoft-com:office:word" xmlns:w="http://schemas.openxmlformats.org/wordprocessingml/2006/main" xmlns:w14="http://schemas.microsoft.com/office/word/2010/wordml" xmlns:w15="http://schemas.microsoft.com/office/word/2012/wordml" xmlns:w16cex="http://schemas.microsoft.com/office/word/2018/wordml/cex" xmlns:w16cid="http://schemas.microsoft.com/office/word/2016/wordml/cid" xmlns:w16="http://schemas.microsoft.com/office/word/2018/wordml" xmlns:w16du="http://schemas.microsoft.com/office/word/2023/wordml/word16du" xmlns:w16sdtdh="http://schemas.microsoft.com/office/word/2020/wordml/sdtdatahash" xmlns:w16sdtfl="http://schemas.microsoft.com/office/word/2024/wordml/sdtformatlock" xmlns:w16se="http://schemas.microsoft.com/office/word/2015/wordml/symex" xmlns:wpg="http://schemas.microsoft.com/office/word/2010/wordprocessingGroup" xmlns:wpi="http://schemas.microsoft.com/office/word/2010/wordprocessingInk" xmlns:wne="http://schemas.microsoft.com/office/word/2006/wordml" xmlns:wps="http://schemas.microsoft.com/office/word/2010/wordprocessingShape" mc:Ignorable="w14 w15 w16se w16cid w16 w16cex w16sdtdh w16sdtfl w16du wp14">
+<w:numbering xmlns:wpc="http://schemas.microsoft.com/office/word/2010/wordprocessingCanvas" xmlns:cx="http://schemas.microsoft.com/office/drawing/2014/chartex" xmlns:cx1="http://schemas.microsoft.com/office/drawing/2015/9/8/chartex" xmlns:cx2="http://schemas.microsoft.com/office/drawing/2015/10/21/chartex" xmlns:cx3="http://schemas.microsoft.com/office/drawing/2016/5/9/chartex" xmlns:cx4="http://schemas.microsoft.com/office/drawing/2016/5/10/chartex" xmlns:cx5="http://schemas.microsoft.com/office/drawing/2016/5/11/chartex" xmlns:cx6="http://schemas.microsoft.com/office/drawing/2016/5/12/chartex" xmlns:cx7="http://schemas.microsoft.com/office/drawing/2016/5/13/chartex" xmlns:cx8="http://schemas.microsoft.com/office/drawing/2016/5/14/chartex" xmlns:mc="http://schemas.openxmlformats.org/markup-compatibility/2006" xmlns:aink="http://schemas.microsoft.com/office/drawing/2016/ink" xmlns:am3d="http://schemas.microsoft.com/office/drawing/2017/model3d" xmlns:o="urn:schemas-microsoft-com:office:office" xmlns:oel="http://schemas.microsoft.com/office/2019/extlst" xmlns:r="http://schemas.openxmlformats.org/officeDocument/2006/relationships" xmlns:m="http://schemas.openxmlformats.org/officeDocument/2006/math" xmlns:v="urn:schemas-microsoft-com:vml" xmlns:wp14="http://schemas.microsoft.com/office/word/2010/wordprocessingDrawing" xmlns:wp="http://schemas.openxmlformats.org/drawingml/2006/wordprocessingDrawing" xmlns:w10="urn:schemas-microsoft-com:office:word" xmlns:w="http://schemas.openxmlformats.org/wordprocessingml/2006/main" xmlns:w14="http://schemas.microsoft.com/office/word/2010/wordml" xmlns:w15="http://schemas.microsoft.com/office/word/2012/wordml" xmlns:w16cei="http://schemas.microsoft.com/office/word/2026/wordml/cei" xmlns:w16cex="http://schemas.microsoft.com/office/word/2018/wordml/cex" xmlns:w16cid="http://schemas.microsoft.com/office/word/2016/wordml/cid" xmlns:w16="http://schemas.microsoft.com/office/word/2018/wordml" xmlns:w16du="http://schemas.microsoft.com/office/word/2023/wordml/word16du" xmlns:w16sdtdh="http://schemas.microsoft.com/office/word/2020/wordml/sdtdatahash" xmlns:w16sdtfl="http://schemas.microsoft.com/office/word/2024/wordml/sdtformatlock" xmlns:w16se="http://schemas.microsoft.com/office/word/2015/wordml/symex" xmlns:wpg="http://schemas.microsoft.com/office/word/2010/wordprocessingGroup" xmlns:wpi="http://schemas.microsoft.com/office/word/2010/wordprocessingInk" xmlns:wne="http://schemas.microsoft.com/office/word/2006/wordml" xmlns:wps="http://schemas.microsoft.com/office/word/2010/wordprocessingShape" mc:Ignorable="w14 w15 w16se w16cid w16 w16cex w16sdtdh w16sdtfl w16du wp14">
   <w:abstractNum w:abstractNumId="0" w15:restartNumberingAfterBreak="0">
     <w:nsid w:val="036205D6"/>
     <w:multiLevelType w:val="multilevel"/>
@@ -8280,7 +8642,7 @@
   <w:style w:type="paragraph" w:default="1" w:styleId="Normal">
     <w:name w:val="Normal"/>
     <w:qFormat/>
-    <w:rsid w:val="004647DD"/>
+    <w:rsid w:val="006B292D"/>
   </w:style>
   <w:style w:type="paragraph" w:styleId="Heading1">
     <w:name w:val="heading 1"/>
@@ -8494,6 +8856,7 @@
   <w:style w:type="character" w:default="1" w:styleId="DefaultParagraphFont">
     <w:name w:val="Default Paragraph Font"/>
     <w:uiPriority w:val="1"/>
+    <w:semiHidden/>
     <w:unhideWhenUsed/>
   </w:style>
   <w:style w:type="table" w:default="1" w:styleId="TableNormal">

</xml_diff>